<commit_message>
Atualiza Estoque Contabil com filtros, mapa mental e Mapping compartilhado
</commit_message>
<xml_diff>
--- a/estoque-contabil/Especificacao_Tecnico_Documental_Estoque_Contabil.docx
+++ b/estoque-contabil/Especificacao_Tecnico_Documental_Estoque_Contabil.docx
@@ -167,7 +167,7 @@
           <w:b/>
           <w:sz w:val="22"/>
         </w:rPr>
-        <w:t xml:space="preserve">o documental 1.5 </w:t>
+        <w:t xml:space="preserve">o documental 1.10 </w:t>
       </w:r>
       <w:r>
         <w:rPr>
@@ -182,7 +182,7 @@
           <w:b/>
           <w:sz w:val="22"/>
         </w:rPr>
-        <w:t xml:space="preserve"> 07 de outubro de 2026</w:t>
+        <w:t xml:space="preserve"> 08 de outubro de 2026</w:t>
       </w:r>
     </w:p>
     <w:p>
@@ -1081,7 +1081,7 @@
           <w:rFonts w:hint="eastAsia"/>
           <w:sz w:val="21"/>
         </w:rPr>
-        <w:t>12</w:t>
+        <w:t>13</w:t>
       </w:r>
     </w:p>
     <w:p>
@@ -1112,7 +1112,7 @@
           <w:rFonts w:hint="eastAsia"/>
           <w:sz w:val="21"/>
         </w:rPr>
-        <w:t>12</w:t>
+        <w:t>14</w:t>
       </w:r>
     </w:p>
     <w:p>
@@ -1143,7 +1143,7 @@
           <w:rFonts w:hint="eastAsia"/>
           <w:sz w:val="21"/>
         </w:rPr>
-        <w:t>13</w:t>
+        <w:t>15</w:t>
       </w:r>
     </w:p>
     <w:p>
@@ -1174,7 +1174,7 @@
           <w:rFonts w:hint="eastAsia"/>
           <w:sz w:val="21"/>
         </w:rPr>
-        <w:t>13</w:t>
+        <w:t>15</w:t>
       </w:r>
     </w:p>
     <w:p>
@@ -1205,7 +1205,7 @@
           <w:rFonts w:hint="eastAsia"/>
           <w:sz w:val="21"/>
         </w:rPr>
-        <w:t>14</w:t>
+        <w:t>16</w:t>
       </w:r>
     </w:p>
     <w:p>
@@ -1236,7 +1236,7 @@
           <w:rFonts w:hint="eastAsia"/>
           <w:sz w:val="21"/>
         </w:rPr>
-        <w:t>14</w:t>
+        <w:t>16</w:t>
       </w:r>
     </w:p>
     <w:p>
@@ -1267,7 +1267,7 @@
           <w:rFonts w:hint="eastAsia"/>
           <w:sz w:val="21"/>
         </w:rPr>
-        <w:t>15</w:t>
+        <w:t>17</w:t>
       </w:r>
     </w:p>
     <w:p>
@@ -1298,7 +1298,7 @@
           <w:rFonts w:hint="eastAsia"/>
           <w:sz w:val="21"/>
         </w:rPr>
-        <w:t>20</w:t>
+        <w:t>23</w:t>
       </w:r>
     </w:p>
     <w:p>
@@ -1330,7 +1330,7 @@
           <w:rFonts w:hint="eastAsia"/>
           <w:sz w:val="21"/>
         </w:rPr>
-        <w:t>23</w:t>
+        <w:t>25</w:t>
       </w:r>
     </w:p>
     <w:p>
@@ -1361,7 +1361,7 @@
           <w:rFonts w:hint="eastAsia"/>
           <w:sz w:val="21"/>
         </w:rPr>
-        <w:t>23</w:t>
+        <w:t>25</w:t>
       </w:r>
     </w:p>
     <w:p>
@@ -1392,7 +1392,7 @@
           <w:rFonts w:hint="eastAsia"/>
           <w:sz w:val="21"/>
         </w:rPr>
-        <w:t>24</w:t>
+        <w:t>27</w:t>
       </w:r>
     </w:p>
     <w:p>
@@ -1423,7 +1423,7 @@
           <w:rFonts w:hint="eastAsia"/>
           <w:sz w:val="21"/>
         </w:rPr>
-        <w:t>30</w:t>
+        <w:t>32</w:t>
       </w:r>
     </w:p>
     <w:p>
@@ -1454,7 +1454,7 @@
           <w:rFonts w:hint="eastAsia"/>
           <w:sz w:val="21"/>
         </w:rPr>
-        <w:t>31</w:t>
+        <w:t>33</w:t>
       </w:r>
     </w:p>
     <w:p>
@@ -1485,7 +1485,7 @@
           <w:rFonts w:hint="eastAsia"/>
           <w:sz w:val="21"/>
         </w:rPr>
-        <w:t>33</w:t>
+        <w:t>35</w:t>
       </w:r>
     </w:p>
     <w:p>
@@ -1516,7 +1516,7 @@
           <w:rFonts w:hint="eastAsia"/>
           <w:sz w:val="21"/>
         </w:rPr>
-        <w:t>33</w:t>
+        <w:t>36</w:t>
       </w:r>
     </w:p>
     <w:p>
@@ -1547,7 +1547,7 @@
           <w:rFonts w:hint="eastAsia"/>
           <w:sz w:val="21"/>
         </w:rPr>
-        <w:t>34</w:t>
+        <w:t>36</w:t>
       </w:r>
     </w:p>
     <w:p>
@@ -1578,7 +1578,7 @@
           <w:rFonts w:hint="eastAsia"/>
           <w:sz w:val="21"/>
         </w:rPr>
-        <w:t>35</w:t>
+        <w:t>37</w:t>
       </w:r>
     </w:p>
     <w:p>
@@ -1609,7 +1609,7 @@
           <w:rFonts w:hint="eastAsia"/>
           <w:sz w:val="21"/>
         </w:rPr>
-        <w:t>35</w:t>
+        <w:t>38</w:t>
       </w:r>
     </w:p>
     <w:p>
@@ -1640,7 +1640,7 @@
           <w:rFonts w:hint="eastAsia"/>
           <w:sz w:val="21"/>
         </w:rPr>
-        <w:t>36</w:t>
+        <w:t>38</w:t>
       </w:r>
     </w:p>
     <w:p>
@@ -3645,7 +3645,7 @@
         <w:rPr>
           <w:sz w:val="22"/>
         </w:rPr>
-        <w:t>ncias, Mapping e auditoria permanecem locais; usu</w:t>
+        <w:t>ncias e auditoria permanecem locais; usu</w:t>
       </w:r>
       <w:r>
         <w:rPr>
@@ -3684,7 +3684,20 @@
         <w:rPr>
           <w:sz w:val="22"/>
         </w:rPr>
-        <w:t>o 18.8).</w:t>
+        <w:t>o 18.8) e as regras do Mapping seguem o Mapping compartilhado (se</w:t>
+      </w:r>
+      <w:r>
+        <w:rPr>
+          <w:rFonts w:hint="cs"/>
+          <w:sz w:val="22"/>
+        </w:rPr>
+        <w:t>çã</w:t>
+      </w:r>
+      <w:r>
+        <w:rPr>
+          <w:sz w:val="22"/>
+        </w:rPr>
+        <w:t>o 14.1).</w:t>
       </w:r>
     </w:p>
     <w:p>
@@ -8087,7 +8100,111 @@
         <w:rPr>
           <w:sz w:val="22"/>
         </w:rPr>
-        <w:t>Aging for Season: matriz ano × season e variação entre anos consecutivos.</w:t>
+        <w:t>Aging for Season: matriz de valor fiscal (Vlr Tot Fisc, o mesmo do card Valor fiscal) por ano da cole</w:t>
+      </w:r>
+      <w:r>
+        <w:rPr>
+          <w:rFonts w:hint="cs"/>
+          <w:sz w:val="22"/>
+        </w:rPr>
+        <w:t>çã</w:t>
+      </w:r>
+      <w:r>
+        <w:rPr>
+          <w:sz w:val="22"/>
+        </w:rPr>
+        <w:t xml:space="preserve">o </w:t>
+      </w:r>
+      <w:r>
+        <w:rPr>
+          <w:rFonts w:hint="eastAsia"/>
+          <w:sz w:val="22"/>
+        </w:rPr>
+        <w:t>×</w:t>
+      </w:r>
+      <w:r>
+        <w:rPr>
+          <w:sz w:val="22"/>
+        </w:rPr>
+        <w:t xml:space="preserve"> season, com coluna Total (por ano), linha Total (por season) e total geral igual ao card Valor fiscal. A varia</w:t>
+      </w:r>
+      <w:r>
+        <w:rPr>
+          <w:rFonts w:hint="cs"/>
+          <w:sz w:val="22"/>
+        </w:rPr>
+        <w:t>çã</w:t>
+      </w:r>
+      <w:r>
+        <w:rPr>
+          <w:sz w:val="22"/>
+        </w:rPr>
+        <w:t>o em rela</w:t>
+      </w:r>
+      <w:r>
+        <w:rPr>
+          <w:rFonts w:hint="cs"/>
+          <w:sz w:val="22"/>
+        </w:rPr>
+        <w:t>çã</w:t>
+      </w:r>
+      <w:r>
+        <w:rPr>
+          <w:sz w:val="22"/>
+        </w:rPr>
+        <w:t>o ao ano anterior aparece no bal</w:t>
+      </w:r>
+      <w:r>
+        <w:rPr>
+          <w:rFonts w:hint="cs"/>
+          <w:sz w:val="22"/>
+        </w:rPr>
+        <w:t>ã</w:t>
+      </w:r>
+      <w:r>
+        <w:rPr>
+          <w:sz w:val="22"/>
+        </w:rPr>
+        <w:t>o de cada valor (as linhas "AAAA vs AAAA" foram retiradas para n</w:t>
+      </w:r>
+      <w:r>
+        <w:rPr>
+          <w:rFonts w:hint="cs"/>
+          <w:sz w:val="22"/>
+        </w:rPr>
+        <w:t>ã</w:t>
+      </w:r>
+      <w:r>
+        <w:rPr>
+          <w:sz w:val="22"/>
+        </w:rPr>
+        <w:t>o poluir o gr</w:t>
+      </w:r>
+      <w:r>
+        <w:rPr>
+          <w:rFonts w:hint="cs"/>
+          <w:sz w:val="22"/>
+        </w:rPr>
+        <w:t>á</w:t>
+      </w:r>
+      <w:r>
+        <w:rPr>
+          <w:sz w:val="22"/>
+        </w:rPr>
+        <w:t>fico); no HTML e no PDF a tabela sai s</w:t>
+      </w:r>
+      <w:r>
+        <w:rPr>
+          <w:rFonts w:hint="cs"/>
+          <w:sz w:val="22"/>
+        </w:rPr>
+        <w:t>ó</w:t>
+      </w:r>
+      <w:r>
+        <w:rPr>
+          <w:sz w:val="22"/>
+        </w:rPr>
+        <w:t xml:space="preserve"> com valores e totais.</w:t>
       </w:r>
     </w:p>
     <w:p>
@@ -8794,7 +8911,11 @@
         <w:t>ó</w:t>
       </w:r>
       <w:r>
-        <w:t>rio (?modo=relatorio&amp;competencia=AAAA-MM) num Microsoft Edge invis</w:t>
+        <w:t xml:space="preserve">rio </w:t>
+      </w:r>
+      <w:r>
+        <w:lastRenderedPageBreak/>
+        <w:t>(?modo=relatorio&amp;competencia=AAAA-MM) num Microsoft Edge invis</w:t>
       </w:r>
       <w:r>
         <w:rPr>
@@ -8839,11 +8960,7 @@
         <w:t>ç</w:t>
       </w:r>
       <w:r>
-        <w:t xml:space="preserve">os do </w:t>
-      </w:r>
-      <w:r>
-        <w:lastRenderedPageBreak/>
-        <w:t xml:space="preserve">servidor local. O PDF </w:t>
+        <w:t xml:space="preserve">os do servidor local. O PDF </w:t>
       </w:r>
       <w:r>
         <w:rPr>
@@ -8893,6 +9010,1877 @@
     </w:p>
     <w:p>
       <w:pPr>
+        <w:pStyle w:val="Ttulo2"/>
+        <w:spacing w:line="252" w:lineRule="auto"/>
+      </w:pPr>
+      <w:r>
+        <w:rPr>
+          <w:rFonts w:ascii="Aptos" w:hAnsi="Aptos" w:hint="eastAsia"/>
+        </w:rPr>
+        <w:t>10.1 Filtros da página</w:t>
+      </w:r>
+    </w:p>
+    <w:p>
+      <w:pPr>
+        <w:pStyle w:val="Commarcadores"/>
+        <w:spacing w:after="50" w:line="264" w:lineRule="auto"/>
+        <w:rPr>
+          <w:rFonts w:hint="eastAsia"/>
+        </w:rPr>
+      </w:pPr>
+      <w:r>
+        <w:rPr>
+          <w:sz w:val="22"/>
+        </w:rPr>
+        <w:t>Bot</w:t>
+      </w:r>
+      <w:r>
+        <w:rPr>
+          <w:rFonts w:hint="cs"/>
+          <w:sz w:val="22"/>
+        </w:rPr>
+        <w:t>ã</w:t>
+      </w:r>
+      <w:r>
+        <w:rPr>
+          <w:sz w:val="22"/>
+        </w:rPr>
+        <w:t xml:space="preserve">o Filtros, </w:t>
+      </w:r>
+      <w:r>
+        <w:rPr>
+          <w:rFonts w:hint="cs"/>
+          <w:sz w:val="22"/>
+        </w:rPr>
+        <w:t>à</w:t>
+      </w:r>
+      <w:r>
+        <w:rPr>
+          <w:sz w:val="22"/>
+        </w:rPr>
+        <w:t xml:space="preserve"> esquerda do Share Link (dispon</w:t>
+      </w:r>
+      <w:r>
+        <w:rPr>
+          <w:rFonts w:hint="cs"/>
+          <w:sz w:val="22"/>
+        </w:rPr>
+        <w:t>í</w:t>
+      </w:r>
+      <w:r>
+        <w:rPr>
+          <w:sz w:val="22"/>
+        </w:rPr>
+        <w:t>vel a todos os perfis): abre um pop-up com os mesmos agrupadores do PMM anal</w:t>
+      </w:r>
+      <w:r>
+        <w:rPr>
+          <w:rFonts w:hint="cs"/>
+          <w:sz w:val="22"/>
+        </w:rPr>
+        <w:t>í</w:t>
+      </w:r>
+      <w:r>
+        <w:rPr>
+          <w:sz w:val="22"/>
+        </w:rPr>
+        <w:t>tico e da Dispers</w:t>
+      </w:r>
+      <w:r>
+        <w:rPr>
+          <w:rFonts w:hint="cs"/>
+          <w:sz w:val="22"/>
+        </w:rPr>
+        <w:t>ã</w:t>
+      </w:r>
+      <w:r>
+        <w:rPr>
+          <w:sz w:val="22"/>
+        </w:rPr>
+        <w:t xml:space="preserve">o do estoque livre </w:t>
+      </w:r>
+      <w:r>
+        <w:rPr>
+          <w:rFonts w:hint="cs"/>
+          <w:sz w:val="22"/>
+        </w:rPr>
+        <w:t>—</w:t>
+      </w:r>
+      <w:r>
+        <w:rPr>
+          <w:sz w:val="22"/>
+        </w:rPr>
+        <w:t xml:space="preserve"> Division Description, Centro, Local de estoque e Season. </w:t>
+      </w:r>
+      <w:r>
+        <w:rPr>
+          <w:rFonts w:hint="cs"/>
+          <w:sz w:val="22"/>
+        </w:rPr>
+        <w:t>À</w:t>
+      </w:r>
+      <w:r>
+        <w:rPr>
+          <w:sz w:val="22"/>
+        </w:rPr>
+        <w:t xml:space="preserve"> esquerda ficam as dimens</w:t>
+      </w:r>
+      <w:r>
+        <w:rPr>
+          <w:rFonts w:hint="cs"/>
+          <w:sz w:val="22"/>
+        </w:rPr>
+        <w:t>õ</w:t>
+      </w:r>
+      <w:r>
+        <w:rPr>
+          <w:sz w:val="22"/>
+        </w:rPr>
+        <w:t xml:space="preserve">es (com a quantidade de valores marcados); </w:t>
+      </w:r>
+      <w:r>
+        <w:rPr>
+          <w:rFonts w:hint="cs"/>
+          <w:sz w:val="22"/>
+        </w:rPr>
+        <w:t>à</w:t>
+      </w:r>
+      <w:r>
+        <w:rPr>
+          <w:sz w:val="22"/>
+        </w:rPr>
+        <w:t xml:space="preserve"> direita, a lista de valores com busca, valor fiscal e n</w:t>
+      </w:r>
+      <w:r>
+        <w:rPr>
+          <w:rFonts w:hint="cs"/>
+          <w:sz w:val="22"/>
+        </w:rPr>
+        <w:t>ú</w:t>
+      </w:r>
+      <w:r>
+        <w:rPr>
+          <w:sz w:val="22"/>
+        </w:rPr>
+        <w:t>mero de linhas de cada um, e os bot</w:t>
+      </w:r>
+      <w:r>
+        <w:rPr>
+          <w:rFonts w:hint="cs"/>
+          <w:sz w:val="22"/>
+        </w:rPr>
+        <w:t>õ</w:t>
+      </w:r>
+      <w:r>
+        <w:rPr>
+          <w:sz w:val="22"/>
+        </w:rPr>
+        <w:t>es Marcar vis</w:t>
+      </w:r>
+      <w:r>
+        <w:rPr>
+          <w:rFonts w:hint="cs"/>
+          <w:sz w:val="22"/>
+        </w:rPr>
+        <w:t>í</w:t>
+      </w:r>
+      <w:r>
+        <w:rPr>
+          <w:sz w:val="22"/>
+        </w:rPr>
+        <w:t>veis e Desmarcar. Aplicar filtros recalcula a p</w:t>
+      </w:r>
+      <w:r>
+        <w:rPr>
+          <w:rFonts w:hint="cs"/>
+          <w:sz w:val="22"/>
+        </w:rPr>
+        <w:t>á</w:t>
+      </w:r>
+      <w:r>
+        <w:rPr>
+          <w:sz w:val="22"/>
+        </w:rPr>
+        <w:t>gina.</w:t>
+      </w:r>
+    </w:p>
+    <w:p>
+      <w:pPr>
+        <w:pStyle w:val="Commarcadores"/>
+        <w:spacing w:after="50" w:line="264" w:lineRule="auto"/>
+        <w:rPr>
+          <w:rFonts w:hint="eastAsia"/>
+        </w:rPr>
+      </w:pPr>
+      <w:r>
+        <w:rPr>
+          <w:sz w:val="22"/>
+        </w:rPr>
+        <w:t>Regra: OU entre valores da mesma dimens</w:t>
+      </w:r>
+      <w:r>
+        <w:rPr>
+          <w:rFonts w:hint="cs"/>
+          <w:sz w:val="22"/>
+        </w:rPr>
+        <w:t>ã</w:t>
+      </w:r>
+      <w:r>
+        <w:rPr>
+          <w:sz w:val="22"/>
+        </w:rPr>
+        <w:t>o e E entre dimens</w:t>
+      </w:r>
+      <w:r>
+        <w:rPr>
+          <w:rFonts w:hint="cs"/>
+          <w:sz w:val="22"/>
+        </w:rPr>
+        <w:t>õ</w:t>
+      </w:r>
+      <w:r>
+        <w:rPr>
+          <w:sz w:val="22"/>
+        </w:rPr>
+        <w:t>es. "N</w:t>
+      </w:r>
+      <w:r>
+        <w:rPr>
+          <w:rFonts w:hint="cs"/>
+          <w:sz w:val="22"/>
+        </w:rPr>
+        <w:t>ã</w:t>
+      </w:r>
+      <w:r>
+        <w:rPr>
+          <w:sz w:val="22"/>
+        </w:rPr>
+        <w:t>o informado" corresponde ao campo vazio, como nos gr</w:t>
+      </w:r>
+      <w:r>
+        <w:rPr>
+          <w:rFonts w:hint="cs"/>
+          <w:sz w:val="22"/>
+        </w:rPr>
+        <w:t>á</w:t>
+      </w:r>
+      <w:r>
+        <w:rPr>
+          <w:sz w:val="22"/>
+        </w:rPr>
+        <w:t>ficos. Os filtros valem para todos os KPIs e gr</w:t>
+      </w:r>
+      <w:r>
+        <w:rPr>
+          <w:rFonts w:hint="cs"/>
+          <w:sz w:val="22"/>
+        </w:rPr>
+        <w:t>á</w:t>
+      </w:r>
+      <w:r>
+        <w:rPr>
+          <w:sz w:val="22"/>
+        </w:rPr>
+        <w:t>ficos, inclusive Evolu</w:t>
+      </w:r>
+      <w:r>
+        <w:rPr>
+          <w:rFonts w:hint="cs"/>
+          <w:sz w:val="22"/>
+        </w:rPr>
+        <w:t>çã</w:t>
+      </w:r>
+      <w:r>
+        <w:rPr>
+          <w:sz w:val="22"/>
+        </w:rPr>
+        <w:t>o (mesmo filtro em cada compet</w:t>
+      </w:r>
+      <w:r>
+        <w:rPr>
+          <w:rFonts w:hint="cs"/>
+          <w:sz w:val="22"/>
+        </w:rPr>
+        <w:t>ê</w:t>
+      </w:r>
+      <w:r>
+        <w:rPr>
+          <w:sz w:val="22"/>
+        </w:rPr>
+        <w:t>ncia), compara</w:t>
+      </w:r>
+      <w:r>
+        <w:rPr>
+          <w:rFonts w:hint="cs"/>
+          <w:sz w:val="22"/>
+        </w:rPr>
+        <w:t>çã</w:t>
+      </w:r>
+      <w:r>
+        <w:rPr>
+          <w:sz w:val="22"/>
+        </w:rPr>
+        <w:t>o de PMM e varia</w:t>
+      </w:r>
+      <w:r>
+        <w:rPr>
+          <w:rFonts w:hint="cs"/>
+          <w:sz w:val="22"/>
+        </w:rPr>
+        <w:t>çã</w:t>
+      </w:r>
+      <w:r>
+        <w:rPr>
+          <w:sz w:val="22"/>
+        </w:rPr>
+        <w:t>o por Division contra a compet</w:t>
+      </w:r>
+      <w:r>
+        <w:rPr>
+          <w:rFonts w:hint="cs"/>
+          <w:sz w:val="22"/>
+        </w:rPr>
+        <w:t>ê</w:t>
+      </w:r>
+      <w:r>
+        <w:rPr>
+          <w:sz w:val="22"/>
+        </w:rPr>
+        <w:t>ncia anterior. A cobertura All Brazil continua sendo a da compet</w:t>
+      </w:r>
+      <w:r>
+        <w:rPr>
+          <w:rFonts w:hint="cs"/>
+          <w:sz w:val="22"/>
+        </w:rPr>
+        <w:t>ê</w:t>
+      </w:r>
+      <w:r>
+        <w:rPr>
+          <w:sz w:val="22"/>
+        </w:rPr>
+        <w:t>ncia inteira.</w:t>
+      </w:r>
+    </w:p>
+    <w:p>
+      <w:pPr>
+        <w:pStyle w:val="Commarcadores"/>
+        <w:spacing w:after="50" w:line="264" w:lineRule="auto"/>
+        <w:rPr>
+          <w:rFonts w:hint="eastAsia"/>
+        </w:rPr>
+      </w:pPr>
+      <w:r>
+        <w:rPr>
+          <w:sz w:val="22"/>
+        </w:rPr>
+        <w:t>Filtros ativos aparecem como etiquetas abaixo do t</w:t>
+      </w:r>
+      <w:r>
+        <w:rPr>
+          <w:rFonts w:hint="cs"/>
+          <w:sz w:val="22"/>
+        </w:rPr>
+        <w:t>í</w:t>
+      </w:r>
+      <w:r>
+        <w:rPr>
+          <w:sz w:val="22"/>
+        </w:rPr>
+        <w:t>tulo (</w:t>
+      </w:r>
+      <w:r>
+        <w:rPr>
+          <w:rFonts w:hint="eastAsia"/>
+          <w:sz w:val="22"/>
+        </w:rPr>
+        <w:t>×</w:t>
+      </w:r>
+      <w:r>
+        <w:rPr>
+          <w:sz w:val="22"/>
+        </w:rPr>
+        <w:t xml:space="preserve"> remove a dimens</w:t>
+      </w:r>
+      <w:r>
+        <w:rPr>
+          <w:rFonts w:hint="cs"/>
+          <w:sz w:val="22"/>
+        </w:rPr>
+        <w:t>ã</w:t>
+      </w:r>
+      <w:r>
+        <w:rPr>
+          <w:sz w:val="22"/>
+        </w:rPr>
+        <w:t>o; Limpar filtros remove todos); o bot</w:t>
+      </w:r>
+      <w:r>
+        <w:rPr>
+          <w:rFonts w:hint="cs"/>
+          <w:sz w:val="22"/>
+        </w:rPr>
+        <w:t>ã</w:t>
+      </w:r>
+      <w:r>
+        <w:rPr>
+          <w:sz w:val="22"/>
+        </w:rPr>
+        <w:t>o fica azul-marinho com o total de valores marcados e o subt</w:t>
+      </w:r>
+      <w:r>
+        <w:rPr>
+          <w:rFonts w:hint="cs"/>
+          <w:sz w:val="22"/>
+        </w:rPr>
+        <w:t>í</w:t>
+      </w:r>
+      <w:r>
+        <w:rPr>
+          <w:sz w:val="22"/>
+        </w:rPr>
+        <w:t>tulo informa que a p</w:t>
+      </w:r>
+      <w:r>
+        <w:rPr>
+          <w:rFonts w:hint="cs"/>
+          <w:sz w:val="22"/>
+        </w:rPr>
+        <w:t>á</w:t>
+      </w:r>
+      <w:r>
+        <w:rPr>
+          <w:sz w:val="22"/>
+        </w:rPr>
+        <w:t>gina est</w:t>
+      </w:r>
+      <w:r>
+        <w:rPr>
+          <w:rFonts w:hint="cs"/>
+          <w:sz w:val="22"/>
+        </w:rPr>
+        <w:t>á</w:t>
+      </w:r>
+      <w:r>
+        <w:rPr>
+          <w:sz w:val="22"/>
+        </w:rPr>
+        <w:t xml:space="preserve"> filtrada.</w:t>
+      </w:r>
+    </w:p>
+    <w:p>
+      <w:pPr>
+        <w:pStyle w:val="Commarcadores"/>
+        <w:spacing w:after="50" w:line="264" w:lineRule="auto"/>
+        <w:rPr>
+          <w:rFonts w:hint="eastAsia"/>
+        </w:rPr>
+      </w:pPr>
+      <w:r>
+        <w:rPr>
+          <w:sz w:val="22"/>
+        </w:rPr>
+        <w:t>T</w:t>
+      </w:r>
+      <w:r>
+        <w:rPr>
+          <w:rFonts w:hint="cs"/>
+          <w:sz w:val="22"/>
+        </w:rPr>
+        <w:t>é</w:t>
+      </w:r>
+      <w:r>
+        <w:rPr>
+          <w:sz w:val="22"/>
+        </w:rPr>
+        <w:t>cnico: GET /api/dashboard/filter-options?period= devolve os valores por dimens</w:t>
+      </w:r>
+      <w:r>
+        <w:rPr>
+          <w:rFonts w:hint="cs"/>
+          <w:sz w:val="22"/>
+        </w:rPr>
+        <w:t>ã</w:t>
+      </w:r>
+      <w:r>
+        <w:rPr>
+          <w:sz w:val="22"/>
+        </w:rPr>
+        <w:t>o (maior valor fiscal primeiro); GET /api/dashboard/summary aceita filters={"division":[...],"plant":[...],"location":[...],"season":[...]}. inventory.overview_filter_sql monta a cl</w:t>
+      </w:r>
+      <w:r>
+        <w:rPr>
+          <w:rFonts w:hint="cs"/>
+          <w:sz w:val="22"/>
+        </w:rPr>
+        <w:t>á</w:t>
+      </w:r>
+      <w:r>
+        <w:rPr>
+          <w:sz w:val="22"/>
+        </w:rPr>
+        <w:t>usula com par</w:t>
+      </w:r>
+      <w:r>
+        <w:rPr>
+          <w:rFonts w:hint="cs"/>
+          <w:sz w:val="22"/>
+        </w:rPr>
+        <w:t>â</w:t>
+      </w:r>
+      <w:r>
+        <w:rPr>
+          <w:sz w:val="22"/>
+        </w:rPr>
+        <w:t>metros (dimens</w:t>
+      </w:r>
+      <w:r>
+        <w:rPr>
+          <w:rFonts w:hint="cs"/>
+          <w:sz w:val="22"/>
+        </w:rPr>
+        <w:t>õ</w:t>
+      </w:r>
+      <w:r>
+        <w:rPr>
+          <w:sz w:val="22"/>
+        </w:rPr>
+        <w:t>es desconhecidas s</w:t>
+      </w:r>
+      <w:r>
+        <w:rPr>
+          <w:rFonts w:hint="cs"/>
+          <w:sz w:val="22"/>
+        </w:rPr>
+        <w:t>ã</w:t>
+      </w:r>
+      <w:r>
+        <w:rPr>
+          <w:sz w:val="22"/>
+        </w:rPr>
+        <w:t>o ignoradas, at</w:t>
+      </w:r>
+      <w:r>
+        <w:rPr>
+          <w:rFonts w:hint="cs"/>
+          <w:sz w:val="22"/>
+        </w:rPr>
+        <w:t>é</w:t>
+      </w:r>
+      <w:r>
+        <w:rPr>
+          <w:sz w:val="22"/>
+        </w:rPr>
+        <w:t xml:space="preserve"> 300 valores por dimens</w:t>
+      </w:r>
+      <w:r>
+        <w:rPr>
+          <w:rFonts w:hint="cs"/>
+          <w:sz w:val="22"/>
+        </w:rPr>
+        <w:t>ã</w:t>
+      </w:r>
+      <w:r>
+        <w:rPr>
+          <w:sz w:val="22"/>
+        </w:rPr>
+        <w:t xml:space="preserve">o) e </w:t>
+      </w:r>
+      <w:r>
+        <w:rPr>
+          <w:rFonts w:hint="cs"/>
+          <w:sz w:val="22"/>
+        </w:rPr>
+        <w:t>é</w:t>
+      </w:r>
+      <w:r>
+        <w:rPr>
+          <w:sz w:val="22"/>
+        </w:rPr>
+        <w:t xml:space="preserve"> aplicada em todas as consultas de dashboard_summary. Sem filtros, o resultado </w:t>
+      </w:r>
+      <w:r>
+        <w:rPr>
+          <w:rFonts w:hint="cs"/>
+          <w:sz w:val="22"/>
+        </w:rPr>
+        <w:t>é</w:t>
+      </w:r>
+      <w:r>
+        <w:rPr>
+          <w:sz w:val="22"/>
+        </w:rPr>
+        <w:t xml:space="preserve"> id</w:t>
+      </w:r>
+      <w:r>
+        <w:rPr>
+          <w:rFonts w:hint="cs"/>
+          <w:sz w:val="22"/>
+        </w:rPr>
+        <w:t>ê</w:t>
+      </w:r>
+      <w:r>
+        <w:rPr>
+          <w:sz w:val="22"/>
+        </w:rPr>
+        <w:t>ntico ao anterior (Optimus, relat</w:t>
+      </w:r>
+      <w:r>
+        <w:rPr>
+          <w:rFonts w:hint="cs"/>
+          <w:sz w:val="22"/>
+        </w:rPr>
+        <w:t>ó</w:t>
+      </w:r>
+      <w:r>
+        <w:rPr>
+          <w:sz w:val="22"/>
+        </w:rPr>
+        <w:t>rios e avisos continuam usando a compet</w:t>
+      </w:r>
+      <w:r>
+        <w:rPr>
+          <w:rFonts w:hint="cs"/>
+          <w:sz w:val="22"/>
+        </w:rPr>
+        <w:t>ê</w:t>
+      </w:r>
+      <w:r>
+        <w:rPr>
+          <w:sz w:val="22"/>
+        </w:rPr>
+        <w:t>ncia inteira).</w:t>
+      </w:r>
+    </w:p>
+    <w:p>
+      <w:pPr>
+        <w:pStyle w:val="Commarcadores"/>
+        <w:spacing w:after="50" w:line="264" w:lineRule="auto"/>
+        <w:rPr>
+          <w:rFonts w:hint="eastAsia"/>
+        </w:rPr>
+      </w:pPr>
+      <w:r>
+        <w:rPr>
+          <w:sz w:val="22"/>
+        </w:rPr>
+        <w:t>O Share Link e o PDF continuam gerando a compet</w:t>
+      </w:r>
+      <w:r>
+        <w:rPr>
+          <w:rFonts w:hint="cs"/>
+          <w:sz w:val="22"/>
+        </w:rPr>
+        <w:t>ê</w:t>
+      </w:r>
+      <w:r>
+        <w:rPr>
+          <w:sz w:val="22"/>
+        </w:rPr>
+        <w:t>ncia inteira; o bot</w:t>
+      </w:r>
+      <w:r>
+        <w:rPr>
+          <w:rFonts w:hint="cs"/>
+          <w:sz w:val="22"/>
+        </w:rPr>
+        <w:t>ã</w:t>
+      </w:r>
+      <w:r>
+        <w:rPr>
+          <w:sz w:val="22"/>
+        </w:rPr>
+        <w:t>o e as etiquetas n</w:t>
+      </w:r>
+      <w:r>
+        <w:rPr>
+          <w:rFonts w:hint="cs"/>
+          <w:sz w:val="22"/>
+        </w:rPr>
+        <w:t>ã</w:t>
+      </w:r>
+      <w:r>
+        <w:rPr>
+          <w:sz w:val="22"/>
+        </w:rPr>
+        <w:t>o aparecem nos relat</w:t>
+      </w:r>
+      <w:r>
+        <w:rPr>
+          <w:rFonts w:hint="cs"/>
+          <w:sz w:val="22"/>
+        </w:rPr>
+        <w:t>ó</w:t>
+      </w:r>
+      <w:r>
+        <w:rPr>
+          <w:sz w:val="22"/>
+        </w:rPr>
+        <w:t>rios.</w:t>
+      </w:r>
+    </w:p>
+    <w:p>
+      <w:pPr>
+        <w:pStyle w:val="Ttulo2"/>
+        <w:spacing w:line="252" w:lineRule="auto"/>
+      </w:pPr>
+      <w:r>
+        <w:rPr>
+          <w:rFonts w:ascii="Aptos" w:hAnsi="Aptos" w:hint="eastAsia"/>
+        </w:rPr>
+        <w:t>10.2 Mapa mental</w:t>
+      </w:r>
+    </w:p>
+    <w:p>
+      <w:pPr>
+        <w:pStyle w:val="Commarcadores"/>
+        <w:spacing w:after="50" w:line="264" w:lineRule="auto"/>
+        <w:rPr>
+          <w:rFonts w:hint="eastAsia"/>
+        </w:rPr>
+      </w:pPr>
+      <w:r>
+        <w:rPr>
+          <w:sz w:val="22"/>
+        </w:rPr>
+        <w:t>Bot</w:t>
+      </w:r>
+      <w:r>
+        <w:rPr>
+          <w:rFonts w:hint="cs"/>
+          <w:sz w:val="22"/>
+        </w:rPr>
+        <w:t>ã</w:t>
+      </w:r>
+      <w:r>
+        <w:rPr>
+          <w:sz w:val="22"/>
+        </w:rPr>
+        <w:t xml:space="preserve">o Mapa mental, </w:t>
+      </w:r>
+      <w:r>
+        <w:rPr>
+          <w:rFonts w:hint="cs"/>
+          <w:sz w:val="22"/>
+        </w:rPr>
+        <w:t>à</w:t>
+      </w:r>
+      <w:r>
+        <w:rPr>
+          <w:sz w:val="22"/>
+        </w:rPr>
+        <w:t xml:space="preserve"> esquerda de Filtros (todos os perfis): abre um pop-up escuro em tela cheia com os insights da compet</w:t>
+      </w:r>
+      <w:r>
+        <w:rPr>
+          <w:rFonts w:hint="cs"/>
+          <w:sz w:val="22"/>
+        </w:rPr>
+        <w:t>ê</w:t>
+      </w:r>
+      <w:r>
+        <w:rPr>
+          <w:sz w:val="22"/>
+        </w:rPr>
+        <w:t>ncia em forma de mapa mental. No centro, a esfera Estoque Fisia com o valor fiscal; dela saem 7 temas: Valor e giro, Aging e obsolesc</w:t>
+      </w:r>
+      <w:r>
+        <w:rPr>
+          <w:rFonts w:hint="cs"/>
+          <w:sz w:val="22"/>
+        </w:rPr>
+        <w:t>ê</w:t>
+      </w:r>
+      <w:r>
+        <w:rPr>
+          <w:sz w:val="22"/>
+        </w:rPr>
+        <w:t>ncia, Divis</w:t>
+      </w:r>
+      <w:r>
+        <w:rPr>
+          <w:rFonts w:hint="cs"/>
+          <w:sz w:val="22"/>
+        </w:rPr>
+        <w:t>õ</w:t>
+      </w:r>
+      <w:r>
+        <w:rPr>
+          <w:sz w:val="22"/>
+        </w:rPr>
+        <w:t>es, Onde est</w:t>
+      </w:r>
+      <w:r>
+        <w:rPr>
+          <w:rFonts w:hint="cs"/>
+          <w:sz w:val="22"/>
+        </w:rPr>
+        <w:t>á</w:t>
+      </w:r>
+      <w:r>
+        <w:rPr>
+          <w:sz w:val="22"/>
+        </w:rPr>
+        <w:t xml:space="preserve"> o estoque, Cole</w:t>
+      </w:r>
+      <w:r>
+        <w:rPr>
+          <w:rFonts w:hint="cs"/>
+          <w:sz w:val="22"/>
+        </w:rPr>
+        <w:t>çõ</w:t>
+      </w:r>
+      <w:r>
+        <w:rPr>
+          <w:sz w:val="22"/>
+        </w:rPr>
+        <w:t>es e seasons, Evolu</w:t>
+      </w:r>
+      <w:r>
+        <w:rPr>
+          <w:rFonts w:hint="cs"/>
+          <w:sz w:val="22"/>
+        </w:rPr>
+        <w:t>çã</w:t>
+      </w:r>
+      <w:r>
+        <w:rPr>
+          <w:sz w:val="22"/>
+        </w:rPr>
+        <w:t>o e Composi</w:t>
+      </w:r>
+      <w:r>
+        <w:rPr>
+          <w:rFonts w:hint="cs"/>
+          <w:sz w:val="22"/>
+        </w:rPr>
+        <w:t>çã</w:t>
+      </w:r>
+      <w:r>
+        <w:rPr>
+          <w:sz w:val="22"/>
+        </w:rPr>
+        <w:t>o do custo.</w:t>
+      </w:r>
+    </w:p>
+    <w:p>
+      <w:pPr>
+        <w:pStyle w:val="Commarcadores"/>
+        <w:spacing w:after="50" w:line="264" w:lineRule="auto"/>
+        <w:rPr>
+          <w:rFonts w:hint="eastAsia"/>
+        </w:rPr>
+      </w:pPr>
+      <w:r>
+        <w:rPr>
+          <w:sz w:val="22"/>
+        </w:rPr>
+        <w:t>Intera</w:t>
+      </w:r>
+      <w:r>
+        <w:rPr>
+          <w:rFonts w:hint="cs"/>
+          <w:sz w:val="22"/>
+        </w:rPr>
+        <w:t>çã</w:t>
+      </w:r>
+      <w:r>
+        <w:rPr>
+          <w:sz w:val="22"/>
+        </w:rPr>
+        <w:t>o: clicar numa esfera faz o ramo crescer para o pr</w:t>
+      </w:r>
+      <w:r>
+        <w:rPr>
+          <w:rFonts w:hint="cs"/>
+          <w:sz w:val="22"/>
+        </w:rPr>
+        <w:t>ó</w:t>
+      </w:r>
+      <w:r>
+        <w:rPr>
+          <w:sz w:val="22"/>
+        </w:rPr>
+        <w:t>ximo n</w:t>
+      </w:r>
+      <w:r>
+        <w:rPr>
+          <w:rFonts w:hint="cs"/>
+          <w:sz w:val="22"/>
+        </w:rPr>
+        <w:t>í</w:t>
+      </w:r>
+      <w:r>
+        <w:rPr>
+          <w:sz w:val="22"/>
+        </w:rPr>
+        <w:t>vel com anima</w:t>
+      </w:r>
+      <w:r>
+        <w:rPr>
+          <w:rFonts w:hint="cs"/>
+          <w:sz w:val="22"/>
+        </w:rPr>
+        <w:t>çã</w:t>
+      </w:r>
+      <w:r>
+        <w:rPr>
+          <w:sz w:val="22"/>
+        </w:rPr>
+        <w:t xml:space="preserve">o; clicar de novo recolhe. O painel </w:t>
+      </w:r>
+      <w:r>
+        <w:rPr>
+          <w:rFonts w:hint="cs"/>
+          <w:sz w:val="22"/>
+        </w:rPr>
+        <w:t>à</w:t>
+      </w:r>
+      <w:r>
+        <w:rPr>
+          <w:sz w:val="22"/>
+        </w:rPr>
+        <w:t xml:space="preserve"> direita mostra o caminho, o n</w:t>
+      </w:r>
+      <w:r>
+        <w:rPr>
+          <w:rFonts w:hint="cs"/>
+          <w:sz w:val="22"/>
+        </w:rPr>
+        <w:t>ú</w:t>
+      </w:r>
+      <w:r>
+        <w:rPr>
+          <w:sz w:val="22"/>
+        </w:rPr>
+        <w:t>mero e o insight da esfera. Bot</w:t>
+      </w:r>
+      <w:r>
+        <w:rPr>
+          <w:rFonts w:hint="cs"/>
+          <w:sz w:val="22"/>
+        </w:rPr>
+        <w:t>õ</w:t>
+      </w:r>
+      <w:r>
+        <w:rPr>
+          <w:sz w:val="22"/>
+        </w:rPr>
+        <w:t xml:space="preserve">es Expandir tudo, Recolher e Centralizar; arrastar move, rolar aproxima e Esc fecha. A </w:t>
+      </w:r>
+      <w:r>
+        <w:rPr>
+          <w:rFonts w:hint="cs"/>
+          <w:sz w:val="22"/>
+        </w:rPr>
+        <w:t>á</w:t>
+      </w:r>
+      <w:r>
+        <w:rPr>
+          <w:sz w:val="22"/>
+        </w:rPr>
+        <w:t>rea do mapa fica entre o cabe</w:t>
+      </w:r>
+      <w:r>
+        <w:rPr>
+          <w:rFonts w:hint="cs"/>
+          <w:sz w:val="22"/>
+        </w:rPr>
+        <w:t>ç</w:t>
+      </w:r>
+      <w:r>
+        <w:rPr>
+          <w:sz w:val="22"/>
+        </w:rPr>
+        <w:t>alho e o rodap</w:t>
+      </w:r>
+      <w:r>
+        <w:rPr>
+          <w:rFonts w:hint="cs"/>
+          <w:sz w:val="22"/>
+        </w:rPr>
+        <w:t>é</w:t>
+      </w:r>
+      <w:r>
+        <w:rPr>
+          <w:sz w:val="22"/>
+        </w:rPr>
+        <w:t xml:space="preserve"> do pop-up (as esferas n</w:t>
+      </w:r>
+      <w:r>
+        <w:rPr>
+          <w:rFonts w:hint="cs"/>
+          <w:sz w:val="22"/>
+        </w:rPr>
+        <w:t>ã</w:t>
+      </w:r>
+      <w:r>
+        <w:rPr>
+          <w:sz w:val="22"/>
+        </w:rPr>
+        <w:t>o passam por baixo do t</w:t>
+      </w:r>
+      <w:r>
+        <w:rPr>
+          <w:rFonts w:hint="cs"/>
+          <w:sz w:val="22"/>
+        </w:rPr>
+        <w:t>í</w:t>
+      </w:r>
+      <w:r>
+        <w:rPr>
+          <w:sz w:val="22"/>
+        </w:rPr>
+        <w:t>tulo).</w:t>
+      </w:r>
+    </w:p>
+    <w:p>
+      <w:pPr>
+        <w:pStyle w:val="Commarcadores"/>
+        <w:spacing w:after="50" w:line="264" w:lineRule="auto"/>
+        <w:rPr>
+          <w:rFonts w:hint="eastAsia"/>
+        </w:rPr>
+      </w:pPr>
+      <w:r>
+        <w:rPr>
+          <w:sz w:val="22"/>
+        </w:rPr>
+        <w:t>Detalhamentos: Onde est</w:t>
+      </w:r>
+      <w:r>
+        <w:rPr>
+          <w:rFonts w:hint="cs"/>
+          <w:sz w:val="22"/>
+        </w:rPr>
+        <w:t>á</w:t>
+      </w:r>
+      <w:r>
+        <w:rPr>
+          <w:sz w:val="22"/>
+        </w:rPr>
+        <w:t xml:space="preserve"> o estoque </w:t>
+      </w:r>
+      <w:r>
+        <w:rPr>
+          <w:rFonts w:hint="cs"/>
+          <w:sz w:val="22"/>
+        </w:rPr>
+        <w:t>›</w:t>
+      </w:r>
+      <w:r>
+        <w:rPr>
+          <w:sz w:val="22"/>
+        </w:rPr>
+        <w:t xml:space="preserve"> cada local </w:t>
+      </w:r>
+      <w:r>
+        <w:rPr>
+          <w:rFonts w:hint="cs"/>
+          <w:sz w:val="22"/>
+        </w:rPr>
+        <w:t>›</w:t>
+      </w:r>
+      <w:r>
+        <w:rPr>
+          <w:sz w:val="22"/>
+        </w:rPr>
+        <w:t xml:space="preserve"> os centros (lojas) do local, com valor, % do local, unidades e linhas (12 maiores e "Outros N centros", que tamb</w:t>
+      </w:r>
+      <w:r>
+        <w:rPr>
+          <w:rFonts w:hint="cs"/>
+          <w:sz w:val="22"/>
+        </w:rPr>
+        <w:t>é</w:t>
+      </w:r>
+      <w:r>
+        <w:rPr>
+          <w:sz w:val="22"/>
+        </w:rPr>
+        <w:t xml:space="preserve">m abre); Aging </w:t>
+      </w:r>
+      <w:r>
+        <w:rPr>
+          <w:rFonts w:hint="cs"/>
+          <w:sz w:val="22"/>
+        </w:rPr>
+        <w:t>›</w:t>
+      </w:r>
+      <w:r>
+        <w:rPr>
+          <w:sz w:val="22"/>
+        </w:rPr>
+        <w:t xml:space="preserve"> At</w:t>
+      </w:r>
+      <w:r>
+        <w:rPr>
+          <w:rFonts w:hint="cs"/>
+          <w:sz w:val="22"/>
+        </w:rPr>
+        <w:t>é</w:t>
+      </w:r>
+      <w:r>
+        <w:rPr>
+          <w:sz w:val="22"/>
+        </w:rPr>
+        <w:t xml:space="preserve"> 12 meses </w:t>
+      </w:r>
+      <w:r>
+        <w:rPr>
+          <w:rFonts w:hint="cs"/>
+          <w:sz w:val="22"/>
+        </w:rPr>
+        <w:t>›</w:t>
+      </w:r>
+      <w:r>
+        <w:rPr>
+          <w:sz w:val="22"/>
+        </w:rPr>
+        <w:t xml:space="preserve"> faixas 1) a 4); Mais de 12 meses </w:t>
+      </w:r>
+      <w:r>
+        <w:rPr>
+          <w:rFonts w:hint="cs"/>
+          <w:sz w:val="22"/>
+        </w:rPr>
+        <w:t>›</w:t>
+      </w:r>
+      <w:r>
+        <w:rPr>
+          <w:sz w:val="22"/>
+        </w:rPr>
+        <w:t xml:space="preserve"> faixas 5) a 8) e Por divis</w:t>
+      </w:r>
+      <w:r>
+        <w:rPr>
+          <w:rFonts w:hint="cs"/>
+          <w:sz w:val="22"/>
+        </w:rPr>
+        <w:t>ã</w:t>
+      </w:r>
+      <w:r>
+        <w:rPr>
+          <w:sz w:val="22"/>
+        </w:rPr>
+        <w:t>o; Divis</w:t>
+      </w:r>
+      <w:r>
+        <w:rPr>
+          <w:rFonts w:hint="cs"/>
+          <w:sz w:val="22"/>
+        </w:rPr>
+        <w:t>õ</w:t>
+      </w:r>
+      <w:r>
+        <w:rPr>
+          <w:sz w:val="22"/>
+        </w:rPr>
+        <w:t xml:space="preserve">es </w:t>
+      </w:r>
+      <w:r>
+        <w:rPr>
+          <w:rFonts w:hint="cs"/>
+          <w:sz w:val="22"/>
+        </w:rPr>
+        <w:t>›</w:t>
+      </w:r>
+      <w:r>
+        <w:rPr>
+          <w:sz w:val="22"/>
+        </w:rPr>
+        <w:t xml:space="preserve"> cada divis</w:t>
+      </w:r>
+      <w:r>
+        <w:rPr>
+          <w:rFonts w:hint="cs"/>
+          <w:sz w:val="22"/>
+        </w:rPr>
+        <w:t>ã</w:t>
+      </w:r>
+      <w:r>
+        <w:rPr>
+          <w:sz w:val="22"/>
+        </w:rPr>
+        <w:t xml:space="preserve">o </w:t>
+      </w:r>
+      <w:r>
+        <w:rPr>
+          <w:rFonts w:hint="cs"/>
+          <w:sz w:val="22"/>
+        </w:rPr>
+        <w:t>›</w:t>
+      </w:r>
+      <w:r>
+        <w:rPr>
+          <w:sz w:val="22"/>
+        </w:rPr>
+        <w:t xml:space="preserve"> varia</w:t>
+      </w:r>
+      <w:r>
+        <w:rPr>
+          <w:rFonts w:hint="cs"/>
+          <w:sz w:val="22"/>
+        </w:rPr>
+        <w:t>çã</w:t>
+      </w:r>
+      <w:r>
+        <w:rPr>
+          <w:sz w:val="22"/>
+        </w:rPr>
+        <w:t>o vs m</w:t>
+      </w:r>
+      <w:r>
+        <w:rPr>
+          <w:rFonts w:hint="cs"/>
+          <w:sz w:val="22"/>
+        </w:rPr>
+        <w:t>ê</w:t>
+      </w:r>
+      <w:r>
+        <w:rPr>
+          <w:sz w:val="22"/>
+        </w:rPr>
+        <w:t>s anterior, estoque livre, PMM, mais de 12 meses e Aging da divis</w:t>
+      </w:r>
+      <w:r>
+        <w:rPr>
+          <w:rFonts w:hint="cs"/>
+          <w:sz w:val="22"/>
+        </w:rPr>
+        <w:t>ã</w:t>
+      </w:r>
+      <w:r>
+        <w:rPr>
+          <w:sz w:val="22"/>
+        </w:rPr>
+        <w:t>o; Cole</w:t>
+      </w:r>
+      <w:r>
+        <w:rPr>
+          <w:rFonts w:hint="cs"/>
+          <w:sz w:val="22"/>
+        </w:rPr>
+        <w:t>çõ</w:t>
+      </w:r>
+      <w:r>
+        <w:rPr>
+          <w:sz w:val="22"/>
+        </w:rPr>
+        <w:t xml:space="preserve">es e seasons </w:t>
+      </w:r>
+      <w:r>
+        <w:rPr>
+          <w:rFonts w:hint="cs"/>
+          <w:sz w:val="22"/>
+        </w:rPr>
+        <w:t>›</w:t>
+      </w:r>
+      <w:r>
+        <w:rPr>
+          <w:sz w:val="22"/>
+        </w:rPr>
+        <w:t xml:space="preserve"> cada season </w:t>
+      </w:r>
+      <w:r>
+        <w:rPr>
+          <w:rFonts w:hint="cs"/>
+          <w:sz w:val="22"/>
+        </w:rPr>
+        <w:t>›</w:t>
+      </w:r>
+      <w:r>
+        <w:rPr>
+          <w:sz w:val="22"/>
+        </w:rPr>
+        <w:t xml:space="preserve"> todos os anos; Evolu</w:t>
+      </w:r>
+      <w:r>
+        <w:rPr>
+          <w:rFonts w:hint="cs"/>
+          <w:sz w:val="22"/>
+        </w:rPr>
+        <w:t>çã</w:t>
+      </w:r>
+      <w:r>
+        <w:rPr>
+          <w:sz w:val="22"/>
+        </w:rPr>
+        <w:t xml:space="preserve">o </w:t>
+      </w:r>
+      <w:r>
+        <w:rPr>
+          <w:rFonts w:hint="cs"/>
+          <w:sz w:val="22"/>
+        </w:rPr>
+        <w:t>›</w:t>
+      </w:r>
+      <w:r>
+        <w:rPr>
+          <w:sz w:val="22"/>
+        </w:rPr>
+        <w:t xml:space="preserve"> Compet</w:t>
+      </w:r>
+      <w:r>
+        <w:rPr>
+          <w:rFonts w:hint="cs"/>
+          <w:sz w:val="22"/>
+        </w:rPr>
+        <w:t>ê</w:t>
+      </w:r>
+      <w:r>
+        <w:rPr>
+          <w:sz w:val="22"/>
+        </w:rPr>
+        <w:t xml:space="preserve">ncias </w:t>
+      </w:r>
+      <w:r>
+        <w:rPr>
+          <w:rFonts w:hint="cs"/>
+          <w:sz w:val="22"/>
+        </w:rPr>
+        <w:t>›</w:t>
+      </w:r>
+      <w:r>
+        <w:rPr>
+          <w:sz w:val="22"/>
+        </w:rPr>
+        <w:t xml:space="preserve"> valor, unidades e PMM de cada compet</w:t>
+      </w:r>
+      <w:r>
+        <w:rPr>
+          <w:rFonts w:hint="cs"/>
+          <w:sz w:val="22"/>
+        </w:rPr>
+        <w:t>ê</w:t>
+      </w:r>
+      <w:r>
+        <w:rPr>
+          <w:sz w:val="22"/>
+        </w:rPr>
+        <w:t>ncia; Valor e giro e Composi</w:t>
+      </w:r>
+      <w:r>
+        <w:rPr>
+          <w:rFonts w:hint="cs"/>
+          <w:sz w:val="22"/>
+        </w:rPr>
+        <w:t>çã</w:t>
+      </w:r>
+      <w:r>
+        <w:rPr>
+          <w:sz w:val="22"/>
+        </w:rPr>
+        <w:t>o do custo com os indicadores e percentuais de cada parte.</w:t>
+      </w:r>
+    </w:p>
+    <w:p>
+      <w:pPr>
+        <w:pStyle w:val="Commarcadores"/>
+        <w:spacing w:after="50" w:line="264" w:lineRule="auto"/>
+        <w:rPr>
+          <w:rFonts w:hint="eastAsia"/>
+        </w:rPr>
+      </w:pPr>
+      <w:r>
+        <w:rPr>
+          <w:sz w:val="22"/>
+        </w:rPr>
+        <w:t>Cores b</w:t>
+      </w:r>
+      <w:r>
+        <w:rPr>
+          <w:rFonts w:hint="cs"/>
+          <w:sz w:val="22"/>
+        </w:rPr>
+        <w:t>á</w:t>
+      </w:r>
+      <w:r>
+        <w:rPr>
+          <w:sz w:val="22"/>
+        </w:rPr>
+        <w:t>sicas por tema, sem rosa nem roxo: ciano (Valor e giro), laranja (Aging), azul (Divis</w:t>
+      </w:r>
+      <w:r>
+        <w:rPr>
+          <w:rFonts w:hint="cs"/>
+          <w:sz w:val="22"/>
+        </w:rPr>
+        <w:t>õ</w:t>
+      </w:r>
+      <w:r>
+        <w:rPr>
+          <w:sz w:val="22"/>
+        </w:rPr>
+        <w:t>es), verde (Onde est</w:t>
+      </w:r>
+      <w:r>
+        <w:rPr>
+          <w:rFonts w:hint="cs"/>
+          <w:sz w:val="22"/>
+        </w:rPr>
+        <w:t>á</w:t>
+      </w:r>
+      <w:r>
+        <w:rPr>
+          <w:sz w:val="22"/>
+        </w:rPr>
+        <w:t xml:space="preserve"> o estoque), amarelo (Cole</w:t>
+      </w:r>
+      <w:r>
+        <w:rPr>
+          <w:rFonts w:hint="cs"/>
+          <w:sz w:val="22"/>
+        </w:rPr>
+        <w:t>çõ</w:t>
+      </w:r>
+      <w:r>
+        <w:rPr>
+          <w:sz w:val="22"/>
+        </w:rPr>
+        <w:t>es e seasons), branco (Evolu</w:t>
+      </w:r>
+      <w:r>
+        <w:rPr>
+          <w:rFonts w:hint="cs"/>
+          <w:sz w:val="22"/>
+        </w:rPr>
+        <w:t>çã</w:t>
+      </w:r>
+      <w:r>
+        <w:rPr>
+          <w:sz w:val="22"/>
+        </w:rPr>
+        <w:t>o) e vermelho (Composi</w:t>
+      </w:r>
+      <w:r>
+        <w:rPr>
+          <w:rFonts w:hint="cs"/>
+          <w:sz w:val="22"/>
+        </w:rPr>
+        <w:t>çã</w:t>
+      </w:r>
+      <w:r>
+        <w:rPr>
+          <w:sz w:val="22"/>
+        </w:rPr>
+        <w:t>o do custo).</w:t>
+      </w:r>
+    </w:p>
+    <w:p>
+      <w:pPr>
+        <w:pStyle w:val="Commarcadores"/>
+        <w:spacing w:after="50" w:line="264" w:lineRule="auto"/>
+        <w:rPr>
+          <w:rFonts w:hint="eastAsia"/>
+        </w:rPr>
+      </w:pPr>
+      <w:r>
+        <w:rPr>
+          <w:sz w:val="22"/>
+        </w:rPr>
+        <w:lastRenderedPageBreak/>
+        <w:t>T</w:t>
+      </w:r>
+      <w:r>
+        <w:rPr>
+          <w:rFonts w:hint="cs"/>
+          <w:sz w:val="22"/>
+        </w:rPr>
+        <w:t>é</w:t>
+      </w:r>
+      <w:r>
+        <w:rPr>
+          <w:sz w:val="22"/>
+        </w:rPr>
+        <w:t xml:space="preserve">cnico: dashboard_summary passou a devolver location_plants (local </w:t>
+      </w:r>
+      <w:r>
+        <w:rPr>
+          <w:rFonts w:hint="eastAsia"/>
+          <w:sz w:val="22"/>
+        </w:rPr>
+        <w:t>→</w:t>
+      </w:r>
+      <w:r>
+        <w:rPr>
+          <w:sz w:val="22"/>
+        </w:rPr>
+        <w:t xml:space="preserve"> centros com linhas, quantidade e valor fiscal, com os mesmos filtros da p</w:t>
+      </w:r>
+      <w:r>
+        <w:rPr>
+          <w:rFonts w:hint="cs"/>
+          <w:sz w:val="22"/>
+        </w:rPr>
+        <w:t>á</w:t>
+      </w:r>
+      <w:r>
+        <w:rPr>
+          <w:sz w:val="22"/>
+        </w:rPr>
+        <w:t>gina); as faixas de aging do mapa v</w:t>
+      </w:r>
+      <w:r>
+        <w:rPr>
+          <w:rFonts w:hint="cs"/>
+          <w:sz w:val="22"/>
+        </w:rPr>
+        <w:t>ê</w:t>
+      </w:r>
+      <w:r>
+        <w:rPr>
+          <w:sz w:val="22"/>
+        </w:rPr>
+        <w:t>m das colunas de lifecycle_aging (todas as faixas).</w:t>
+      </w:r>
+    </w:p>
+    <w:p>
+      <w:pPr>
+        <w:pStyle w:val="Commarcadores"/>
+        <w:spacing w:after="50" w:line="264" w:lineRule="auto"/>
+        <w:rPr>
+          <w:rFonts w:hint="eastAsia"/>
+        </w:rPr>
+      </w:pPr>
+      <w:r>
+        <w:rPr>
+          <w:sz w:val="22"/>
+        </w:rPr>
+        <w:t>Dados: todos os n</w:t>
+      </w:r>
+      <w:r>
+        <w:rPr>
+          <w:rFonts w:hint="cs"/>
+          <w:sz w:val="22"/>
+        </w:rPr>
+        <w:t>ú</w:t>
+      </w:r>
+      <w:r>
+        <w:rPr>
+          <w:sz w:val="22"/>
+        </w:rPr>
+        <w:t>meros v</w:t>
+      </w:r>
+      <w:r>
+        <w:rPr>
+          <w:rFonts w:hint="cs"/>
+          <w:sz w:val="22"/>
+        </w:rPr>
+        <w:t>ê</w:t>
+      </w:r>
+      <w:r>
+        <w:rPr>
+          <w:sz w:val="22"/>
+        </w:rPr>
+        <w:t>m do resumo j</w:t>
+      </w:r>
+      <w:r>
+        <w:rPr>
+          <w:rFonts w:hint="cs"/>
+          <w:sz w:val="22"/>
+        </w:rPr>
+        <w:t>á</w:t>
+      </w:r>
+      <w:r>
+        <w:rPr>
+          <w:sz w:val="22"/>
+        </w:rPr>
+        <w:t xml:space="preserve"> carregado na p</w:t>
+      </w:r>
+      <w:r>
+        <w:rPr>
+          <w:rFonts w:hint="cs"/>
+          <w:sz w:val="22"/>
+        </w:rPr>
+        <w:t>á</w:t>
+      </w:r>
+      <w:r>
+        <w:rPr>
+          <w:sz w:val="22"/>
+        </w:rPr>
+        <w:t>gina (dashboard_summary), com a mesma compet</w:t>
+      </w:r>
+      <w:r>
+        <w:rPr>
+          <w:rFonts w:hint="cs"/>
+          <w:sz w:val="22"/>
+        </w:rPr>
+        <w:t>ê</w:t>
+      </w:r>
+      <w:r>
+        <w:rPr>
+          <w:sz w:val="22"/>
+        </w:rPr>
+        <w:t>ncia e os mesmos filtros; o risco por divis</w:t>
+      </w:r>
+      <w:r>
+        <w:rPr>
+          <w:rFonts w:hint="cs"/>
+          <w:sz w:val="22"/>
+        </w:rPr>
+        <w:t>ã</w:t>
+      </w:r>
+      <w:r>
+        <w:rPr>
+          <w:sz w:val="22"/>
+        </w:rPr>
+        <w:t>o usa as faixas 5) a 8) de Aging sobre o estoque j</w:t>
+      </w:r>
+      <w:r>
+        <w:rPr>
+          <w:rFonts w:hint="cs"/>
+          <w:sz w:val="22"/>
+        </w:rPr>
+        <w:t>á</w:t>
+      </w:r>
+      <w:r>
+        <w:rPr>
+          <w:sz w:val="22"/>
+        </w:rPr>
+        <w:t xml:space="preserve"> recebido (sem Futures). Nenhum texto </w:t>
+      </w:r>
+      <w:r>
+        <w:rPr>
+          <w:rFonts w:hint="cs"/>
+          <w:sz w:val="22"/>
+        </w:rPr>
+        <w:t>é</w:t>
+      </w:r>
+      <w:r>
+        <w:rPr>
+          <w:sz w:val="22"/>
+        </w:rPr>
+        <w:t xml:space="preserve"> gerado fora desses dados e nenhuma chamada nova </w:t>
+      </w:r>
+      <w:r>
+        <w:rPr>
+          <w:rFonts w:hint="cs"/>
+          <w:sz w:val="22"/>
+        </w:rPr>
+        <w:t>é</w:t>
+      </w:r>
+      <w:r>
+        <w:rPr>
+          <w:sz w:val="22"/>
+        </w:rPr>
+        <w:t xml:space="preserve"> feita ao servidor.</w:t>
+      </w:r>
+    </w:p>
+    <w:p>
+      <w:pPr>
+        <w:pStyle w:val="Commarcadores"/>
+        <w:spacing w:after="50" w:line="264" w:lineRule="auto"/>
+        <w:rPr>
+          <w:rFonts w:hint="eastAsia"/>
+        </w:rPr>
+      </w:pPr>
+      <w:r>
+        <w:rPr>
+          <w:sz w:val="22"/>
+        </w:rPr>
+        <w:t>T</w:t>
+      </w:r>
+      <w:r>
+        <w:rPr>
+          <w:rFonts w:hint="cs"/>
+          <w:sz w:val="22"/>
+        </w:rPr>
+        <w:t>é</w:t>
+      </w:r>
+      <w:r>
+        <w:rPr>
+          <w:sz w:val="22"/>
+        </w:rPr>
+        <w:t>cnico: componente OpsMindMap (open, close, buildTree) em script pr</w:t>
+      </w:r>
+      <w:r>
+        <w:rPr>
+          <w:rFonts w:hint="cs"/>
+          <w:sz w:val="22"/>
+        </w:rPr>
+        <w:t>ó</w:t>
+      </w:r>
+      <w:r>
+        <w:rPr>
+          <w:sz w:val="22"/>
+        </w:rPr>
+        <w:t xml:space="preserve">prio no fim do dashboard.html, estilos com prefixo mm-; </w:t>
+      </w:r>
+      <w:r>
+        <w:rPr>
+          <w:rFonts w:hint="cs"/>
+          <w:sz w:val="22"/>
+        </w:rPr>
+        <w:t>á</w:t>
+      </w:r>
+      <w:r>
+        <w:rPr>
+          <w:sz w:val="22"/>
+        </w:rPr>
+        <w:t>rvore horizontal com posi</w:t>
+      </w:r>
+      <w:r>
+        <w:rPr>
+          <w:rFonts w:hint="cs"/>
+          <w:sz w:val="22"/>
+        </w:rPr>
+        <w:t>çõ</w:t>
+      </w:r>
+      <w:r>
+        <w:rPr>
+          <w:sz w:val="22"/>
+        </w:rPr>
+        <w:t>es animadas por requestAnimationFrame, liga</w:t>
+      </w:r>
+      <w:r>
+        <w:rPr>
+          <w:rFonts w:hint="cs"/>
+          <w:sz w:val="22"/>
+        </w:rPr>
+        <w:t>çõ</w:t>
+      </w:r>
+      <w:r>
+        <w:rPr>
+          <w:sz w:val="22"/>
+        </w:rPr>
+        <w:t>es SVG em B</w:t>
+      </w:r>
+      <w:r>
+        <w:rPr>
+          <w:rFonts w:hint="cs"/>
+          <w:sz w:val="22"/>
+        </w:rPr>
+        <w:t>é</w:t>
+      </w:r>
+      <w:r>
+        <w:rPr>
+          <w:sz w:val="22"/>
+        </w:rPr>
+        <w:t>zier com brilho e fa</w:t>
+      </w:r>
+      <w:r>
+        <w:rPr>
+          <w:rFonts w:hint="cs"/>
+          <w:sz w:val="22"/>
+        </w:rPr>
+        <w:t>í</w:t>
+      </w:r>
+      <w:r>
+        <w:rPr>
+          <w:sz w:val="22"/>
+        </w:rPr>
+        <w:t>scas (animateMotion), part</w:t>
+      </w:r>
+      <w:r>
+        <w:rPr>
+          <w:rFonts w:hint="cs"/>
+          <w:sz w:val="22"/>
+        </w:rPr>
+        <w:t>í</w:t>
+      </w:r>
+      <w:r>
+        <w:rPr>
+          <w:sz w:val="22"/>
+        </w:rPr>
+        <w:t>culas em canvas, enquadramento autom</w:t>
+      </w:r>
+      <w:r>
+        <w:rPr>
+          <w:rFonts w:hint="cs"/>
+          <w:sz w:val="22"/>
+        </w:rPr>
+        <w:t>á</w:t>
+      </w:r>
+      <w:r>
+        <w:rPr>
+          <w:sz w:val="22"/>
+        </w:rPr>
+        <w:t>tico com zoom m</w:t>
+      </w:r>
+      <w:r>
+        <w:rPr>
+          <w:rFonts w:hint="cs"/>
+          <w:sz w:val="22"/>
+        </w:rPr>
+        <w:t>í</w:t>
+      </w:r>
+      <w:r>
+        <w:rPr>
+          <w:sz w:val="22"/>
+        </w:rPr>
+        <w:t>nimo leg</w:t>
+      </w:r>
+      <w:r>
+        <w:rPr>
+          <w:rFonts w:hint="cs"/>
+          <w:sz w:val="22"/>
+        </w:rPr>
+        <w:t>í</w:t>
+      </w:r>
+      <w:r>
+        <w:rPr>
+          <w:sz w:val="22"/>
+        </w:rPr>
+        <w:t>vel focando o ramo clicado e prefers-reduced-motion respeitado. Teste: tests/test_mindmap_page.py.</w:t>
+      </w:r>
+    </w:p>
+    <w:p>
+      <w:pPr>
+        <w:pStyle w:val="Commarcadores"/>
+        <w:spacing w:after="50" w:line="264" w:lineRule="auto"/>
+        <w:rPr>
+          <w:rFonts w:hint="eastAsia"/>
+        </w:rPr>
+      </w:pPr>
+      <w:r>
+        <w:rPr>
+          <w:sz w:val="22"/>
+        </w:rPr>
+        <w:t>Relat</w:t>
+      </w:r>
+      <w:r>
+        <w:rPr>
+          <w:rFonts w:hint="cs"/>
+          <w:sz w:val="22"/>
+        </w:rPr>
+        <w:t>ó</w:t>
+      </w:r>
+      <w:r>
+        <w:rPr>
+          <w:sz w:val="22"/>
+        </w:rPr>
+        <w:t>rios: o bot</w:t>
+      </w:r>
+      <w:r>
+        <w:rPr>
+          <w:rFonts w:hint="cs"/>
+          <w:sz w:val="22"/>
+        </w:rPr>
+        <w:t>ã</w:t>
+      </w:r>
+      <w:r>
+        <w:rPr>
+          <w:sz w:val="22"/>
+        </w:rPr>
+        <w:t>o e o pop-up n</w:t>
+      </w:r>
+      <w:r>
+        <w:rPr>
+          <w:rFonts w:hint="cs"/>
+          <w:sz w:val="22"/>
+        </w:rPr>
+        <w:t>ã</w:t>
+      </w:r>
+      <w:r>
+        <w:rPr>
+          <w:sz w:val="22"/>
+        </w:rPr>
+        <w:t>o aparecem no HTML do Share Link nem no PDF (body.report-mode e body.report-doc).</w:t>
+      </w:r>
+    </w:p>
+    <w:p>
+      <w:pPr>
         <w:pStyle w:val="Ttulo1"/>
         <w:spacing w:line="252" w:lineRule="auto"/>
       </w:pPr>
@@ -9060,6 +11048,337 @@
     </w:p>
     <w:p>
       <w:pPr>
+        <w:pStyle w:val="Ttulo2"/>
+        <w:spacing w:line="252" w:lineRule="auto"/>
+      </w:pPr>
+      <w:r>
+        <w:rPr>
+          <w:rFonts w:ascii="Aptos" w:hAnsi="Aptos" w:hint="eastAsia"/>
+        </w:rPr>
+        <w:t>11.1 Soma das colunas de quantidade e valor</w:t>
+      </w:r>
+    </w:p>
+    <w:p>
+      <w:pPr>
+        <w:pStyle w:val="Commarcadores"/>
+        <w:spacing w:after="50" w:line="264" w:lineRule="auto"/>
+        <w:rPr>
+          <w:rFonts w:hint="eastAsia"/>
+        </w:rPr>
+      </w:pPr>
+      <w:r>
+        <w:rPr>
+          <w:sz w:val="22"/>
+        </w:rPr>
+        <w:t>Uma linha de soma fica entre a faixa de grupos e os nomes das colunas, fixa ao rolar. Somam: Utiliza</w:t>
+      </w:r>
+      <w:r>
+        <w:rPr>
+          <w:rFonts w:hint="cs"/>
+          <w:sz w:val="22"/>
+        </w:rPr>
+        <w:t>çã</w:t>
+      </w:r>
+      <w:r>
+        <w:rPr>
+          <w:sz w:val="22"/>
+        </w:rPr>
+        <w:t>o livre e Bloqueado (quantidades) e Total, Vlr ICMS ST, Vlr IPI, Vlr Tot Emp, Vlr Tot Fisc, Vlr Total CC, FOB, II e Outros Custos (valores). Custos unit</w:t>
+      </w:r>
+      <w:r>
+        <w:rPr>
+          <w:rFonts w:hint="cs"/>
+          <w:sz w:val="22"/>
+        </w:rPr>
+        <w:t>á</w:t>
+      </w:r>
+      <w:r>
+        <w:rPr>
+          <w:sz w:val="22"/>
+        </w:rPr>
+        <w:t>rios, Days e Year n</w:t>
+      </w:r>
+      <w:r>
+        <w:rPr>
+          <w:rFonts w:hint="cs"/>
+          <w:sz w:val="22"/>
+        </w:rPr>
+        <w:t>ã</w:t>
+      </w:r>
+      <w:r>
+        <w:rPr>
+          <w:sz w:val="22"/>
+        </w:rPr>
+        <w:t>o s</w:t>
+      </w:r>
+      <w:r>
+        <w:rPr>
+          <w:rFonts w:hint="cs"/>
+          <w:sz w:val="22"/>
+        </w:rPr>
+        <w:t>ã</w:t>
+      </w:r>
+      <w:r>
+        <w:rPr>
+          <w:sz w:val="22"/>
+        </w:rPr>
+        <w:t>o somados.</w:t>
+      </w:r>
+    </w:p>
+    <w:p>
+      <w:pPr>
+        <w:pStyle w:val="Commarcadores"/>
+        <w:spacing w:after="50" w:line="264" w:lineRule="auto"/>
+        <w:rPr>
+          <w:rFonts w:hint="eastAsia"/>
+        </w:rPr>
+      </w:pPr>
+      <w:r>
+        <w:rPr>
+          <w:sz w:val="22"/>
+        </w:rPr>
+        <w:t xml:space="preserve">A soma cobre todas as linhas que atendem </w:t>
+      </w:r>
+      <w:r>
+        <w:rPr>
+          <w:rFonts w:hint="cs"/>
+          <w:sz w:val="22"/>
+        </w:rPr>
+        <w:t>à</w:t>
+      </w:r>
+      <w:r>
+        <w:rPr>
+          <w:sz w:val="22"/>
+        </w:rPr>
+        <w:t xml:space="preserve"> busca, aos filtros de coluna e a "Somente pend</w:t>
+      </w:r>
+      <w:r>
+        <w:rPr>
+          <w:rFonts w:hint="cs"/>
+          <w:sz w:val="22"/>
+        </w:rPr>
+        <w:t>ê</w:t>
+      </w:r>
+      <w:r>
+        <w:rPr>
+          <w:sz w:val="22"/>
+        </w:rPr>
+        <w:t xml:space="preserve">ncias de joins" </w:t>
+      </w:r>
+      <w:r>
+        <w:rPr>
+          <w:rFonts w:hint="cs"/>
+          <w:sz w:val="22"/>
+        </w:rPr>
+        <w:t>—</w:t>
+      </w:r>
+      <w:r>
+        <w:rPr>
+          <w:sz w:val="22"/>
+        </w:rPr>
+        <w:t xml:space="preserve"> n</w:t>
+      </w:r>
+      <w:r>
+        <w:rPr>
+          <w:rFonts w:hint="cs"/>
+          <w:sz w:val="22"/>
+        </w:rPr>
+        <w:t>ã</w:t>
+      </w:r>
+      <w:r>
+        <w:rPr>
+          <w:sz w:val="22"/>
+        </w:rPr>
+        <w:t>o s</w:t>
+      </w:r>
+      <w:r>
+        <w:rPr>
+          <w:rFonts w:hint="cs"/>
+          <w:sz w:val="22"/>
+        </w:rPr>
+        <w:t>ó</w:t>
+      </w:r>
+      <w:r>
+        <w:rPr>
+          <w:sz w:val="22"/>
+        </w:rPr>
+        <w:t xml:space="preserve"> a p</w:t>
+      </w:r>
+      <w:r>
+        <w:rPr>
+          <w:rFonts w:hint="cs"/>
+          <w:sz w:val="22"/>
+        </w:rPr>
+        <w:t>á</w:t>
+      </w:r>
+      <w:r>
+        <w:rPr>
+          <w:sz w:val="22"/>
+        </w:rPr>
+        <w:t>gina exibida. Sem filtro, o r</w:t>
+      </w:r>
+      <w:r>
+        <w:rPr>
+          <w:rFonts w:hint="cs"/>
+          <w:sz w:val="22"/>
+        </w:rPr>
+        <w:t>ó</w:t>
+      </w:r>
+      <w:r>
+        <w:rPr>
+          <w:sz w:val="22"/>
+        </w:rPr>
+        <w:t xml:space="preserve">tulo </w:t>
+      </w:r>
+      <w:r>
+        <w:rPr>
+          <w:rFonts w:hint="cs"/>
+          <w:sz w:val="22"/>
+        </w:rPr>
+        <w:t>é</w:t>
+      </w:r>
+      <w:r>
+        <w:rPr>
+          <w:sz w:val="22"/>
+        </w:rPr>
+        <w:t xml:space="preserve"> </w:t>
+      </w:r>
+      <w:r>
+        <w:rPr>
+          <w:rFonts w:hint="eastAsia"/>
+          <w:sz w:val="22"/>
+        </w:rPr>
+        <w:t>Σ</w:t>
+      </w:r>
+      <w:r>
+        <w:rPr>
+          <w:sz w:val="22"/>
+        </w:rPr>
+        <w:t xml:space="preserve"> TOTAL; com filtro, </w:t>
+      </w:r>
+      <w:r>
+        <w:rPr>
+          <w:rFonts w:hint="eastAsia"/>
+          <w:sz w:val="22"/>
+        </w:rPr>
+        <w:t>Σ</w:t>
+      </w:r>
+      <w:r>
+        <w:rPr>
+          <w:sz w:val="22"/>
+        </w:rPr>
+        <w:t xml:space="preserve"> FILTRO e destaque amarelo. O bal</w:t>
+      </w:r>
+      <w:r>
+        <w:rPr>
+          <w:rFonts w:hint="cs"/>
+          <w:sz w:val="22"/>
+        </w:rPr>
+        <w:t>ã</w:t>
+      </w:r>
+      <w:r>
+        <w:rPr>
+          <w:sz w:val="22"/>
+        </w:rPr>
+        <w:t>o de cada c</w:t>
+      </w:r>
+      <w:r>
+        <w:rPr>
+          <w:rFonts w:hint="cs"/>
+          <w:sz w:val="22"/>
+        </w:rPr>
+        <w:t>é</w:t>
+      </w:r>
+      <w:r>
+        <w:rPr>
+          <w:sz w:val="22"/>
+        </w:rPr>
+        <w:t>lula informa quantas linhas for</w:t>
+      </w:r>
+      <w:r>
+        <w:rPr>
+          <w:rFonts w:hint="eastAsia"/>
+          <w:sz w:val="22"/>
+        </w:rPr>
+        <w:t>am somadas.</w:t>
+      </w:r>
+    </w:p>
+    <w:p>
+      <w:pPr>
+        <w:pStyle w:val="Commarcadores"/>
+        <w:spacing w:after="50" w:line="264" w:lineRule="auto"/>
+        <w:rPr>
+          <w:rFonts w:hint="eastAsia"/>
+        </w:rPr>
+      </w:pPr>
+      <w:r>
+        <w:rPr>
+          <w:sz w:val="22"/>
+        </w:rPr>
+        <w:t>T</w:t>
+      </w:r>
+      <w:r>
+        <w:rPr>
+          <w:rFonts w:hint="cs"/>
+          <w:sz w:val="22"/>
+        </w:rPr>
+        <w:t>é</w:t>
+      </w:r>
+      <w:r>
+        <w:rPr>
+          <w:sz w:val="22"/>
+        </w:rPr>
+        <w:t>cnico: inventory.SUM_COLUMNS; list_inventory calcula count e as somas na mesma consulta agregada e devolve totals; /api/inventory/columns marca sum=true nessas colunas. As posi</w:t>
+      </w:r>
+      <w:r>
+        <w:rPr>
+          <w:rFonts w:hint="cs"/>
+          <w:sz w:val="22"/>
+        </w:rPr>
+        <w:t>çõ</w:t>
+      </w:r>
+      <w:r>
+        <w:rPr>
+          <w:sz w:val="22"/>
+        </w:rPr>
+        <w:t>es fixas do cabe</w:t>
+      </w:r>
+      <w:r>
+        <w:rPr>
+          <w:rFonts w:hint="cs"/>
+          <w:sz w:val="22"/>
+        </w:rPr>
+        <w:t>ç</w:t>
+      </w:r>
+      <w:r>
+        <w:rPr>
+          <w:sz w:val="22"/>
+        </w:rPr>
+        <w:t>alho s</w:t>
+      </w:r>
+      <w:r>
+        <w:rPr>
+          <w:rFonts w:hint="cs"/>
+          <w:sz w:val="22"/>
+        </w:rPr>
+        <w:t>ã</w:t>
+      </w:r>
+      <w:r>
+        <w:rPr>
+          <w:sz w:val="22"/>
+        </w:rPr>
+        <w:t>o medidas pela altura real de cada linha (fitInvent</w:t>
+      </w:r>
+      <w:r>
+        <w:rPr>
+          <w:rFonts w:hint="eastAsia"/>
+          <w:sz w:val="22"/>
+        </w:rPr>
+        <w:t>oryStickyRows, recalculado com ResizeObserver).</w:t>
+      </w:r>
+    </w:p>
+    <w:p>
+      <w:pPr>
         <w:pStyle w:val="Ttulo1"/>
         <w:spacing w:line="252" w:lineRule="auto"/>
       </w:pPr>
@@ -9067,6 +11386,7 @@
         <w:rPr>
           <w:rFonts w:ascii="Aptos" w:hAnsi="Aptos"/>
         </w:rPr>
+        <w:lastRenderedPageBreak/>
         <w:t>12. Extrações SAP</w:t>
       </w:r>
     </w:p>
@@ -9819,7 +12139,6 @@
         <w:rPr>
           <w:rFonts w:ascii="Aptos" w:hAnsi="Aptos"/>
         </w:rPr>
-        <w:lastRenderedPageBreak/>
         <w:t>12.3 Automação de exportação</w:t>
       </w:r>
     </w:p>
@@ -9936,6 +12255,7 @@
         <w:rPr>
           <w:rFonts w:ascii="Aptos" w:hAnsi="Aptos"/>
         </w:rPr>
+        <w:lastRenderedPageBreak/>
         <w:t>13. Bases All Brazil</w:t>
       </w:r>
     </w:p>
@@ -9947,6 +12267,490 @@
       </w:pPr>
       <w:r>
         <w:t>A página organiza por ano e mês a biblioteca do cadastro mestre All Brazil sincronizada na máquina. Atualizar pastas relê a estrutura disponível.</w:t>
+      </w:r>
+    </w:p>
+    <w:p>
+      <w:pPr>
+        <w:pStyle w:val="Ttulo2"/>
+        <w:spacing w:line="252" w:lineRule="auto"/>
+      </w:pPr>
+      <w:r>
+        <w:rPr>
+          <w:rFonts w:ascii="Aptos" w:hAnsi="Aptos" w:hint="eastAsia"/>
+        </w:rPr>
+        <w:t>13.1 Catálogo dinâmico das pastas do Drive</w:t>
+      </w:r>
+    </w:p>
+    <w:p>
+      <w:pPr>
+        <w:pStyle w:val="Commarcadores"/>
+        <w:spacing w:after="50" w:line="264" w:lineRule="auto"/>
+        <w:rPr>
+          <w:rFonts w:hint="eastAsia"/>
+        </w:rPr>
+      </w:pPr>
+      <w:r>
+        <w:rPr>
+          <w:sz w:val="22"/>
+        </w:rPr>
+        <w:t>Origem dos meses: GET /api/sources/all-brazil/catalog chama sources.all_brazil.discover_all_brazil_months(raiz), que l</w:t>
+      </w:r>
+      <w:r>
+        <w:rPr>
+          <w:rFonts w:hint="cs"/>
+          <w:sz w:val="22"/>
+        </w:rPr>
+        <w:t>ê</w:t>
+      </w:r>
+      <w:r>
+        <w:rPr>
+          <w:sz w:val="22"/>
+        </w:rPr>
+        <w:t xml:space="preserve"> as pastas reais de @All Brazil Materials </w:t>
+      </w:r>
+      <w:r>
+        <w:rPr>
+          <w:rFonts w:hint="cs"/>
+          <w:sz w:val="22"/>
+        </w:rPr>
+        <w:t>—</w:t>
+      </w:r>
+      <w:r>
+        <w:rPr>
+          <w:sz w:val="22"/>
+        </w:rPr>
+        <w:t xml:space="preserve"> anos com 4 d</w:t>
+      </w:r>
+      <w:r>
+        <w:rPr>
+          <w:rFonts w:hint="cs"/>
+          <w:sz w:val="22"/>
+        </w:rPr>
+        <w:t>í</w:t>
+      </w:r>
+      <w:r>
+        <w:rPr>
+          <w:sz w:val="22"/>
+        </w:rPr>
+        <w:t>gitos (AAAA) e meses no padr</w:t>
+      </w:r>
+      <w:r>
+        <w:rPr>
+          <w:rFonts w:hint="cs"/>
+          <w:sz w:val="22"/>
+        </w:rPr>
+        <w:t>ã</w:t>
+      </w:r>
+      <w:r>
+        <w:rPr>
+          <w:sz w:val="22"/>
+        </w:rPr>
+        <w:t>o "MM. M</w:t>
+      </w:r>
+      <w:r>
+        <w:rPr>
+          <w:rFonts w:hint="cs"/>
+          <w:sz w:val="22"/>
+        </w:rPr>
+        <w:t>ê</w:t>
+      </w:r>
+      <w:r>
+        <w:rPr>
+          <w:sz w:val="22"/>
+        </w:rPr>
+        <w:t>s" (MM de 01 a 12). Pastas fora do padr</w:t>
+      </w:r>
+      <w:r>
+        <w:rPr>
+          <w:rFonts w:hint="cs"/>
+          <w:sz w:val="22"/>
+        </w:rPr>
+        <w:t>ã</w:t>
+      </w:r>
+      <w:r>
+        <w:rPr>
+          <w:sz w:val="22"/>
+        </w:rPr>
+        <w:t>o s</w:t>
+      </w:r>
+      <w:r>
+        <w:rPr>
+          <w:rFonts w:hint="cs"/>
+          <w:sz w:val="22"/>
+        </w:rPr>
+        <w:t>ã</w:t>
+      </w:r>
+      <w:r>
+        <w:rPr>
+          <w:sz w:val="22"/>
+        </w:rPr>
+        <w:t>o ignoradas. Um m</w:t>
+      </w:r>
+      <w:r>
+        <w:rPr>
+          <w:rFonts w:hint="cs"/>
+          <w:sz w:val="22"/>
+        </w:rPr>
+        <w:t>ê</w:t>
+      </w:r>
+      <w:r>
+        <w:rPr>
+          <w:sz w:val="22"/>
+        </w:rPr>
+        <w:t>s novo criado no Drive (ex.: 10. Outubro) aparece sozinho, sem cadastro.</w:t>
+      </w:r>
+    </w:p>
+    <w:p>
+      <w:pPr>
+        <w:pStyle w:val="Commarcadores"/>
+        <w:spacing w:after="50" w:line="264" w:lineRule="auto"/>
+        <w:rPr>
+          <w:rFonts w:hint="eastAsia"/>
+        </w:rPr>
+      </w:pPr>
+      <w:r>
+        <w:rPr>
+          <w:sz w:val="22"/>
+        </w:rPr>
+        <w:t>Arquivos do m</w:t>
+      </w:r>
+      <w:r>
+        <w:rPr>
+          <w:rFonts w:hint="cs"/>
+          <w:sz w:val="22"/>
+        </w:rPr>
+        <w:t>ê</w:t>
+      </w:r>
+      <w:r>
+        <w:rPr>
+          <w:sz w:val="22"/>
+        </w:rPr>
+        <w:t>s: somente os que seguem ALL_BRAZIL_DD_MM (.xlsx ou .xlsb), do mais recente para o mais antigo; a p</w:t>
+      </w:r>
+      <w:r>
+        <w:rPr>
+          <w:rFonts w:hint="cs"/>
+          <w:sz w:val="22"/>
+        </w:rPr>
+        <w:t>á</w:t>
+      </w:r>
+      <w:r>
+        <w:rPr>
+          <w:sz w:val="22"/>
+        </w:rPr>
+        <w:t>gina mostra os 5 primeiros e informa quantos restam.</w:t>
+      </w:r>
+    </w:p>
+    <w:p>
+      <w:pPr>
+        <w:pStyle w:val="Commarcadores"/>
+        <w:spacing w:after="50" w:line="264" w:lineRule="auto"/>
+        <w:rPr>
+          <w:rFonts w:hint="eastAsia"/>
+        </w:rPr>
+      </w:pPr>
+      <w:r>
+        <w:rPr>
+          <w:sz w:val="22"/>
+        </w:rPr>
+        <w:t>Links "Abrir no Drive": config/all_brazil_drive_folders.json deixou de definir quais meses existem; apenas fornece o endere</w:t>
+      </w:r>
+      <w:r>
+        <w:rPr>
+          <w:rFonts w:hint="cs"/>
+          <w:sz w:val="22"/>
+        </w:rPr>
+        <w:t>ç</w:t>
+      </w:r>
+      <w:r>
+        <w:rPr>
+          <w:sz w:val="22"/>
+        </w:rPr>
+        <w:t>o da pasta dos meses j</w:t>
+      </w:r>
+      <w:r>
+        <w:rPr>
+          <w:rFonts w:hint="cs"/>
+          <w:sz w:val="22"/>
+        </w:rPr>
+        <w:t>á</w:t>
+      </w:r>
+      <w:r>
+        <w:rPr>
+          <w:sz w:val="22"/>
+        </w:rPr>
+        <w:t xml:space="preserve"> conhecidos. M</w:t>
+      </w:r>
+      <w:r>
+        <w:rPr>
+          <w:rFonts w:hint="cs"/>
+          <w:sz w:val="22"/>
+        </w:rPr>
+        <w:t>ê</w:t>
+      </w:r>
+      <w:r>
+        <w:rPr>
+          <w:sz w:val="22"/>
+        </w:rPr>
+        <w:t>s novo abre a pasta principal (root_url). Se o Drive n</w:t>
+      </w:r>
+      <w:r>
+        <w:rPr>
+          <w:rFonts w:hint="cs"/>
+          <w:sz w:val="22"/>
+        </w:rPr>
+        <w:t>ã</w:t>
+      </w:r>
+      <w:r>
+        <w:rPr>
+          <w:sz w:val="22"/>
+        </w:rPr>
+        <w:t>o estiver acess</w:t>
+      </w:r>
+      <w:r>
+        <w:rPr>
+          <w:rFonts w:hint="cs"/>
+          <w:sz w:val="22"/>
+        </w:rPr>
+        <w:t>í</w:t>
+      </w:r>
+      <w:r>
+        <w:rPr>
+          <w:sz w:val="22"/>
+        </w:rPr>
+        <w:t>vel nesta m</w:t>
+      </w:r>
+      <w:r>
+        <w:rPr>
+          <w:rFonts w:hint="cs"/>
+          <w:sz w:val="22"/>
+        </w:rPr>
+        <w:t>á</w:t>
+      </w:r>
+      <w:r>
+        <w:rPr>
+          <w:sz w:val="22"/>
+        </w:rPr>
+        <w:t xml:space="preserve">quina, os </w:t>
+      </w:r>
+      <w:r>
+        <w:rPr>
+          <w:rFonts w:hint="eastAsia"/>
+          <w:sz w:val="22"/>
+        </w:rPr>
+        <w:t>meses conhecidos continuam listados, sem arquivos.</w:t>
+      </w:r>
+    </w:p>
+    <w:p>
+      <w:pPr>
+        <w:pStyle w:val="Commarcadores"/>
+        <w:spacing w:after="50" w:line="264" w:lineRule="auto"/>
+        <w:rPr>
+          <w:rFonts w:hint="eastAsia"/>
+        </w:rPr>
+      </w:pPr>
+      <w:r>
+        <w:rPr>
+          <w:sz w:val="22"/>
+        </w:rPr>
+        <w:t>Independente da compet</w:t>
+      </w:r>
+      <w:r>
+        <w:rPr>
+          <w:rFonts w:hint="cs"/>
+          <w:sz w:val="22"/>
+        </w:rPr>
+        <w:t>ê</w:t>
+      </w:r>
+      <w:r>
+        <w:rPr>
+          <w:sz w:val="22"/>
+        </w:rPr>
+        <w:t>ncia: a biblioteca mostra o Drive; a compet</w:t>
+      </w:r>
+      <w:r>
+        <w:rPr>
+          <w:rFonts w:hint="cs"/>
+          <w:sz w:val="22"/>
+        </w:rPr>
+        <w:t>ê</w:t>
+      </w:r>
+      <w:r>
+        <w:rPr>
+          <w:sz w:val="22"/>
+        </w:rPr>
+        <w:t>ncia s</w:t>
+      </w:r>
+      <w:r>
+        <w:rPr>
+          <w:rFonts w:hint="cs"/>
+          <w:sz w:val="22"/>
+        </w:rPr>
+        <w:t>ó</w:t>
+      </w:r>
+      <w:r>
+        <w:rPr>
+          <w:sz w:val="22"/>
+        </w:rPr>
+        <w:t xml:space="preserve"> aparece em Vis</w:t>
+      </w:r>
+      <w:r>
+        <w:rPr>
+          <w:rFonts w:hint="cs"/>
+          <w:sz w:val="22"/>
+        </w:rPr>
+        <w:t>ã</w:t>
+      </w:r>
+      <w:r>
+        <w:rPr>
+          <w:sz w:val="22"/>
+        </w:rPr>
+        <w:t>o e relat</w:t>
+      </w:r>
+      <w:r>
+        <w:rPr>
+          <w:rFonts w:hint="cs"/>
+          <w:sz w:val="22"/>
+        </w:rPr>
+        <w:t>ó</w:t>
+      </w:r>
+      <w:r>
+        <w:rPr>
+          <w:sz w:val="22"/>
+        </w:rPr>
+        <w:t>rios depois da extra</w:t>
+      </w:r>
+      <w:r>
+        <w:rPr>
+          <w:rFonts w:hint="cs"/>
+          <w:sz w:val="22"/>
+        </w:rPr>
+        <w:t>çã</w:t>
+      </w:r>
+      <w:r>
+        <w:rPr>
+          <w:sz w:val="22"/>
+        </w:rPr>
+        <w:t>o ZMM119/MB59 do m</w:t>
+      </w:r>
+      <w:r>
+        <w:rPr>
+          <w:rFonts w:hint="cs"/>
+          <w:sz w:val="22"/>
+        </w:rPr>
+        <w:t>ê</w:t>
+      </w:r>
+      <w:r>
+        <w:rPr>
+          <w:sz w:val="22"/>
+        </w:rPr>
+        <w:t>s, e o enriquecimento usa o snapshot mais recente do m</w:t>
+      </w:r>
+      <w:r>
+        <w:rPr>
+          <w:rFonts w:hint="cs"/>
+          <w:sz w:val="22"/>
+        </w:rPr>
+        <w:t>ê</w:t>
+      </w:r>
+      <w:r>
+        <w:rPr>
+          <w:sz w:val="22"/>
+        </w:rPr>
+        <w:t>s at</w:t>
+      </w:r>
+      <w:r>
+        <w:rPr>
+          <w:rFonts w:hint="cs"/>
+          <w:sz w:val="22"/>
+        </w:rPr>
+        <w:t>é</w:t>
+      </w:r>
+      <w:r>
+        <w:rPr>
+          <w:sz w:val="22"/>
+        </w:rPr>
+        <w:t xml:space="preserve"> a data-base (resolve_all_brazil).</w:t>
+      </w:r>
+    </w:p>
+    <w:p>
+      <w:pPr>
+        <w:pStyle w:val="Commarcadores"/>
+        <w:spacing w:after="50" w:line="264" w:lineRule="auto"/>
+        <w:rPr>
+          <w:rFonts w:hint="eastAsia"/>
+        </w:rPr>
+      </w:pPr>
+      <w:r>
+        <w:rPr>
+          <w:sz w:val="22"/>
+        </w:rPr>
+        <w:t>Teste: tests/test_all_brazil_catalog.py (m</w:t>
+      </w:r>
+      <w:r>
+        <w:rPr>
+          <w:rFonts w:hint="cs"/>
+          <w:sz w:val="22"/>
+        </w:rPr>
+        <w:t>ê</w:t>
+      </w:r>
+      <w:r>
+        <w:rPr>
+          <w:sz w:val="22"/>
+        </w:rPr>
+        <w:t>s novo aparece, m</w:t>
+      </w:r>
+      <w:r>
+        <w:rPr>
+          <w:rFonts w:hint="cs"/>
+          <w:sz w:val="22"/>
+        </w:rPr>
+        <w:t>ê</w:t>
+      </w:r>
+      <w:r>
+        <w:rPr>
+          <w:sz w:val="22"/>
+        </w:rPr>
+        <w:t>s conhecido mant</w:t>
+      </w:r>
+      <w:r>
+        <w:rPr>
+          <w:rFonts w:hint="cs"/>
+          <w:sz w:val="22"/>
+        </w:rPr>
+        <w:t>é</w:t>
+      </w:r>
+      <w:r>
+        <w:rPr>
+          <w:sz w:val="22"/>
+        </w:rPr>
+        <w:t>m o link pr</w:t>
+      </w:r>
+      <w:r>
+        <w:rPr>
+          <w:rFonts w:hint="cs"/>
+          <w:sz w:val="22"/>
+        </w:rPr>
+        <w:t>ó</w:t>
+      </w:r>
+      <w:r>
+        <w:rPr>
+          <w:sz w:val="22"/>
+        </w:rPr>
+        <w:t>prio, pastas fora do padr</w:t>
+      </w:r>
+      <w:r>
+        <w:rPr>
+          <w:rFonts w:hint="cs"/>
+          <w:sz w:val="22"/>
+        </w:rPr>
+        <w:t>ã</w:t>
+      </w:r>
+      <w:r>
+        <w:rPr>
+          <w:sz w:val="22"/>
+        </w:rPr>
+        <w:t>o ignoradas, Drive ausente).</w:t>
       </w:r>
     </w:p>
     <w:p>
@@ -10296,13 +13100,762 @@
     </w:p>
     <w:p>
       <w:pPr>
-        <w:rPr>
-          <w:rFonts w:hint="eastAsia"/>
-        </w:rPr>
-      </w:pPr>
+        <w:pStyle w:val="Ttulo2"/>
+        <w:spacing w:line="252" w:lineRule="auto"/>
+      </w:pPr>
+      <w:r>
+        <w:rPr>
+          <w:rFonts w:ascii="Aptos" w:hAnsi="Aptos" w:hint="eastAsia"/>
+        </w:rPr>
+        <w:t>14.1 Mapping compartilhado entre máquinas</w:t>
+      </w:r>
     </w:p>
     <w:p>
       <w:pPr>
+        <w:pStyle w:val="Commarcadores"/>
+        <w:spacing w:after="50" w:line="264" w:lineRule="auto"/>
+        <w:rPr>
+          <w:rFonts w:hint="eastAsia"/>
+        </w:rPr>
+      </w:pPr>
+      <w:r>
+        <w:rPr>
+          <w:sz w:val="22"/>
+        </w:rPr>
+        <w:t>As regras do Mapping valem para todos os usu</w:t>
+      </w:r>
+      <w:r>
+        <w:rPr>
+          <w:rFonts w:hint="cs"/>
+          <w:sz w:val="22"/>
+        </w:rPr>
+        <w:t>á</w:t>
+      </w:r>
+      <w:r>
+        <w:rPr>
+          <w:sz w:val="22"/>
+        </w:rPr>
+        <w:t>rios. Antes, ficavam s</w:t>
+      </w:r>
+      <w:r>
+        <w:rPr>
+          <w:rFonts w:hint="cs"/>
+          <w:sz w:val="22"/>
+        </w:rPr>
+        <w:t>ó</w:t>
+      </w:r>
+      <w:r>
+        <w:rPr>
+          <w:sz w:val="22"/>
+        </w:rPr>
+        <w:t xml:space="preserve"> na m</w:t>
+      </w:r>
+      <w:r>
+        <w:rPr>
+          <w:rFonts w:hint="cs"/>
+          <w:sz w:val="22"/>
+        </w:rPr>
+        <w:t>á</w:t>
+      </w:r>
+      <w:r>
+        <w:rPr>
+          <w:sz w:val="22"/>
+        </w:rPr>
+        <w:t>quina de quem cadastrou: a compet</w:t>
+      </w:r>
+      <w:r>
+        <w:rPr>
+          <w:rFonts w:hint="cs"/>
+          <w:sz w:val="22"/>
+        </w:rPr>
+        <w:t>ê</w:t>
+      </w:r>
+      <w:r>
+        <w:rPr>
+          <w:sz w:val="22"/>
+        </w:rPr>
+        <w:t>ncia chegava pela ponte com o local calculado l</w:t>
+      </w:r>
+      <w:r>
+        <w:rPr>
+          <w:rFonts w:hint="cs"/>
+          <w:sz w:val="22"/>
+        </w:rPr>
+        <w:t>á</w:t>
+      </w:r>
+      <w:r>
+        <w:rPr>
+          <w:sz w:val="22"/>
+        </w:rPr>
+        <w:t>, mas a p</w:t>
+      </w:r>
+      <w:r>
+        <w:rPr>
+          <w:rFonts w:hint="cs"/>
+          <w:sz w:val="22"/>
+        </w:rPr>
+        <w:t>á</w:t>
+      </w:r>
+      <w:r>
+        <w:rPr>
+          <w:sz w:val="22"/>
+        </w:rPr>
+        <w:t>gina Mapping das outras m</w:t>
+      </w:r>
+      <w:r>
+        <w:rPr>
+          <w:rFonts w:hint="cs"/>
+          <w:sz w:val="22"/>
+        </w:rPr>
+        <w:t>á</w:t>
+      </w:r>
+      <w:r>
+        <w:rPr>
+          <w:sz w:val="22"/>
+        </w:rPr>
+        <w:t>quinas n</w:t>
+      </w:r>
+      <w:r>
+        <w:rPr>
+          <w:rFonts w:hint="cs"/>
+          <w:sz w:val="22"/>
+        </w:rPr>
+        <w:t>ã</w:t>
+      </w:r>
+      <w:r>
+        <w:rPr>
+          <w:sz w:val="22"/>
+        </w:rPr>
+        <w:t>o mostrava a regra e um rec</w:t>
+      </w:r>
+      <w:r>
+        <w:rPr>
+          <w:rFonts w:hint="cs"/>
+          <w:sz w:val="22"/>
+        </w:rPr>
+        <w:t>á</w:t>
+      </w:r>
+      <w:r>
+        <w:rPr>
+          <w:sz w:val="22"/>
+        </w:rPr>
+        <w:t>lculo local apagava o valo</w:t>
+      </w:r>
+      <w:r>
+        <w:rPr>
+          <w:rFonts w:hint="eastAsia"/>
+          <w:sz w:val="22"/>
+        </w:rPr>
+        <w:t>r (caso do centro 2115).</w:t>
+      </w:r>
+    </w:p>
+    <w:p>
+      <w:pPr>
+        <w:pStyle w:val="Commarcadores"/>
+        <w:spacing w:after="50" w:line="264" w:lineRule="auto"/>
+        <w:rPr>
+          <w:rFonts w:hint="eastAsia"/>
+        </w:rPr>
+      </w:pPr>
+      <w:r>
+        <w:rPr>
+          <w:sz w:val="22"/>
+        </w:rPr>
+        <w:t xml:space="preserve">Desenho (igual </w:t>
+      </w:r>
+      <w:r>
+        <w:rPr>
+          <w:rFonts w:hint="cs"/>
+          <w:sz w:val="22"/>
+        </w:rPr>
+        <w:t>à</w:t>
+      </w:r>
+      <w:r>
+        <w:rPr>
+          <w:sz w:val="22"/>
+        </w:rPr>
+        <w:t xml:space="preserve"> lista central de acessos): cada m</w:t>
+      </w:r>
+      <w:r>
+        <w:rPr>
+          <w:rFonts w:hint="cs"/>
+          <w:sz w:val="22"/>
+        </w:rPr>
+        <w:t>á</w:t>
+      </w:r>
+      <w:r>
+        <w:rPr>
+          <w:sz w:val="22"/>
+        </w:rPr>
+        <w:t>quina grava s</w:t>
+      </w:r>
+      <w:r>
+        <w:rPr>
+          <w:rFonts w:hint="cs"/>
+          <w:sz w:val="22"/>
+        </w:rPr>
+        <w:t>ó</w:t>
+      </w:r>
+      <w:r>
+        <w:rPr>
+          <w:sz w:val="22"/>
+        </w:rPr>
+        <w:t xml:space="preserve"> o pr</w:t>
+      </w:r>
+      <w:r>
+        <w:rPr>
+          <w:rFonts w:hint="cs"/>
+          <w:sz w:val="22"/>
+        </w:rPr>
+        <w:t>ó</w:t>
+      </w:r>
+      <w:r>
+        <w:rPr>
+          <w:sz w:val="22"/>
+        </w:rPr>
+        <w:t>prio arquivo Estoque_Cont\mapping\alteracoes\&lt;COMPUTADOR&gt;.json com a sua vis</w:t>
+      </w:r>
+      <w:r>
+        <w:rPr>
+          <w:rFonts w:hint="cs"/>
+          <w:sz w:val="22"/>
+        </w:rPr>
+        <w:t>ã</w:t>
+      </w:r>
+      <w:r>
+        <w:rPr>
+          <w:sz w:val="22"/>
+        </w:rPr>
+        <w:t>o das regras; todas leem todos os arquivos e, para cada regra (grupo + chave), vale a altera</w:t>
+      </w:r>
+      <w:r>
+        <w:rPr>
+          <w:rFonts w:hint="cs"/>
+          <w:sz w:val="22"/>
+        </w:rPr>
+        <w:t>çã</w:t>
+      </w:r>
+      <w:r>
+        <w:rPr>
+          <w:sz w:val="22"/>
+        </w:rPr>
+        <w:t>o mais recente (changed_at em UTC, com changed_by). Exclus</w:t>
+      </w:r>
+      <w:r>
+        <w:rPr>
+          <w:rFonts w:hint="cs"/>
+          <w:sz w:val="22"/>
+        </w:rPr>
+        <w:t>õ</w:t>
+      </w:r>
+      <w:r>
+        <w:rPr>
+          <w:sz w:val="22"/>
+        </w:rPr>
+        <w:t>es e chaves renomeadas ficam registradas como exclu</w:t>
+      </w:r>
+      <w:r>
+        <w:rPr>
+          <w:rFonts w:hint="cs"/>
+          <w:sz w:val="22"/>
+        </w:rPr>
+        <w:t>í</w:t>
+      </w:r>
+      <w:r>
+        <w:rPr>
+          <w:sz w:val="22"/>
+        </w:rPr>
+        <w:t>das e n</w:t>
+      </w:r>
+      <w:r>
+        <w:rPr>
+          <w:rFonts w:hint="cs"/>
+          <w:sz w:val="22"/>
+        </w:rPr>
+        <w:t>ã</w:t>
+      </w:r>
+      <w:r>
+        <w:rPr>
+          <w:sz w:val="22"/>
+        </w:rPr>
+        <w:t xml:space="preserve">o voltam por uma lista </w:t>
+      </w:r>
+      <w:r>
+        <w:rPr>
+          <w:sz w:val="22"/>
+        </w:rPr>
+        <w:lastRenderedPageBreak/>
+        <w:t xml:space="preserve">antiga. Regras anteriores </w:t>
+      </w:r>
+      <w:r>
+        <w:rPr>
+          <w:rFonts w:hint="cs"/>
+          <w:sz w:val="22"/>
+        </w:rPr>
+        <w:t>à</w:t>
+      </w:r>
+      <w:r>
+        <w:rPr>
+          <w:sz w:val="22"/>
+        </w:rPr>
+        <w:t xml:space="preserve"> funcionalidade entram como linha de base (updated_at) e perdem para qualquer altera</w:t>
+      </w:r>
+      <w:r>
+        <w:rPr>
+          <w:rFonts w:hint="cs"/>
+          <w:sz w:val="22"/>
+        </w:rPr>
+        <w:t>çã</w:t>
+      </w:r>
+      <w:r>
+        <w:rPr>
+          <w:sz w:val="22"/>
+        </w:rPr>
+        <w:t>o expl</w:t>
+      </w:r>
+      <w:r>
+        <w:rPr>
+          <w:rFonts w:hint="cs"/>
+          <w:sz w:val="22"/>
+        </w:rPr>
+        <w:t>í</w:t>
+      </w:r>
+      <w:r>
+        <w:rPr>
+          <w:sz w:val="22"/>
+        </w:rPr>
+        <w:t>cita.</w:t>
+      </w:r>
+    </w:p>
+    <w:p>
+      <w:pPr>
+        <w:pStyle w:val="Commarcadores"/>
+        <w:spacing w:after="50" w:line="264" w:lineRule="auto"/>
+        <w:rPr>
+          <w:rFonts w:hint="eastAsia"/>
+        </w:rPr>
+      </w:pPr>
+      <w:r>
+        <w:rPr>
+          <w:sz w:val="22"/>
+        </w:rPr>
+        <w:t>Quando chega regra nova, alterada ou exclu</w:t>
+      </w:r>
+      <w:r>
+        <w:rPr>
+          <w:rFonts w:hint="cs"/>
+          <w:sz w:val="22"/>
+        </w:rPr>
+        <w:t>í</w:t>
+      </w:r>
+      <w:r>
+        <w:rPr>
+          <w:sz w:val="22"/>
+        </w:rPr>
+        <w:t>da, a m</w:t>
+      </w:r>
+      <w:r>
+        <w:rPr>
+          <w:rFonts w:hint="cs"/>
+          <w:sz w:val="22"/>
+        </w:rPr>
+        <w:t>á</w:t>
+      </w:r>
+      <w:r>
+        <w:rPr>
+          <w:sz w:val="22"/>
+        </w:rPr>
+        <w:t>quina recalcula os campos de Mapping das compet</w:t>
+      </w:r>
+      <w:r>
+        <w:rPr>
+          <w:rFonts w:hint="cs"/>
+          <w:sz w:val="22"/>
+        </w:rPr>
+        <w:t>ê</w:t>
+      </w:r>
+      <w:r>
+        <w:rPr>
+          <w:sz w:val="22"/>
+        </w:rPr>
+        <w:t>ncias locais (sob a mesma trava das importa</w:t>
+      </w:r>
+      <w:r>
+        <w:rPr>
+          <w:rFonts w:hint="cs"/>
+          <w:sz w:val="22"/>
+        </w:rPr>
+        <w:t>çõ</w:t>
+      </w:r>
+      <w:r>
+        <w:rPr>
+          <w:sz w:val="22"/>
+        </w:rPr>
+        <w:t>es) sem republicar as compet</w:t>
+      </w:r>
+      <w:r>
+        <w:rPr>
+          <w:rFonts w:hint="cs"/>
+          <w:sz w:val="22"/>
+        </w:rPr>
+        <w:t>ê</w:t>
+      </w:r>
+      <w:r>
+        <w:rPr>
+          <w:sz w:val="22"/>
+        </w:rPr>
+        <w:t xml:space="preserve">ncias </w:t>
+      </w:r>
+      <w:r>
+        <w:rPr>
+          <w:rFonts w:hint="cs"/>
+          <w:sz w:val="22"/>
+        </w:rPr>
+        <w:t>—</w:t>
+      </w:r>
+      <w:r>
+        <w:rPr>
+          <w:sz w:val="22"/>
+        </w:rPr>
+        <w:t xml:space="preserve"> cada m</w:t>
+      </w:r>
+      <w:r>
+        <w:rPr>
+          <w:rFonts w:hint="cs"/>
+          <w:sz w:val="22"/>
+        </w:rPr>
+        <w:t>á</w:t>
+      </w:r>
+      <w:r>
+        <w:rPr>
+          <w:sz w:val="22"/>
+        </w:rPr>
+        <w:t>quina recalcula ao receber. Valores iguais n</w:t>
+      </w:r>
+      <w:r>
+        <w:rPr>
+          <w:rFonts w:hint="cs"/>
+          <w:sz w:val="22"/>
+        </w:rPr>
+        <w:t>ã</w:t>
+      </w:r>
+      <w:r>
+        <w:rPr>
+          <w:sz w:val="22"/>
+        </w:rPr>
+        <w:t>o disparam rec</w:t>
+      </w:r>
+      <w:r>
+        <w:rPr>
+          <w:rFonts w:hint="cs"/>
+          <w:sz w:val="22"/>
+        </w:rPr>
+        <w:t>á</w:t>
+      </w:r>
+      <w:r>
+        <w:rPr>
+          <w:sz w:val="22"/>
+        </w:rPr>
+        <w:t>lculo.</w:t>
+      </w:r>
+    </w:p>
+    <w:p>
+      <w:pPr>
+        <w:pStyle w:val="Commarcadores"/>
+        <w:spacing w:after="50" w:line="264" w:lineRule="auto"/>
+        <w:rPr>
+          <w:rFonts w:hint="eastAsia"/>
+        </w:rPr>
+      </w:pPr>
+      <w:r>
+        <w:rPr>
+          <w:sz w:val="22"/>
+        </w:rPr>
+        <w:t>Quando: logo ap</w:t>
+      </w:r>
+      <w:r>
+        <w:rPr>
+          <w:rFonts w:hint="cs"/>
+          <w:sz w:val="22"/>
+        </w:rPr>
+        <w:t>ó</w:t>
+      </w:r>
+      <w:r>
+        <w:rPr>
+          <w:sz w:val="22"/>
+        </w:rPr>
+        <w:t>s cada altera</w:t>
+      </w:r>
+      <w:r>
+        <w:rPr>
+          <w:rFonts w:hint="cs"/>
+          <w:sz w:val="22"/>
+        </w:rPr>
+        <w:t>çã</w:t>
+      </w:r>
+      <w:r>
+        <w:rPr>
+          <w:sz w:val="22"/>
+        </w:rPr>
+        <w:t>o no Mapping (publica em segundo plano), no login e a cada ciclo da ponte (2 minutos). Publicam as m</w:t>
+      </w:r>
+      <w:r>
+        <w:rPr>
+          <w:rFonts w:hint="cs"/>
+          <w:sz w:val="22"/>
+        </w:rPr>
+        <w:t>á</w:t>
+      </w:r>
+      <w:r>
+        <w:rPr>
+          <w:sz w:val="22"/>
+        </w:rPr>
+        <w:t>quinas que alteraram o Mapping e as de administradores.</w:t>
+      </w:r>
+    </w:p>
+    <w:p>
+      <w:pPr>
+        <w:pStyle w:val="Commarcadores"/>
+        <w:spacing w:after="50" w:line="264" w:lineRule="auto"/>
+        <w:rPr>
+          <w:rFonts w:hint="eastAsia"/>
+        </w:rPr>
+      </w:pPr>
+      <w:r>
+        <w:rPr>
+          <w:sz w:val="22"/>
+        </w:rPr>
+        <w:t>Concorr</w:t>
+      </w:r>
+      <w:r>
+        <w:rPr>
+          <w:rFonts w:hint="cs"/>
+          <w:sz w:val="22"/>
+        </w:rPr>
+        <w:t>ê</w:t>
+      </w:r>
+      <w:r>
+        <w:rPr>
+          <w:sz w:val="22"/>
+        </w:rPr>
+        <w:t>ncia: salvar/excluir uma regra e registrar a altera</w:t>
+      </w:r>
+      <w:r>
+        <w:rPr>
+          <w:rFonts w:hint="cs"/>
+          <w:sz w:val="22"/>
+        </w:rPr>
+        <w:t>çã</w:t>
+      </w:r>
+      <w:r>
+        <w:rPr>
+          <w:sz w:val="22"/>
+        </w:rPr>
+        <w:t>o usam a mesma trava da sincroniza</w:t>
+      </w:r>
+      <w:r>
+        <w:rPr>
+          <w:rFonts w:hint="cs"/>
+          <w:sz w:val="22"/>
+        </w:rPr>
+        <w:t>çã</w:t>
+      </w:r>
+      <w:r>
+        <w:rPr>
+          <w:sz w:val="22"/>
+        </w:rPr>
+        <w:t>o; ao sincronizar, regras locais com exclus</w:t>
+      </w:r>
+      <w:r>
+        <w:rPr>
+          <w:rFonts w:hint="cs"/>
+          <w:sz w:val="22"/>
+        </w:rPr>
+        <w:t>ã</w:t>
+      </w:r>
+      <w:r>
+        <w:rPr>
+          <w:sz w:val="22"/>
+        </w:rPr>
+        <w:t>o mais nova s</w:t>
+      </w:r>
+      <w:r>
+        <w:rPr>
+          <w:rFonts w:hint="cs"/>
+          <w:sz w:val="22"/>
+        </w:rPr>
+        <w:t>ã</w:t>
+      </w:r>
+      <w:r>
+        <w:rPr>
+          <w:sz w:val="22"/>
+        </w:rPr>
+        <w:t>o removidas (purge_shadowed_rules).</w:t>
+      </w:r>
+    </w:p>
+    <w:p>
+      <w:pPr>
+        <w:pStyle w:val="Commarcadores"/>
+        <w:spacing w:after="50" w:line="264" w:lineRule="auto"/>
+        <w:rPr>
+          <w:rFonts w:hint="eastAsia"/>
+        </w:rPr>
+      </w:pPr>
+      <w:r>
+        <w:rPr>
+          <w:sz w:val="22"/>
+        </w:rPr>
+        <w:t>P</w:t>
+      </w:r>
+      <w:r>
+        <w:rPr>
+          <w:rFonts w:hint="cs"/>
+          <w:sz w:val="22"/>
+        </w:rPr>
+        <w:t>á</w:t>
+      </w:r>
+      <w:r>
+        <w:rPr>
+          <w:sz w:val="22"/>
+        </w:rPr>
+        <w:t xml:space="preserve">gina Mapping: o selo do topo mostra "N regras ativas </w:t>
+      </w:r>
+      <w:r>
+        <w:rPr>
+          <w:rFonts w:hint="cs"/>
+          <w:sz w:val="22"/>
+        </w:rPr>
+        <w:t>·</w:t>
+      </w:r>
+      <w:r>
+        <w:rPr>
+          <w:sz w:val="22"/>
+        </w:rPr>
+        <w:t xml:space="preserve"> compartilhado </w:t>
+      </w:r>
+      <w:r>
+        <w:rPr>
+          <w:rFonts w:hint="cs"/>
+          <w:sz w:val="22"/>
+        </w:rPr>
+        <w:t>·</w:t>
+      </w:r>
+      <w:r>
+        <w:rPr>
+          <w:sz w:val="22"/>
+        </w:rPr>
+        <w:t xml:space="preserve"> data/hora" (amarelo com erro ou envio pendente). T</w:t>
+      </w:r>
+      <w:r>
+        <w:rPr>
+          <w:rFonts w:hint="cs"/>
+          <w:sz w:val="22"/>
+        </w:rPr>
+        <w:t>é</w:t>
+      </w:r>
+      <w:r>
+        <w:rPr>
+          <w:sz w:val="22"/>
+        </w:rPr>
+        <w:t>cnico: m</w:t>
+      </w:r>
+      <w:r>
+        <w:rPr>
+          <w:rFonts w:hint="cs"/>
+          <w:sz w:val="22"/>
+        </w:rPr>
+        <w:t>ó</w:t>
+      </w:r>
+      <w:r>
+        <w:rPr>
+          <w:sz w:val="22"/>
+        </w:rPr>
+        <w:t>dulo mapping_sync.py, colunas mapping_rules.changed_at/changed_by, estado em system_settings.mapping_state, rota GET /api/</w:t>
+      </w:r>
+      <w:r>
+        <w:rPr>
+          <w:rFonts w:hint="eastAsia"/>
+          <w:sz w:val="22"/>
+        </w:rPr>
+        <w:t>mapping-sync/status; testes em tests/test_mapping_sync.py.</w:t>
+      </w:r>
+    </w:p>
+    <w:p>
+      <w:pPr>
+        <w:pStyle w:val="Commarcadores"/>
+        <w:spacing w:after="50" w:line="264" w:lineRule="auto"/>
+        <w:rPr>
+          <w:rFonts w:hint="eastAsia"/>
+        </w:rPr>
+      </w:pPr>
+      <w:r>
+        <w:rPr>
+          <w:sz w:val="22"/>
+        </w:rPr>
+        <w:t>Corre</w:t>
+      </w:r>
+      <w:r>
+        <w:rPr>
+          <w:rFonts w:hint="cs"/>
+          <w:sz w:val="22"/>
+        </w:rPr>
+        <w:t>çã</w:t>
+      </w:r>
+      <w:r>
+        <w:rPr>
+          <w:sz w:val="22"/>
+        </w:rPr>
+        <w:t>o: excluir uma regra devolvia erro 500 (valida</w:t>
+      </w:r>
+      <w:r>
+        <w:rPr>
+          <w:rFonts w:hint="cs"/>
+          <w:sz w:val="22"/>
+        </w:rPr>
+        <w:t>çã</w:t>
+      </w:r>
+      <w:r>
+        <w:rPr>
+          <w:sz w:val="22"/>
+        </w:rPr>
+        <w:t>o da resposta) embora a exclus</w:t>
+      </w:r>
+      <w:r>
+        <w:rPr>
+          <w:rFonts w:hint="cs"/>
+          <w:sz w:val="22"/>
+        </w:rPr>
+        <w:t>ã</w:t>
+      </w:r>
+      <w:r>
+        <w:rPr>
+          <w:sz w:val="22"/>
+        </w:rPr>
+        <w:t>o e o rec</w:t>
+      </w:r>
+      <w:r>
+        <w:rPr>
+          <w:rFonts w:hint="cs"/>
+          <w:sz w:val="22"/>
+        </w:rPr>
+        <w:t>á</w:t>
+      </w:r>
+      <w:r>
+        <w:rPr>
+          <w:sz w:val="22"/>
+        </w:rPr>
+        <w:t>lculo acontecessem; a rota agora responde normalmente.</w:t>
+      </w:r>
+    </w:p>
+    <w:p>
+      <w:pPr>
+        <w:rPr>
+          <w:rFonts w:hint="eastAsia"/>
+        </w:rPr>
+      </w:pPr>
+    </w:p>
+    <w:p>
+      <w:pPr>
         <w:pStyle w:val="Ttulo1"/>
         <w:spacing w:line="252" w:lineRule="auto"/>
       </w:pPr>
@@ -10310,7 +13863,6 @@
         <w:rPr>
           <w:rFonts w:ascii="Aptos" w:hAnsi="Aptos"/>
         </w:rPr>
-        <w:lastRenderedPageBreak/>
         <w:t>15. Controles e auditoria</w:t>
       </w:r>
     </w:p>
@@ -10942,6 +14494,7 @@
               <w:rPr>
                 <w:sz w:val="19"/>
               </w:rPr>
+              <w:lastRenderedPageBreak/>
               <w:t>Permissões</w:t>
             </w:r>
           </w:p>
@@ -11282,7 +14835,6 @@
         <w:rPr>
           <w:rFonts w:ascii="Aptos" w:hAnsi="Aptos"/>
         </w:rPr>
-        <w:lastRenderedPageBreak/>
         <w:t>17. Optimus — agente contábil</w:t>
       </w:r>
     </w:p>
@@ -12383,6 +15935,7 @@
                 <w:rFonts w:hint="eastAsia"/>
                 <w:sz w:val="18"/>
               </w:rPr>
+              <w:lastRenderedPageBreak/>
               <w:t>health_center | inventory_gaps | mapping_gaps</w:t>
             </w:r>
           </w:p>
@@ -13445,6 +16998,7 @@
         <w:rPr>
           <w:sz w:val="22"/>
         </w:rPr>
+        <w:lastRenderedPageBreak/>
         <w:t>Confirma</w:t>
       </w:r>
       <w:r>
@@ -13784,7 +17338,6 @@
         <w:rPr>
           <w:sz w:val="22"/>
         </w:rPr>
-        <w:lastRenderedPageBreak/>
         <w:t>Busca: sap_upload.find_sap_export_candidates lista at</w:t>
       </w:r>
       <w:r>
@@ -14679,6 +18232,7 @@
         <w:rPr>
           <w:sz w:val="22"/>
         </w:rPr>
+        <w:lastRenderedPageBreak/>
         <w:t>Notifica</w:t>
       </w:r>
       <w:r>
@@ -14972,7 +18526,6 @@
         <w:rPr>
           <w:rFonts w:ascii="Aptos" w:hAnsi="Aptos" w:hint="eastAsia"/>
         </w:rPr>
-        <w:lastRenderedPageBreak/>
         <w:t>17.7 Evento: All Brazil mais nova que a usada no enriquecimento</w:t>
       </w:r>
     </w:p>
@@ -15670,6 +19223,7 @@
         <w:rPr>
           <w:sz w:val="22"/>
         </w:rPr>
+        <w:lastRenderedPageBreak/>
         <w:t>Orienta</w:t>
       </w:r>
       <w:r>
@@ -15869,7 +19423,6 @@
         <w:rPr>
           <w:rFonts w:ascii="Aptos" w:hAnsi="Aptos" w:hint="eastAsia"/>
         </w:rPr>
-        <w:lastRenderedPageBreak/>
         <w:t>17.14 Evento: extração SAP travada</w:t>
       </w:r>
     </w:p>
@@ -16411,6 +19964,7 @@
         <w:rPr>
           <w:rFonts w:ascii="Aptos" w:hAnsi="Aptos" w:hint="eastAsia"/>
         </w:rPr>
+        <w:lastRenderedPageBreak/>
         <w:t>17.20 Ação: acessos corporativos</w:t>
       </w:r>
     </w:p>
@@ -16707,7 +20261,6 @@
         <w:rPr>
           <w:rFonts w:ascii="Aptos" w:hAnsi="Aptos" w:hint="eastAsia"/>
         </w:rPr>
-        <w:lastRenderedPageBreak/>
         <w:t>17.23 Segurança e limites</w:t>
       </w:r>
     </w:p>
@@ -17555,7 +21108,14 @@
         <w:rPr>
           <w:sz w:val="22"/>
         </w:rPr>
-        <w:t>cio da fila; o agente escreve que a conex</w:t>
+        <w:t xml:space="preserve">cio da fila; o agente </w:t>
+      </w:r>
+      <w:r>
+        <w:rPr>
+          <w:sz w:val="22"/>
+        </w:rPr>
+        <w:lastRenderedPageBreak/>
+        <w:t>escreve que a conex</w:t>
       </w:r>
       <w:r>
         <w:rPr>
@@ -18133,6 +21693,7 @@
         <w:rPr>
           <w:rFonts w:ascii="Aptos" w:hAnsi="Aptos"/>
         </w:rPr>
+        <w:lastRenderedPageBreak/>
         <w:t>18.6 Restauração</w:t>
       </w:r>
     </w:p>
@@ -18405,11 +21966,7 @@
         <w:t>á</w:t>
       </w:r>
       <w:r>
-        <w:t xml:space="preserve">ginas. A lista mostra todos os </w:t>
-      </w:r>
-      <w:r>
-        <w:lastRenderedPageBreak/>
-        <w:t xml:space="preserve">logins do sistema, inclusive os cadastrados por outros administradores, com o autor e a data da </w:t>
+        <w:t xml:space="preserve">ginas. A lista mostra todos os logins do sistema, inclusive os cadastrados por outros administradores, com o autor e a data da </w:t>
       </w:r>
       <w:r>
         <w:rPr>
@@ -19262,6 +22819,7 @@
         <w:rPr>
           <w:sz w:val="22"/>
         </w:rPr>
+        <w:lastRenderedPageBreak/>
         <w:t>Uploads e cargas da base: planilha carregada por upload (conclu</w:t>
       </w:r>
       <w:r>
@@ -19753,7 +23311,6 @@
         <w:rPr>
           <w:sz w:val="22"/>
         </w:rPr>
-        <w:lastRenderedPageBreak/>
         <w:t>Sino no topo da tela: caixa com as notifica</w:t>
       </w:r>
       <w:r>
@@ -20351,6 +23908,7 @@
               <w:rPr>
                 <w:sz w:val="17"/>
               </w:rPr>
+              <w:lastRenderedPageBreak/>
               <w:t>/api/dashboard/summary</w:t>
             </w:r>
           </w:p>
@@ -21011,7 +24569,6 @@
               <w:rPr>
                 <w:sz w:val="17"/>
               </w:rPr>
-              <w:lastRenderedPageBreak/>
               <w:t>/api/sap/upload</w:t>
             </w:r>
           </w:p>
@@ -21090,9 +24647,10 @@
             </w:pPr>
             <w:r>
               <w:rPr>
+                <w:rFonts w:hint="eastAsia"/>
                 <w:sz w:val="17"/>
               </w:rPr>
-              <w:t>Biblioteca de snapshots.</w:t>
+              <w:t>Biblioteca de snapshots (anos e meses lidos das pastas reais do Drive).</w:t>
             </w:r>
           </w:p>
         </w:tc>
@@ -22321,6 +25879,7 @@
                 <w:rFonts w:hint="eastAsia"/>
                 <w:sz w:val="17"/>
               </w:rPr>
+              <w:lastRenderedPageBreak/>
               <w:t>/api/optimus/proactive</w:t>
             </w:r>
           </w:p>
@@ -22661,7 +26220,6 @@
         <w:rPr>
           <w:rFonts w:ascii="Aptos Display" w:hAnsi="Aptos Display"/>
         </w:rPr>
-        <w:lastRenderedPageBreak/>
         <w:t>21.1 Identificação e estado do workflow</w:t>
       </w:r>
     </w:p>
@@ -23362,6 +26920,13 @@
                 <w:sz w:val="18"/>
               </w:rPr>
               <w:br/>
+            </w:r>
+            <w:r>
+              <w:rPr>
+                <w:rFonts w:ascii="Consolas" w:hAnsi="Consolas"/>
+                <w:sz w:val="18"/>
+              </w:rPr>
+              <w:lastRenderedPageBreak/>
               <w:t xml:space="preserve">    │                  ↓</w:t>
             </w:r>
             <w:r>
@@ -25192,7 +28757,6 @@
               <w:rPr>
                 <w:sz w:val="18"/>
               </w:rPr>
-              <w:lastRenderedPageBreak/>
               <w:t>Memória da conversa</w:t>
             </w:r>
           </w:p>
@@ -26517,7 +30081,6 @@
           <w:szCs w:val="18"/>
           <w:lang w:eastAsia="pt-BR"/>
         </w:rPr>
-        <w:lastRenderedPageBreak/>
         <w:t>N8N_CHAT_URL</w:t>
       </w:r>
     </w:p>
@@ -26984,6 +30547,13 @@
                 <w:sz w:val="18"/>
               </w:rPr>
               <w:br/>
+            </w:r>
+            <w:r>
+              <w:rPr>
+                <w:rFonts w:ascii="Consolas" w:hAnsi="Consolas"/>
+                <w:sz w:val="18"/>
+              </w:rPr>
+              <w:lastRenderedPageBreak/>
               <w:t>[[/OPS_ACTION]]</w:t>
             </w:r>
             <w:r>
@@ -27039,6 +30609,7 @@
         <w:rPr>
           <w:sz w:val="22"/>
         </w:rPr>
+        <w:lastRenderedPageBreak/>
         <w:t>O protocolo é executado em duas passagens: na primeira, o Optimus devolve OPS_ACTION quando precisa de uma ação local; o aplicativo executa a ferramenta e envia o resultado novamente ao webhook dentro de RESULTADO_FERRAMENTA_LOCAL. Na segunda passagem, o nó Detectar retorno local encaminha diretamente para PDF ou Slides, sem reenviar o resultado ao agente.</w:t>
       </w:r>
     </w:p>
@@ -27785,6 +31356,7 @@
         <w:rPr>
           <w:rFonts w:ascii="Aptos Display" w:hAnsi="Aptos Display"/>
         </w:rPr>
+        <w:lastRenderedPageBreak/>
         <w:t>21.10 Marcadores substituídos no Google Slides</w:t>
       </w:r>
     </w:p>
@@ -28225,7 +31797,6 @@
               <w:rPr>
                 <w:sz w:val="18"/>
               </w:rPr>
-              <w:lastRenderedPageBreak/>
               <w:t>{{PMM}}</w:t>
             </w:r>
           </w:p>
@@ -29268,7 +32839,14 @@
               <w:rPr>
                 <w:sz w:val="19"/>
               </w:rPr>
-              <w:t>ficos); arquivo independente, sem scripts, para envio em Slack/outro canal.</w:t>
+              <w:t xml:space="preserve">ficos); arquivo </w:t>
+            </w:r>
+            <w:r>
+              <w:rPr>
+                <w:sz w:val="19"/>
+              </w:rPr>
+              <w:lastRenderedPageBreak/>
+              <w:t>independente, sem scripts, para envio em Slack/outro canal.</w:t>
             </w:r>
           </w:p>
         </w:tc>
@@ -29298,6 +32876,7 @@
               <w:rPr>
                 <w:sz w:val="19"/>
               </w:rPr>
+              <w:lastRenderedPageBreak/>
               <w:t>PDF</w:t>
             </w:r>
           </w:p>
@@ -29504,11 +33083,7 @@
         <w:t>ã</w:t>
       </w:r>
       <w:r>
-        <w:t xml:space="preserve">o produzidos por </w:t>
-      </w:r>
-      <w:r>
-        <w:lastRenderedPageBreak/>
-        <w:t xml:space="preserve">reporting.render_dashboard_report(): o Edge headless </w:t>
+        <w:t xml:space="preserve">o produzidos por reporting.render_dashboard_report(): o Edge headless </w:t>
       </w:r>
       <w:r>
         <w:rPr>
@@ -30154,6 +33729,7 @@
               <w:rPr>
                 <w:sz w:val="19"/>
               </w:rPr>
+              <w:lastRenderedPageBreak/>
               <w:t>n8n/ARTIFATOS_RELATORIO.md</w:t>
             </w:r>
           </w:p>
@@ -30597,7 +34173,6 @@
               <w:rPr>
                 <w:sz w:val="19"/>
               </w:rPr>
-              <w:lastRenderedPageBreak/>
               <w:t>data/</w:t>
             </w:r>
           </w:p>
@@ -31903,6 +35478,7 @@
               <w:rPr>
                 <w:sz w:val="17"/>
               </w:rPr>
+              <w:lastRenderedPageBreak/>
               <w:t>sources/all_brazil.py</w:t>
             </w:r>
           </w:p>
@@ -32297,14 +35873,7 @@
         <w:rPr>
           <w:rFonts w:hint="eastAsia"/>
         </w:rPr>
-        <w:t xml:space="preserve">documentation.py, access_sync.py, </w:t>
-      </w:r>
-      <w:r>
-        <w:rPr>
-          <w:rFonts w:hint="eastAsia"/>
-        </w:rPr>
-        <w:lastRenderedPageBreak/>
-        <w:t>notifications.py, assets/estoque_contabil.png, knowledge/documentacao/</w:t>
+        <w:t>documentation.py, access_sync.py, notifications.py, assets/estoque_contabil.png, knowledge/documentacao/</w:t>
       </w:r>
       <w:r>
         <w:rPr>
@@ -33684,6 +37253,7 @@
         <w:rPr>
           <w:rFonts w:ascii="Aptos" w:hAnsi="Aptos"/>
         </w:rPr>
+        <w:lastRenderedPageBreak/>
         <w:t>25. Operação, contingência e suporte</w:t>
       </w:r>
     </w:p>
@@ -34116,7 +37686,6 @@
               <w:rPr>
                 <w:sz w:val="19"/>
               </w:rPr>
-              <w:lastRenderedPageBreak/>
               <w:t>Drive de ponte indisponível</w:t>
             </w:r>
           </w:p>
@@ -34728,13 +38297,20 @@
                 <w:sz w:val="18"/>
               </w:rPr>
               <w:br/>
-              <w:t xml:space="preserve">  ingestion/</w:t>
             </w:r>
             <w:r>
               <w:rPr>
                 <w:rFonts w:ascii="Consolas" w:hAnsi="Consolas"/>
                 <w:sz w:val="18"/>
               </w:rPr>
+              <w:lastRenderedPageBreak/>
+              <w:t xml:space="preserve">  ingestion/</w:t>
+            </w:r>
+            <w:r>
+              <w:rPr>
+                <w:rFonts w:ascii="Consolas" w:hAnsi="Consolas"/>
+                <w:sz w:val="18"/>
+              </w:rPr>
               <w:br/>
               <w:t xml:space="preserve">    __init__.py</w:t>
             </w:r>
@@ -34848,13 +38424,6 @@
                 <w:sz w:val="18"/>
               </w:rPr>
               <w:br/>
-            </w:r>
-            <w:r>
-              <w:rPr>
-                <w:rFonts w:ascii="Consolas" w:hAnsi="Consolas"/>
-                <w:sz w:val="18"/>
-              </w:rPr>
-              <w:lastRenderedPageBreak/>
               <w:t>tests/</w:t>
             </w:r>
             <w:r>
@@ -36353,6 +39922,7 @@
               <w:rPr>
                 <w:sz w:val="18"/>
               </w:rPr>
+              <w:lastRenderedPageBreak/>
               <w:t>Q</w:t>
             </w:r>
           </w:p>
@@ -36611,7 +40181,6 @@
         <w:rPr>
           <w:sz w:val="22"/>
         </w:rPr>
-        <w:lastRenderedPageBreak/>
         <w:t>{{PMM}}</w:t>
       </w:r>
     </w:p>
@@ -37496,6 +41065,7 @@
               <w:rPr>
                 <w:sz w:val="20"/>
               </w:rPr>
+              <w:lastRenderedPageBreak/>
               <w:t>Share Link</w:t>
             </w:r>
           </w:p>
@@ -37683,12 +41253,8 @@
       </w:r>
     </w:p>
     <w:sectPr>
-      <w:headerReference w:type="even" r:id="rId12"/>
-      <w:headerReference w:type="default" r:id="rId13"/>
-      <w:footerReference w:type="even" r:id="rId14"/>
-      <w:footerReference w:type="default" r:id="rId15"/>
-      <w:headerReference w:type="first" r:id="rId16"/>
-      <w:footerReference w:type="first" r:id="rId17"/>
+      <w:headerReference w:type="default" r:id="rId12"/>
+      <w:footerReference w:type="default" r:id="rId13"/>
       <w:pgSz w:w="12240" w:h="15840"/>
       <w:pgMar w:top="1134" w:right="1134" w:bottom="1020" w:left="1247" w:header="720" w:footer="720" w:gutter="0"/>
       <w:cols w:space="720"/>
@@ -37730,19 +41296,6 @@
 </file>
 
 <file path=word/footer1.xml><?xml version="1.0" encoding="utf-8"?>
-<w:ftr xmlns:wpc="http://schemas.microsoft.com/office/word/2010/wordprocessingCanvas" xmlns:cx="http://schemas.microsoft.com/office/drawing/2014/chartex" xmlns:cx1="http://schemas.microsoft.com/office/drawing/2015/9/8/chartex" xmlns:mc="http://schemas.openxmlformats.org/markup-compatibility/2006" xmlns:o="urn:schemas-microsoft-com:office:office" xmlns:r="http://schemas.openxmlformats.org/officeDocument/2006/relationships" xmlns:m="http://schemas.openxmlformats.org/officeDocument/2006/math" xmlns:v="urn:schemas-microsoft-com:vml" xmlns:wp14="http://schemas.microsoft.com/office/word/2010/wordprocessingDrawing" xmlns:wp="http://schemas.openxmlformats.org/drawingml/2006/wordprocessingDrawing" xmlns:w10="urn:schemas-microsoft-com:office:word" xmlns:w="http://schemas.openxmlformats.org/wordprocessingml/2006/main" xmlns:w14="http://schemas.microsoft.com/office/word/2010/wordml" xmlns:w15="http://schemas.microsoft.com/office/word/2012/wordml" xmlns:w16se="http://schemas.microsoft.com/office/word/2015/wordml/symex" xmlns:wpg="http://schemas.microsoft.com/office/word/2010/wordprocessingGroup" xmlns:wpi="http://schemas.microsoft.com/office/word/2010/wordprocessingInk" xmlns:wne="http://schemas.microsoft.com/office/word/2006/wordml" xmlns:wps="http://schemas.microsoft.com/office/word/2010/wordprocessingShape" mc:Ignorable="w14 w15 w16se wp14">
-  <w:p>
-    <w:pPr>
-      <w:pStyle w:val="Rodap"/>
-      <w:rPr>
-        <w:rFonts w:hint="eastAsia"/>
-      </w:rPr>
-    </w:pPr>
-  </w:p>
-</w:ftr>
-</file>
-
-<file path=word/footer2.xml><?xml version="1.0" encoding="utf-8"?>
 <w:ftr xmlns:wpc="http://schemas.microsoft.com/office/word/2010/wordprocessingCanvas" xmlns:cx="http://schemas.microsoft.com/office/drawing/2014/chartex" xmlns:cx1="http://schemas.microsoft.com/office/drawing/2015/9/8/chartex" xmlns:mc="http://schemas.openxmlformats.org/markup-compatibility/2006" xmlns:o="urn:schemas-microsoft-com:office:office" xmlns:r="http://schemas.openxmlformats.org/officeDocument/2006/relationships" xmlns:m="http://schemas.openxmlformats.org/officeDocument/2006/math" xmlns:v="urn:schemas-microsoft-com:vml" xmlns:wp14="http://schemas.microsoft.com/office/word/2010/wordprocessingDrawing" xmlns:wp="http://schemas.openxmlformats.org/drawingml/2006/wordprocessingDrawing" xmlns:w10="urn:schemas-microsoft-com:office:word" xmlns:w="http://schemas.openxmlformats.org/wordprocessingml/2006/main" xmlns:w14="http://schemas.microsoft.com/office/word/2010/wordml" xmlns:w15="http://schemas.microsoft.com/office/word/2012/wordml" xmlns:w16se="http://schemas.microsoft.com/office/word/2015/wordml/symex" xmlns:wpg="http://schemas.microsoft.com/office/word/2010/wordprocessingGroup" xmlns:wpi="http://schemas.microsoft.com/office/word/2010/wordprocessingInk" xmlns:wne="http://schemas.microsoft.com/office/word/2006/wordml" xmlns:wps="http://schemas.microsoft.com/office/word/2010/wordprocessingShape" mc:Ignorable="w14 w15 w16se wp14">
   <w:p>
     <w:pPr>
@@ -37765,7 +41318,7 @@
         <w:color w:val="5A646E"/>
         <w:sz w:val="17"/>
       </w:rPr>
-      <w:t>07/10/2026</w:t>
+      <w:t>08/10/2026</w:t>
     </w:r>
     <w:r>
       <w:rPr>
@@ -37802,7 +41355,7 @@
         <w:color w:val="5A646E"/>
         <w:sz w:val="18"/>
       </w:rPr>
-      <w:t>36</w:t>
+      <w:t>39</w:t>
     </w:r>
     <w:r>
       <w:rPr>
@@ -37815,19 +41368,6 @@
 </w:ftr>
 </file>
 
-<file path=word/footer3.xml><?xml version="1.0" encoding="utf-8"?>
-<w:ftr xmlns:wpc="http://schemas.microsoft.com/office/word/2010/wordprocessingCanvas" xmlns:cx="http://schemas.microsoft.com/office/drawing/2014/chartex" xmlns:cx1="http://schemas.microsoft.com/office/drawing/2015/9/8/chartex" xmlns:mc="http://schemas.openxmlformats.org/markup-compatibility/2006" xmlns:o="urn:schemas-microsoft-com:office:office" xmlns:r="http://schemas.openxmlformats.org/officeDocument/2006/relationships" xmlns:m="http://schemas.openxmlformats.org/officeDocument/2006/math" xmlns:v="urn:schemas-microsoft-com:vml" xmlns:wp14="http://schemas.microsoft.com/office/word/2010/wordprocessingDrawing" xmlns:wp="http://schemas.openxmlformats.org/drawingml/2006/wordprocessingDrawing" xmlns:w10="urn:schemas-microsoft-com:office:word" xmlns:w="http://schemas.openxmlformats.org/wordprocessingml/2006/main" xmlns:w14="http://schemas.microsoft.com/office/word/2010/wordml" xmlns:w15="http://schemas.microsoft.com/office/word/2012/wordml" xmlns:w16se="http://schemas.microsoft.com/office/word/2015/wordml/symex" xmlns:wpg="http://schemas.microsoft.com/office/word/2010/wordprocessingGroup" xmlns:wpi="http://schemas.microsoft.com/office/word/2010/wordprocessingInk" xmlns:wne="http://schemas.microsoft.com/office/word/2006/wordml" xmlns:wps="http://schemas.microsoft.com/office/word/2010/wordprocessingShape" mc:Ignorable="w14 w15 w16se wp14">
-  <w:p>
-    <w:pPr>
-      <w:pStyle w:val="Rodap"/>
-      <w:rPr>
-        <w:rFonts w:hint="eastAsia"/>
-      </w:rPr>
-    </w:pPr>
-  </w:p>
-</w:ftr>
-</file>
-
 <file path=word/footnotes.xml><?xml version="1.0" encoding="utf-8"?>
 <w:footnotes xmlns:wpc="http://schemas.microsoft.com/office/word/2010/wordprocessingCanvas" xmlns:cx="http://schemas.microsoft.com/office/drawing/2014/chartex" xmlns:cx1="http://schemas.microsoft.com/office/drawing/2015/9/8/chartex" xmlns:mc="http://schemas.openxmlformats.org/markup-compatibility/2006" xmlns:o="urn:schemas-microsoft-com:office:office" xmlns:r="http://schemas.openxmlformats.org/officeDocument/2006/relationships" xmlns:m="http://schemas.openxmlformats.org/officeDocument/2006/math" xmlns:v="urn:schemas-microsoft-com:vml" xmlns:wp14="http://schemas.microsoft.com/office/word/2010/wordprocessingDrawing" xmlns:wp="http://schemas.openxmlformats.org/drawingml/2006/wordprocessingDrawing" xmlns:w10="urn:schemas-microsoft-com:office:word" xmlns:w="http://schemas.openxmlformats.org/wordprocessingml/2006/main" xmlns:w14="http://schemas.microsoft.com/office/word/2010/wordml" xmlns:w15="http://schemas.microsoft.com/office/word/2012/wordml" xmlns:w16se="http://schemas.microsoft.com/office/word/2015/wordml/symex" xmlns:wpg="http://schemas.microsoft.com/office/word/2010/wordprocessingGroup" xmlns:wpi="http://schemas.microsoft.com/office/word/2010/wordprocessingInk" xmlns:wne="http://schemas.microsoft.com/office/word/2006/wordml" xmlns:wps="http://schemas.microsoft.com/office/word/2010/wordprocessingShape" mc:Ignorable="w14 w15 w16se wp14">
   <w:footnote w:type="separator" w:id="-1">
@@ -37860,19 +41400,6 @@
 </file>
 
 <file path=word/header1.xml><?xml version="1.0" encoding="utf-8"?>
-<w:hdr xmlns:wpc="http://schemas.microsoft.com/office/word/2010/wordprocessingCanvas" xmlns:cx="http://schemas.microsoft.com/office/drawing/2014/chartex" xmlns:cx1="http://schemas.microsoft.com/office/drawing/2015/9/8/chartex" xmlns:mc="http://schemas.openxmlformats.org/markup-compatibility/2006" xmlns:o="urn:schemas-microsoft-com:office:office" xmlns:r="http://schemas.openxmlformats.org/officeDocument/2006/relationships" xmlns:m="http://schemas.openxmlformats.org/officeDocument/2006/math" xmlns:v="urn:schemas-microsoft-com:vml" xmlns:wp14="http://schemas.microsoft.com/office/word/2010/wordprocessingDrawing" xmlns:wp="http://schemas.openxmlformats.org/drawingml/2006/wordprocessingDrawing" xmlns:w10="urn:schemas-microsoft-com:office:word" xmlns:w="http://schemas.openxmlformats.org/wordprocessingml/2006/main" xmlns:w14="http://schemas.microsoft.com/office/word/2010/wordml" xmlns:w15="http://schemas.microsoft.com/office/word/2012/wordml" xmlns:w16se="http://schemas.microsoft.com/office/word/2015/wordml/symex" xmlns:wpg="http://schemas.microsoft.com/office/word/2010/wordprocessingGroup" xmlns:wpi="http://schemas.microsoft.com/office/word/2010/wordprocessingInk" xmlns:wne="http://schemas.microsoft.com/office/word/2006/wordml" xmlns:wps="http://schemas.microsoft.com/office/word/2010/wordprocessingShape" mc:Ignorable="w14 w15 w16se wp14">
-  <w:p>
-    <w:pPr>
-      <w:pStyle w:val="Cabealho"/>
-      <w:rPr>
-        <w:rFonts w:hint="eastAsia"/>
-      </w:rPr>
-    </w:pPr>
-  </w:p>
-</w:hdr>
-</file>
-
-<file path=word/header2.xml><?xml version="1.0" encoding="utf-8"?>
 <w:hdr xmlns:wpc="http://schemas.microsoft.com/office/word/2010/wordprocessingCanvas" xmlns:cx="http://schemas.microsoft.com/office/drawing/2014/chartex" xmlns:cx1="http://schemas.microsoft.com/office/drawing/2015/9/8/chartex" xmlns:mc="http://schemas.openxmlformats.org/markup-compatibility/2006" xmlns:o="urn:schemas-microsoft-com:office:office" xmlns:r="http://schemas.openxmlformats.org/officeDocument/2006/relationships" xmlns:m="http://schemas.openxmlformats.org/officeDocument/2006/math" xmlns:v="urn:schemas-microsoft-com:vml" xmlns:wp14="http://schemas.microsoft.com/office/word/2010/wordprocessingDrawing" xmlns:wp="http://schemas.openxmlformats.org/drawingml/2006/wordprocessingDrawing" xmlns:w10="urn:schemas-microsoft-com:office:word" xmlns:w="http://schemas.openxmlformats.org/wordprocessingml/2006/main" xmlns:w14="http://schemas.microsoft.com/office/word/2010/wordml" xmlns:w15="http://schemas.microsoft.com/office/word/2012/wordml" xmlns:w16se="http://schemas.microsoft.com/office/word/2015/wordml/symex" xmlns:wpg="http://schemas.microsoft.com/office/word/2010/wordprocessingGroup" xmlns:wpi="http://schemas.microsoft.com/office/word/2010/wordprocessingInk" xmlns:wne="http://schemas.microsoft.com/office/word/2006/wordml" xmlns:wps="http://schemas.microsoft.com/office/word/2010/wordprocessingShape" mc:Ignorable="w14 w15 w16se wp14">
   <w:p>
     <w:pPr>
@@ -37890,19 +41417,6 @@
       </w:rPr>
       <w:t>ESTOQUE CONTÁBIL  |  ESPECIFICAÇÃO TÉCNICO-DOCUMENTAL</w:t>
     </w:r>
-  </w:p>
-</w:hdr>
-</file>
-
-<file path=word/header3.xml><?xml version="1.0" encoding="utf-8"?>
-<w:hdr xmlns:wpc="http://schemas.microsoft.com/office/word/2010/wordprocessingCanvas" xmlns:cx="http://schemas.microsoft.com/office/drawing/2014/chartex" xmlns:cx1="http://schemas.microsoft.com/office/drawing/2015/9/8/chartex" xmlns:mc="http://schemas.openxmlformats.org/markup-compatibility/2006" xmlns:o="urn:schemas-microsoft-com:office:office" xmlns:r="http://schemas.openxmlformats.org/officeDocument/2006/relationships" xmlns:m="http://schemas.openxmlformats.org/officeDocument/2006/math" xmlns:v="urn:schemas-microsoft-com:vml" xmlns:wp14="http://schemas.microsoft.com/office/word/2010/wordprocessingDrawing" xmlns:wp="http://schemas.openxmlformats.org/drawingml/2006/wordprocessingDrawing" xmlns:w10="urn:schemas-microsoft-com:office:word" xmlns:w="http://schemas.openxmlformats.org/wordprocessingml/2006/main" xmlns:w14="http://schemas.microsoft.com/office/word/2010/wordml" xmlns:w15="http://schemas.microsoft.com/office/word/2012/wordml" xmlns:w16se="http://schemas.microsoft.com/office/word/2015/wordml/symex" xmlns:wpg="http://schemas.microsoft.com/office/word/2010/wordprocessingGroup" xmlns:wpi="http://schemas.microsoft.com/office/word/2010/wordprocessingInk" xmlns:wne="http://schemas.microsoft.com/office/word/2006/wordml" xmlns:wps="http://schemas.microsoft.com/office/word/2010/wordprocessingShape" mc:Ignorable="w14 w15 w16se wp14">
-  <w:p>
-    <w:pPr>
-      <w:pStyle w:val="Cabealho"/>
-      <w:rPr>
-        <w:rFonts w:hint="eastAsia"/>
-      </w:rPr>
-    </w:pPr>
   </w:p>
 </w:hdr>
 </file>
@@ -50515,7 +54029,7 @@
 </file>
 
 <file path=customXml/itemProps1.xml><?xml version="1.0" encoding="utf-8"?>
-<ds:datastoreItem xmlns:ds="http://schemas.openxmlformats.org/officeDocument/2006/customXml" ds:itemID="{9EB9DAA2-4A7A-48B7-AA22-7925F0E2D156}">
+<ds:datastoreItem xmlns:ds="http://schemas.openxmlformats.org/officeDocument/2006/customXml" ds:itemID="{B4079B6C-4AF1-4177-BBE0-78C7C0C2712F}">
   <ds:schemaRefs>
     <ds:schemaRef ds:uri="http://schemas.openxmlformats.org/officeDocument/2006/bibliography"/>
   </ds:schemaRefs>

</xml_diff>

<commit_message>
Atualiza implementacoes e documentacao do Estoque Contabil
</commit_message>
<xml_diff>
--- a/estoque-contabil/Especificacao_Tecnico_Documental_Estoque_Contabil.docx
+++ b/estoque-contabil/Especificacao_Tecnico_Documental_Estoque_Contabil.docx
@@ -167,7 +167,7 @@
           <w:b/>
           <w:sz w:val="22"/>
         </w:rPr>
-        <w:t xml:space="preserve">o documental 1.28 </w:t>
+        <w:t xml:space="preserve">o documental 1.33 </w:t>
       </w:r>
       <w:r>
         <w:rPr>
@@ -182,7 +182,7 @@
           <w:b/>
           <w:sz w:val="22"/>
         </w:rPr>
-        <w:t xml:space="preserve"> 11 de outubro de 2026</w:t>
+        <w:t xml:space="preserve"> 13 de outubro de 2026</w:t>
       </w:r>
     </w:p>
     <w:p>
@@ -403,7 +403,7 @@
                 <w:rFonts w:hint="eastAsia"/>
                 <w:sz w:val="20"/>
               </w:rPr>
-              <w:t>1.28</w:t>
+              <w:t>1.33</w:t>
             </w:r>
           </w:p>
         </w:tc>
@@ -1169,7 +1169,7 @@
           <w:rFonts w:hint="eastAsia"/>
           <w:sz w:val="21"/>
         </w:rPr>
-        <w:t>17</w:t>
+        <w:t>19</w:t>
       </w:r>
     </w:p>
     <w:p>
@@ -1200,7 +1200,7 @@
           <w:rFonts w:hint="eastAsia"/>
           <w:sz w:val="21"/>
         </w:rPr>
-        <w:t>18</w:t>
+        <w:t>19</w:t>
       </w:r>
     </w:p>
     <w:p>
@@ -1244,7 +1244,7 @@
           <w:rFonts w:hint="eastAsia"/>
           <w:sz w:val="21"/>
         </w:rPr>
-        <w:t>19</w:t>
+        <w:t>20</w:t>
       </w:r>
     </w:p>
     <w:p>
@@ -1275,7 +1275,7 @@
           <w:rFonts w:hint="eastAsia"/>
           <w:sz w:val="21"/>
         </w:rPr>
-        <w:t>21</w:t>
+        <w:t>22</w:t>
       </w:r>
     </w:p>
     <w:p>
@@ -1306,7 +1306,7 @@
           <w:rFonts w:hint="eastAsia"/>
           <w:sz w:val="21"/>
         </w:rPr>
-        <w:t>22</w:t>
+        <w:t>23</w:t>
       </w:r>
     </w:p>
     <w:p>
@@ -1337,7 +1337,7 @@
           <w:rFonts w:hint="eastAsia"/>
           <w:sz w:val="21"/>
         </w:rPr>
-        <w:t>30</w:t>
+        <w:t>32</w:t>
       </w:r>
     </w:p>
     <w:p>
@@ -1369,7 +1369,7 @@
           <w:rFonts w:hint="eastAsia"/>
           <w:sz w:val="21"/>
         </w:rPr>
-        <w:t>33</w:t>
+        <w:t>34</w:t>
       </w:r>
     </w:p>
     <w:p>
@@ -1400,7 +1400,7 @@
           <w:rFonts w:hint="eastAsia"/>
           <w:sz w:val="21"/>
         </w:rPr>
-        <w:t>34</w:t>
+        <w:t>35</w:t>
       </w:r>
     </w:p>
     <w:p>
@@ -1431,7 +1431,7 @@
           <w:rFonts w:hint="eastAsia"/>
           <w:sz w:val="21"/>
         </w:rPr>
-        <w:t>35</w:t>
+        <w:t>37</w:t>
       </w:r>
     </w:p>
     <w:p>
@@ -1488,7 +1488,7 @@
           <w:rFonts w:hint="eastAsia"/>
           <w:sz w:val="21"/>
         </w:rPr>
-        <w:t>41</w:t>
+        <w:t>43</w:t>
       </w:r>
     </w:p>
     <w:p>
@@ -1519,7 +1519,7 @@
           <w:rFonts w:hint="eastAsia"/>
           <w:sz w:val="21"/>
         </w:rPr>
-        <w:t>42</w:t>
+        <w:t>44</w:t>
       </w:r>
     </w:p>
     <w:p>
@@ -1550,7 +1550,7 @@
           <w:rFonts w:hint="eastAsia"/>
           <w:sz w:val="21"/>
         </w:rPr>
-        <w:t>44</w:t>
+        <w:t>46</w:t>
       </w:r>
     </w:p>
     <w:p>
@@ -1581,7 +1581,7 @@
           <w:rFonts w:hint="eastAsia"/>
           <w:sz w:val="21"/>
         </w:rPr>
-        <w:t>44</w:t>
+        <w:t>46</w:t>
       </w:r>
     </w:p>
     <w:p>
@@ -1612,7 +1612,7 @@
           <w:rFonts w:hint="eastAsia"/>
           <w:sz w:val="21"/>
         </w:rPr>
-        <w:t>45</w:t>
+        <w:t>47</w:t>
       </w:r>
     </w:p>
     <w:p>
@@ -1643,7 +1643,7 @@
           <w:rFonts w:hint="eastAsia"/>
           <w:sz w:val="21"/>
         </w:rPr>
-        <w:t>46</w:t>
+        <w:t>48</w:t>
       </w:r>
     </w:p>
     <w:p>
@@ -1700,7 +1700,7 @@
           <w:rFonts w:hint="eastAsia"/>
           <w:sz w:val="21"/>
         </w:rPr>
-        <w:t>46</w:t>
+        <w:t>48</w:t>
       </w:r>
     </w:p>
     <w:p>
@@ -1731,7 +1731,7 @@
           <w:rFonts w:hint="eastAsia"/>
           <w:sz w:val="21"/>
         </w:rPr>
-        <w:t>47</w:t>
+        <w:t>49</w:t>
       </w:r>
     </w:p>
     <w:p>
@@ -6530,7 +6530,19 @@
         <w:rPr>
           <w:sz w:val="22"/>
         </w:rPr>
-        <w:t>1. MB59 da competência por CE &amp; MAT.</w:t>
+        <w:t xml:space="preserve">1. </w:t>
+      </w:r>
+      <w:r>
+        <w:rPr>
+          <w:sz w:val="22"/>
+        </w:rPr>
+        <w:t xml:space="preserve">Base GR do mês por SKU (10 primeiros caracteres do Material): entrada mais recente sem intercompany; Product Offer End Dt = Data de lançamento; Season/Year = coleção do pedido (Base GR / SQVI DOC_COMPRA, </w:t>
+      </w:r>
+      <w:r>
+        <w:rPr>
+          <w:sz w:val="22"/>
+        </w:rPr>
+        <w:t>ver 12.5).</w:t>
       </w:r>
     </w:p>
     <w:p>
@@ -6807,6 +6819,7 @@
               <w:rPr>
                 <w:sz w:val="20"/>
               </w:rPr>
+              <w:lastRenderedPageBreak/>
               <w:t>Base de estoque</w:t>
             </w:r>
           </w:p>
@@ -6862,7 +6875,6 @@
               <w:rPr>
                 <w:sz w:val="20"/>
               </w:rPr>
-              <w:lastRenderedPageBreak/>
               <w:t>Extrações SAP</w:t>
             </w:r>
           </w:p>
@@ -9502,33 +9514,13 @@
         <w:rPr>
           <w:sz w:val="22"/>
         </w:rPr>
-        <w:t>Checklist autom</w:t>
-      </w:r>
-      <w:r>
-        <w:rPr>
-          <w:rFonts w:hint="cs"/>
-          <w:sz w:val="22"/>
-        </w:rPr>
-        <w:t>á</w:t>
-      </w:r>
-      <w:r>
-        <w:rPr>
-          <w:sz w:val="22"/>
-        </w:rPr>
-        <w:t>tico: ZMM119 e MB59 da compet</w:t>
-      </w:r>
-      <w:r>
-        <w:rPr>
-          <w:rFonts w:hint="cs"/>
-          <w:sz w:val="22"/>
-        </w:rPr>
-        <w:t>ê</w:t>
-      </w:r>
-      <w:r>
-        <w:rPr>
-          <w:sz w:val="22"/>
-        </w:rPr>
-        <w:t>ncia, All Brazil do m</w:t>
+        <w:t>Checklist automático: ZMM119 e MB59 da competência, Season e Year dos pedidos (Base GR / SQVI), All Brazil</w:t>
+      </w:r>
+      <w:r>
+        <w:rPr>
+          <w:sz w:val="22"/>
+        </w:rPr>
+        <w:t xml:space="preserve"> do m</w:t>
       </w:r>
       <w:r>
         <w:rPr>
@@ -16791,6 +16783,1701 @@
     </w:p>
     <w:p>
       <w:pPr>
+        <w:pStyle w:val="Ttulo2"/>
+        <w:spacing w:line="252" w:lineRule="auto"/>
+      </w:pPr>
+      <w:r>
+        <w:rPr>
+          <w:rFonts w:ascii="Aptos" w:hAnsi="Aptos" w:hint="eastAsia"/>
+        </w:rPr>
+        <w:t>12.5 Season e Year dos pedidos (Base GR / SQVI DOC_COMPRA)</w:t>
+      </w:r>
+    </w:p>
+    <w:p>
+      <w:pPr>
+        <w:pStyle w:val="Commarcadores"/>
+        <w:spacing w:after="50" w:line="264" w:lineRule="auto"/>
+        <w:rPr>
+          <w:rFonts w:hint="eastAsia"/>
+        </w:rPr>
+      </w:pPr>
+      <w:r>
+        <w:rPr>
+          <w:sz w:val="22"/>
+        </w:rPr>
+        <w:t>Objetivo: Season e Year de cada pedido de compra para o passo 1 do PASSO A PASSO, como no fechamento manual (PROCV da SQVI DOC_COMPRA pelo pedido). Fica em Extra</w:t>
+      </w:r>
+      <w:r>
+        <w:rPr>
+          <w:rFonts w:hint="cs"/>
+          <w:sz w:val="22"/>
+        </w:rPr>
+        <w:t>çõ</w:t>
+      </w:r>
+      <w:r>
+        <w:rPr>
+          <w:sz w:val="22"/>
+        </w:rPr>
+        <w:t xml:space="preserve">es SAP, etapa 3 </w:t>
+      </w:r>
+      <w:r>
+        <w:rPr>
+          <w:sz w:val="22"/>
+        </w:rPr>
+        <w:lastRenderedPageBreak/>
+        <w:t xml:space="preserve">"Season e Year" (quadro "Season e Year dos pedidos </w:t>
+      </w:r>
+      <w:r>
+        <w:rPr>
+          <w:rFonts w:hint="cs"/>
+          <w:sz w:val="22"/>
+        </w:rPr>
+        <w:t>—</w:t>
+      </w:r>
+      <w:r>
+        <w:rPr>
+          <w:sz w:val="22"/>
+        </w:rPr>
+        <w:t xml:space="preserve"> Base GR / SQVI DOC_COMP</w:t>
+      </w:r>
+      <w:r>
+        <w:rPr>
+          <w:rFonts w:hint="eastAsia"/>
+          <w:sz w:val="22"/>
+        </w:rPr>
+        <w:t>RA"; administradores).</w:t>
+      </w:r>
+    </w:p>
+    <w:p>
+      <w:pPr>
+        <w:pStyle w:val="Commarcadores"/>
+        <w:spacing w:after="50" w:line="264" w:lineRule="auto"/>
+        <w:rPr>
+          <w:rFonts w:hint="eastAsia"/>
+        </w:rPr>
+      </w:pPr>
+      <w:r>
+        <w:rPr>
+          <w:sz w:val="22"/>
+        </w:rPr>
+        <w:t>Regra do passo 1: por SKU (10 primeiros caracteres do Material, todos os centros), a entrada mais recente do m</w:t>
+      </w:r>
+      <w:r>
+        <w:rPr>
+          <w:rFonts w:hint="cs"/>
+          <w:sz w:val="22"/>
+        </w:rPr>
+        <w:t>ê</w:t>
+      </w:r>
+      <w:r>
+        <w:rPr>
+          <w:sz w:val="22"/>
+        </w:rPr>
+        <w:t>s na MB59, sem intercompany (fornecedores 7008002 e 7008004); Product Offer End Dt = Data de lan</w:t>
+      </w:r>
+      <w:r>
+        <w:rPr>
+          <w:rFonts w:hint="cs"/>
+          <w:sz w:val="22"/>
+        </w:rPr>
+        <w:t>ç</w:t>
+      </w:r>
+      <w:r>
+        <w:rPr>
+          <w:sz w:val="22"/>
+        </w:rPr>
+        <w:t>amento; Season/Year = cole</w:t>
+      </w:r>
+      <w:r>
+        <w:rPr>
+          <w:rFonts w:hint="cs"/>
+          <w:sz w:val="22"/>
+        </w:rPr>
+        <w:t>çã</w:t>
+      </w:r>
+      <w:r>
+        <w:rPr>
+          <w:sz w:val="22"/>
+        </w:rPr>
+        <w:t>o do pedido dessa entrada. Sem cole</w:t>
+      </w:r>
+      <w:r>
+        <w:rPr>
+          <w:rFonts w:hint="cs"/>
+          <w:sz w:val="22"/>
+        </w:rPr>
+        <w:t>çã</w:t>
+      </w:r>
+      <w:r>
+        <w:rPr>
+          <w:sz w:val="22"/>
+        </w:rPr>
+        <w:t>o carregada, s</w:t>
+      </w:r>
+      <w:r>
+        <w:rPr>
+          <w:rFonts w:hint="cs"/>
+          <w:sz w:val="22"/>
+        </w:rPr>
+        <w:t>ó</w:t>
+      </w:r>
+      <w:r>
+        <w:rPr>
+          <w:sz w:val="22"/>
+        </w:rPr>
+        <w:t xml:space="preserve"> a data vem do passo 1.</w:t>
+      </w:r>
+    </w:p>
+    <w:p>
+      <w:pPr>
+        <w:pStyle w:val="Commarcadores"/>
+        <w:spacing w:after="50" w:line="264" w:lineRule="auto"/>
+        <w:rPr>
+          <w:rFonts w:hint="eastAsia"/>
+        </w:rPr>
+      </w:pPr>
+      <w:r>
+        <w:rPr>
+          <w:sz w:val="22"/>
+        </w:rPr>
+        <w:t xml:space="preserve">Arquivo aceito 1 </w:t>
+      </w:r>
+      <w:r>
+        <w:rPr>
+          <w:rFonts w:hint="cs"/>
+          <w:sz w:val="22"/>
+        </w:rPr>
+        <w:t>—</w:t>
+      </w:r>
+      <w:r>
+        <w:rPr>
+          <w:sz w:val="22"/>
+        </w:rPr>
+        <w:t xml:space="preserve"> Base GR montada pela </w:t>
+      </w:r>
+      <w:r>
+        <w:rPr>
+          <w:rFonts w:hint="cs"/>
+          <w:sz w:val="22"/>
+        </w:rPr>
+        <w:t>á</w:t>
+      </w:r>
+      <w:r>
+        <w:rPr>
+          <w:sz w:val="22"/>
+        </w:rPr>
+        <w:t>rea (ex.: 5-MB59_BASE GR_ENTRADAS SETEMBRO - SEASON.xlsx): aba BASE com Material, Centro, Data de lan</w:t>
+      </w:r>
+      <w:r>
+        <w:rPr>
+          <w:rFonts w:hint="cs"/>
+          <w:sz w:val="22"/>
+        </w:rPr>
+        <w:t>ç</w:t>
+      </w:r>
+      <w:r>
+        <w:rPr>
+          <w:sz w:val="22"/>
+        </w:rPr>
+        <w:t>amento, Pedido, Fornecedor, Season e Year (valores do PROCV da SQVI pelo pedido). Recusada se a Season vier de PROCV pelo SKU na aba PE ou se os lan</w:t>
+      </w:r>
+      <w:r>
+        <w:rPr>
+          <w:rFonts w:hint="cs"/>
+          <w:sz w:val="22"/>
+        </w:rPr>
+        <w:t>ç</w:t>
+      </w:r>
+      <w:r>
+        <w:rPr>
+          <w:sz w:val="22"/>
+        </w:rPr>
+        <w:t>amentos forem de outra compet</w:t>
+      </w:r>
+      <w:r>
+        <w:rPr>
+          <w:rFonts w:hint="cs"/>
+          <w:sz w:val="22"/>
+        </w:rPr>
+        <w:t>ê</w:t>
+      </w:r>
+      <w:r>
+        <w:rPr>
+          <w:sz w:val="22"/>
+        </w:rPr>
+        <w:t>ncia.</w:t>
+      </w:r>
+    </w:p>
+    <w:p>
+      <w:pPr>
+        <w:pStyle w:val="Commarcadores"/>
+        <w:spacing w:after="50" w:line="264" w:lineRule="auto"/>
+        <w:rPr>
+          <w:rFonts w:hint="eastAsia"/>
+        </w:rPr>
+      </w:pPr>
+      <w:r>
+        <w:rPr>
+          <w:sz w:val="22"/>
+        </w:rPr>
+        <w:t xml:space="preserve">Arquivo aceito 2 </w:t>
+      </w:r>
+      <w:r>
+        <w:rPr>
+          <w:rFonts w:hint="cs"/>
+          <w:sz w:val="22"/>
+        </w:rPr>
+        <w:t>—</w:t>
+      </w:r>
+      <w:r>
+        <w:rPr>
+          <w:sz w:val="22"/>
+        </w:rPr>
+        <w:t xml:space="preserve"> export da SQVI DOC_COMPRA (ex.: Suporte SQVI.xlsx): Doc.compra (pedido), C</w:t>
+      </w:r>
+      <w:r>
+        <w:rPr>
+          <w:rFonts w:hint="cs"/>
+          <w:sz w:val="22"/>
+        </w:rPr>
+        <w:t>ó</w:t>
+      </w:r>
+      <w:r>
+        <w:rPr>
+          <w:sz w:val="22"/>
+        </w:rPr>
+        <w:t>digo cole</w:t>
+      </w:r>
+      <w:r>
+        <w:rPr>
+          <w:rFonts w:hint="cs"/>
+          <w:sz w:val="22"/>
+        </w:rPr>
+        <w:t>çã</w:t>
+      </w:r>
+      <w:r>
+        <w:rPr>
+          <w:sz w:val="22"/>
+        </w:rPr>
+        <w:t>o (Season), Ano cole</w:t>
+      </w:r>
+      <w:r>
+        <w:rPr>
+          <w:rFonts w:hint="cs"/>
+          <w:sz w:val="22"/>
+        </w:rPr>
+        <w:t>çã</w:t>
+      </w:r>
+      <w:r>
+        <w:rPr>
+          <w:sz w:val="22"/>
+        </w:rPr>
+        <w:t>o (Year) e Empr (s</w:t>
+      </w:r>
+      <w:r>
+        <w:rPr>
+          <w:rFonts w:hint="cs"/>
+          <w:sz w:val="22"/>
+        </w:rPr>
+        <w:t>ó</w:t>
+      </w:r>
+      <w:r>
+        <w:rPr>
+          <w:sz w:val="22"/>
+        </w:rPr>
+        <w:t xml:space="preserve"> 7170). Demais colunas ignoradas. Valida</w:t>
+      </w:r>
+      <w:r>
+        <w:rPr>
+          <w:rFonts w:hint="cs"/>
+          <w:sz w:val="22"/>
+        </w:rPr>
+        <w:t>çõ</w:t>
+      </w:r>
+      <w:r>
+        <w:rPr>
+          <w:sz w:val="22"/>
+        </w:rPr>
+        <w:t>es: Season FA/HO/SP/SU, Year com 4 d</w:t>
+      </w:r>
+      <w:r>
+        <w:rPr>
+          <w:rFonts w:hint="cs"/>
+          <w:sz w:val="22"/>
+        </w:rPr>
+        <w:t>í</w:t>
+      </w:r>
+      <w:r>
+        <w:rPr>
+          <w:sz w:val="22"/>
+        </w:rPr>
+        <w:t>gitos, uma cole</w:t>
+      </w:r>
+      <w:r>
+        <w:rPr>
+          <w:rFonts w:hint="cs"/>
+          <w:sz w:val="22"/>
+        </w:rPr>
+        <w:t>çã</w:t>
+      </w:r>
+      <w:r>
+        <w:rPr>
+          <w:sz w:val="22"/>
+        </w:rPr>
+        <w:t xml:space="preserve">o por pedido </w:t>
+      </w:r>
+      <w:r>
+        <w:rPr>
+          <w:rFonts w:hint="eastAsia"/>
+          <w:sz w:val="22"/>
+        </w:rPr>
+        <w:t>(conflitos informados).</w:t>
+      </w:r>
+    </w:p>
+    <w:p>
+      <w:pPr>
+        <w:pStyle w:val="Commarcadores"/>
+        <w:spacing w:after="50" w:line="264" w:lineRule="auto"/>
+        <w:rPr>
+          <w:rFonts w:hint="eastAsia"/>
+        </w:rPr>
+      </w:pPr>
+      <w:r>
+        <w:rPr>
+          <w:sz w:val="22"/>
+        </w:rPr>
+        <w:t>Apoio: bot</w:t>
+      </w:r>
+      <w:r>
+        <w:rPr>
+          <w:rFonts w:hint="cs"/>
+          <w:sz w:val="22"/>
+        </w:rPr>
+        <w:t>ã</w:t>
+      </w:r>
+      <w:r>
+        <w:rPr>
+          <w:sz w:val="22"/>
+        </w:rPr>
+        <w:t>o "Copiar pedidos da MB59" (pedidos do m</w:t>
+      </w:r>
+      <w:r>
+        <w:rPr>
+          <w:rFonts w:hint="cs"/>
+          <w:sz w:val="22"/>
+        </w:rPr>
+        <w:t>ê</w:t>
+      </w:r>
+      <w:r>
+        <w:rPr>
+          <w:sz w:val="22"/>
+        </w:rPr>
+        <w:t>s sem intercompany, para a sele</w:t>
+      </w:r>
+      <w:r>
+        <w:rPr>
+          <w:rFonts w:hint="cs"/>
+          <w:sz w:val="22"/>
+        </w:rPr>
+        <w:t>çã</w:t>
+      </w:r>
+      <w:r>
+        <w:rPr>
+          <w:sz w:val="22"/>
+        </w:rPr>
+        <w:t>o m</w:t>
+      </w:r>
+      <w:r>
+        <w:rPr>
+          <w:rFonts w:hint="cs"/>
+          <w:sz w:val="22"/>
+        </w:rPr>
+        <w:t>ú</w:t>
+      </w:r>
+      <w:r>
+        <w:rPr>
+          <w:sz w:val="22"/>
+        </w:rPr>
+        <w:t>ltipla da SQVI). Depois da carga: rec</w:t>
+      </w:r>
+      <w:r>
+        <w:rPr>
+          <w:rFonts w:hint="cs"/>
+          <w:sz w:val="22"/>
+        </w:rPr>
+        <w:t>á</w:t>
+      </w:r>
+      <w:r>
+        <w:rPr>
+          <w:sz w:val="22"/>
+        </w:rPr>
+        <w:t>lculo do PASSO A PASSO e do Mapping, ponte do Drive, cobertura dos pedidos da MB59 no quadro e item no checklist da Agenda de fe</w:t>
+      </w:r>
+      <w:r>
+        <w:rPr>
+          <w:rFonts w:hint="eastAsia"/>
+          <w:sz w:val="22"/>
+        </w:rPr>
+        <w:t>chamento.</w:t>
+      </w:r>
+    </w:p>
+    <w:p>
+      <w:pPr>
+        <w:pStyle w:val="Commarcadores"/>
+        <w:spacing w:after="50" w:line="264" w:lineRule="auto"/>
+        <w:rPr>
+          <w:rFonts w:hint="eastAsia"/>
+        </w:rPr>
+      </w:pPr>
+      <w:r>
+        <w:rPr>
+          <w:sz w:val="22"/>
+        </w:rPr>
+        <w:t>Meses antigos: compet</w:t>
+      </w:r>
+      <w:r>
+        <w:rPr>
+          <w:rFonts w:hint="cs"/>
+          <w:sz w:val="22"/>
+        </w:rPr>
+        <w:t>ê</w:t>
+      </w:r>
+      <w:r>
+        <w:rPr>
+          <w:sz w:val="22"/>
+        </w:rPr>
+        <w:t>ncias com MB59 carregada antes desta regra seguem a regra anterior (MB59 por CE &amp; MAT) at</w:t>
+      </w:r>
+      <w:r>
+        <w:rPr>
+          <w:rFonts w:hint="cs"/>
+          <w:sz w:val="22"/>
+        </w:rPr>
+        <w:t>é</w:t>
+      </w:r>
+      <w:r>
+        <w:rPr>
+          <w:sz w:val="22"/>
+        </w:rPr>
+        <w:t xml:space="preserve"> a carga da cole</w:t>
+      </w:r>
+      <w:r>
+        <w:rPr>
+          <w:rFonts w:hint="cs"/>
+          <w:sz w:val="22"/>
+        </w:rPr>
+        <w:t>çã</w:t>
+      </w:r>
+      <w:r>
+        <w:rPr>
+          <w:sz w:val="22"/>
+        </w:rPr>
+        <w:t>o; nesse momento a MB59 j</w:t>
+      </w:r>
+      <w:r>
+        <w:rPr>
+          <w:rFonts w:hint="cs"/>
+          <w:sz w:val="22"/>
+        </w:rPr>
+        <w:t>á</w:t>
+      </w:r>
+      <w:r>
+        <w:rPr>
+          <w:sz w:val="22"/>
+        </w:rPr>
+        <w:t xml:space="preserve"> salva </w:t>
+      </w:r>
+      <w:r>
+        <w:rPr>
+          <w:rFonts w:hint="cs"/>
+          <w:sz w:val="22"/>
+        </w:rPr>
+        <w:t>é</w:t>
+      </w:r>
+      <w:r>
+        <w:rPr>
+          <w:sz w:val="22"/>
+        </w:rPr>
+        <w:t xml:space="preserve"> reprocessada sozinha (julho, agosto e setembro podem ser atualizados sem nova extra</w:t>
+      </w:r>
+      <w:r>
+        <w:rPr>
+          <w:rFonts w:hint="cs"/>
+          <w:sz w:val="22"/>
+        </w:rPr>
+        <w:t>çã</w:t>
+      </w:r>
+      <w:r>
+        <w:rPr>
+          <w:sz w:val="22"/>
+        </w:rPr>
+        <w:t>o).</w:t>
+      </w:r>
+    </w:p>
+    <w:p>
+      <w:pPr>
+        <w:pStyle w:val="Commarcadores"/>
+        <w:spacing w:after="50" w:line="264" w:lineRule="auto"/>
+        <w:rPr>
+          <w:rFonts w:hint="eastAsia"/>
+        </w:rPr>
+      </w:pPr>
+      <w:r>
+        <w:rPr>
+          <w:sz w:val="22"/>
+        </w:rPr>
+        <w:t>Valida</w:t>
+      </w:r>
+      <w:r>
+        <w:rPr>
+          <w:rFonts w:hint="cs"/>
+          <w:sz w:val="22"/>
+        </w:rPr>
+        <w:t>çã</w:t>
+      </w:r>
+      <w:r>
+        <w:rPr>
+          <w:sz w:val="22"/>
+        </w:rPr>
+        <w:t xml:space="preserve">o (setembro/2026, Base GR integral da </w:t>
+      </w:r>
+      <w:r>
+        <w:rPr>
+          <w:rFonts w:hint="cs"/>
+          <w:sz w:val="22"/>
+        </w:rPr>
+        <w:t>á</w:t>
+      </w:r>
+      <w:r>
+        <w:rPr>
+          <w:sz w:val="22"/>
+        </w:rPr>
+        <w:t>rea): 85.236 linhas da posi</w:t>
+      </w:r>
+      <w:r>
+        <w:rPr>
+          <w:rFonts w:hint="cs"/>
+          <w:sz w:val="22"/>
+        </w:rPr>
+        <w:t>çã</w:t>
+      </w:r>
+      <w:r>
+        <w:rPr>
+          <w:sz w:val="22"/>
+        </w:rPr>
+        <w:t>o pelo passo 1 conferem 100% com o c</w:t>
+      </w:r>
+      <w:r>
+        <w:rPr>
+          <w:rFonts w:hint="cs"/>
+          <w:sz w:val="22"/>
+        </w:rPr>
+        <w:t>á</w:t>
+      </w:r>
+      <w:r>
+        <w:rPr>
+          <w:sz w:val="22"/>
+        </w:rPr>
+        <w:t>lculo na pr</w:t>
+      </w:r>
+      <w:r>
+        <w:rPr>
+          <w:rFonts w:hint="cs"/>
+          <w:sz w:val="22"/>
+        </w:rPr>
+        <w:t>ó</w:t>
+      </w:r>
+      <w:r>
+        <w:rPr>
+          <w:sz w:val="22"/>
+        </w:rPr>
+        <w:t>pria Base GR; valor fiscal inalterado. T</w:t>
+      </w:r>
+      <w:r>
+        <w:rPr>
+          <w:rFonts w:hint="cs"/>
+          <w:sz w:val="22"/>
+        </w:rPr>
+        <w:t>é</w:t>
+      </w:r>
+      <w:r>
+        <w:rPr>
+          <w:sz w:val="22"/>
+        </w:rPr>
+        <w:t>cnico: gr_collection.py, tabelas mb59_sku_entries, mb59_orders, gr_collection_rows e gr_c</w:t>
+      </w:r>
+      <w:r>
+        <w:rPr>
+          <w:rFonts w:hint="eastAsia"/>
+          <w:sz w:val="22"/>
+        </w:rPr>
+        <w:t>ollection_imports; teste tests/test_gr_collection.py.</w:t>
+      </w:r>
+    </w:p>
+    <w:p>
+      <w:pPr>
+        <w:pStyle w:val="Commarcadores"/>
+        <w:spacing w:after="50" w:line="264" w:lineRule="auto"/>
+        <w:rPr>
+          <w:rFonts w:hint="eastAsia"/>
+        </w:rPr>
+      </w:pPr>
+      <w:r>
+        <w:rPr>
+          <w:sz w:val="22"/>
+        </w:rPr>
+        <w:t>Layout da p</w:t>
+      </w:r>
+      <w:r>
+        <w:rPr>
+          <w:rFonts w:hint="cs"/>
+          <w:sz w:val="22"/>
+        </w:rPr>
+        <w:t>á</w:t>
+      </w:r>
+      <w:r>
+        <w:rPr>
+          <w:sz w:val="22"/>
+        </w:rPr>
+        <w:t>gina Extra</w:t>
+      </w:r>
+      <w:r>
+        <w:rPr>
+          <w:rFonts w:hint="cs"/>
+          <w:sz w:val="22"/>
+        </w:rPr>
+        <w:t>çõ</w:t>
+      </w:r>
+      <w:r>
+        <w:rPr>
+          <w:sz w:val="22"/>
+        </w:rPr>
+        <w:t>es SAP (1.30): tr</w:t>
+      </w:r>
+      <w:r>
+        <w:rPr>
+          <w:rFonts w:hint="cs"/>
+          <w:sz w:val="22"/>
+        </w:rPr>
+        <w:t>ê</w:t>
+      </w:r>
+      <w:r>
+        <w:rPr>
+          <w:sz w:val="22"/>
+        </w:rPr>
+        <w:t>s etapas clic</w:t>
+      </w:r>
+      <w:r>
+        <w:rPr>
+          <w:rFonts w:hint="cs"/>
+          <w:sz w:val="22"/>
+        </w:rPr>
+        <w:t>á</w:t>
+      </w:r>
+      <w:r>
+        <w:rPr>
+          <w:sz w:val="22"/>
+        </w:rPr>
+        <w:t xml:space="preserve">veis no alto </w:t>
+      </w:r>
+      <w:r>
+        <w:rPr>
+          <w:rFonts w:hint="cs"/>
+          <w:sz w:val="22"/>
+        </w:rPr>
+        <w:t>—</w:t>
+      </w:r>
+      <w:r>
+        <w:rPr>
+          <w:sz w:val="22"/>
+        </w:rPr>
+        <w:t xml:space="preserve"> 1 ZMM119 (posi</w:t>
+      </w:r>
+      <w:r>
+        <w:rPr>
+          <w:rFonts w:hint="cs"/>
+          <w:sz w:val="22"/>
+        </w:rPr>
+        <w:t>çã</w:t>
+      </w:r>
+      <w:r>
+        <w:rPr>
+          <w:sz w:val="22"/>
+        </w:rPr>
+        <w:t>o de estoque), 2 MB59 (entradas do m</w:t>
+      </w:r>
+      <w:r>
+        <w:rPr>
+          <w:rFonts w:hint="cs"/>
+          <w:sz w:val="22"/>
+        </w:rPr>
+        <w:t>ê</w:t>
+      </w:r>
+      <w:r>
+        <w:rPr>
+          <w:sz w:val="22"/>
+        </w:rPr>
+        <w:t>s) e 3 Season e Year (cole</w:t>
+      </w:r>
+      <w:r>
+        <w:rPr>
+          <w:rFonts w:hint="cs"/>
+          <w:sz w:val="22"/>
+        </w:rPr>
+        <w:t>çã</w:t>
+      </w:r>
+      <w:r>
+        <w:rPr>
+          <w:sz w:val="22"/>
+        </w:rPr>
+        <w:t xml:space="preserve">o dos pedidos) </w:t>
+      </w:r>
+      <w:r>
+        <w:rPr>
+          <w:rFonts w:hint="cs"/>
+          <w:sz w:val="22"/>
+        </w:rPr>
+        <w:t>—</w:t>
+      </w:r>
+      <w:r>
+        <w:rPr>
+          <w:sz w:val="22"/>
+        </w:rPr>
+        <w:t>, cada uma com a situa</w:t>
+      </w:r>
+      <w:r>
+        <w:rPr>
+          <w:rFonts w:hint="cs"/>
+          <w:sz w:val="22"/>
+        </w:rPr>
+        <w:t>çã</w:t>
+      </w:r>
+      <w:r>
+        <w:rPr>
+          <w:sz w:val="22"/>
+        </w:rPr>
+        <w:t>o da compet</w:t>
+      </w:r>
+      <w:r>
+        <w:rPr>
+          <w:rFonts w:hint="cs"/>
+          <w:sz w:val="22"/>
+        </w:rPr>
+        <w:t>ê</w:t>
+      </w:r>
+      <w:r>
+        <w:rPr>
+          <w:sz w:val="22"/>
+        </w:rPr>
+        <w:t>ncia (</w:t>
+      </w:r>
+      <w:r>
+        <w:rPr>
+          <w:rFonts w:ascii="Segoe UI Symbol" w:hAnsi="Segoe UI Symbol" w:cs="Segoe UI Symbol"/>
+          <w:sz w:val="22"/>
+        </w:rPr>
+        <w:t>✓</w:t>
+      </w:r>
+      <w:r>
+        <w:rPr>
+          <w:sz w:val="22"/>
+        </w:rPr>
+        <w:t xml:space="preserve"> data da carga, </w:t>
+      </w:r>
+      <w:r>
+        <w:rPr>
+          <w:rFonts w:ascii="Segoe UI Symbol" w:hAnsi="Segoe UI Symbol" w:cs="Segoe UI Symbol"/>
+          <w:sz w:val="22"/>
+        </w:rPr>
+        <w:t>✓</w:t>
+      </w:r>
+      <w:r>
+        <w:rPr>
+          <w:sz w:val="22"/>
+        </w:rPr>
+        <w:t xml:space="preserve"> % de cobertura ou "pendente", via /api/sap/month-status). S</w:t>
+      </w:r>
+      <w:r>
+        <w:rPr>
+          <w:rFonts w:hint="cs"/>
+          <w:sz w:val="22"/>
+        </w:rPr>
+        <w:t>ó</w:t>
+      </w:r>
+      <w:r>
+        <w:rPr>
+          <w:sz w:val="22"/>
+        </w:rPr>
+        <w:t xml:space="preserve"> o quadro da etapa escolhida aparece (a p</w:t>
+      </w:r>
+      <w:r>
+        <w:rPr>
+          <w:rFonts w:hint="cs"/>
+          <w:sz w:val="22"/>
+        </w:rPr>
+        <w:t>á</w:t>
+      </w:r>
+      <w:r>
+        <w:rPr>
+          <w:sz w:val="22"/>
+        </w:rPr>
+        <w:t xml:space="preserve">gina lembra a </w:t>
+      </w:r>
+      <w:r>
+        <w:rPr>
+          <w:rFonts w:hint="cs"/>
+          <w:sz w:val="22"/>
+        </w:rPr>
+        <w:t>ú</w:t>
+      </w:r>
+      <w:r>
+        <w:rPr>
+          <w:sz w:val="22"/>
+        </w:rPr>
+        <w:t>ltima); ZMM119 e MB59 em duas colunas (par</w:t>
+      </w:r>
+      <w:r>
+        <w:rPr>
+          <w:rFonts w:hint="cs"/>
+          <w:sz w:val="22"/>
+        </w:rPr>
+        <w:t>â</w:t>
+      </w:r>
+      <w:r>
+        <w:rPr>
+          <w:sz w:val="22"/>
+        </w:rPr>
+        <w:t xml:space="preserve">metros e Executar </w:t>
+      </w:r>
+      <w:r>
+        <w:rPr>
+          <w:rFonts w:hint="cs"/>
+          <w:sz w:val="22"/>
+        </w:rPr>
+        <w:t>à</w:t>
+      </w:r>
+      <w:r>
+        <w:rPr>
+          <w:sz w:val="22"/>
+        </w:rPr>
+        <w:t xml:space="preserve"> esquerda, conting</w:t>
+      </w:r>
+      <w:r>
+        <w:rPr>
+          <w:rFonts w:hint="cs"/>
+          <w:sz w:val="22"/>
+        </w:rPr>
+        <w:t>ê</w:t>
+      </w:r>
+      <w:r>
+        <w:rPr>
+          <w:sz w:val="22"/>
+        </w:rPr>
+        <w:t xml:space="preserve">ncia por planilha </w:t>
+      </w:r>
+      <w:r>
+        <w:rPr>
+          <w:rFonts w:hint="cs"/>
+          <w:sz w:val="22"/>
+        </w:rPr>
+        <w:t>à</w:t>
+      </w:r>
+      <w:r>
+        <w:rPr>
+          <w:sz w:val="22"/>
+        </w:rPr>
+        <w:t xml:space="preserve"> direita). "Execu</w:t>
+      </w:r>
+      <w:r>
+        <w:rPr>
+          <w:rFonts w:hint="cs"/>
+          <w:sz w:val="22"/>
+        </w:rPr>
+        <w:t>çõ</w:t>
+      </w:r>
+      <w:r>
+        <w:rPr>
+          <w:sz w:val="22"/>
+        </w:rPr>
+        <w:t>es atuais" segue sempre vis</w:t>
+      </w:r>
+      <w:r>
+        <w:rPr>
+          <w:rFonts w:hint="cs"/>
+          <w:sz w:val="22"/>
+        </w:rPr>
+        <w:t>í</w:t>
+      </w:r>
+      <w:r>
+        <w:rPr>
+          <w:sz w:val="22"/>
+        </w:rPr>
+        <w:t>vel abaixo. Qualq</w:t>
+      </w:r>
+      <w:r>
+        <w:rPr>
+          <w:rFonts w:hint="eastAsia"/>
+          <w:sz w:val="22"/>
+        </w:rPr>
+        <w:t>uer ordem de carga funciona: cada uma recalcula o PASSO A PASSO e o Mapping.</w:t>
+      </w:r>
+    </w:p>
+    <w:p>
+      <w:pPr>
+        <w:pStyle w:val="Commarcadores"/>
+        <w:spacing w:after="50" w:line="264" w:lineRule="auto"/>
+        <w:rPr>
+          <w:rFonts w:hint="eastAsia"/>
+        </w:rPr>
+      </w:pPr>
+      <w:r>
+        <w:rPr>
+          <w:sz w:val="22"/>
+        </w:rPr>
+        <w:t xml:space="preserve">Estrutura aceita (1.32): .xlsx com qualquer aba (a BASE </w:t>
+      </w:r>
+      <w:r>
+        <w:rPr>
+          <w:rFonts w:hint="cs"/>
+          <w:sz w:val="22"/>
+        </w:rPr>
+        <w:t>é</w:t>
+      </w:r>
+      <w:r>
+        <w:rPr>
+          <w:sz w:val="22"/>
+        </w:rPr>
+        <w:t xml:space="preserve"> lida primeiro) e cabe</w:t>
+      </w:r>
+      <w:r>
+        <w:rPr>
+          <w:rFonts w:hint="cs"/>
+          <w:sz w:val="22"/>
+        </w:rPr>
+        <w:t>ç</w:t>
+      </w:r>
+      <w:r>
+        <w:rPr>
+          <w:sz w:val="22"/>
+        </w:rPr>
+        <w:t>alho em qualquer uma das 15 primeiras linhas; ordem, mai</w:t>
+      </w:r>
+      <w:r>
+        <w:rPr>
+          <w:rFonts w:hint="cs"/>
+          <w:sz w:val="22"/>
+        </w:rPr>
+        <w:t>ú</w:t>
+      </w:r>
+      <w:r>
+        <w:rPr>
+          <w:sz w:val="22"/>
+        </w:rPr>
+        <w:t xml:space="preserve">sculas e acentos indiferentes; colunas e abas a mais ignoradas. Base GR </w:t>
+      </w:r>
+      <w:r>
+        <w:rPr>
+          <w:rFonts w:hint="cs"/>
+          <w:sz w:val="22"/>
+        </w:rPr>
+        <w:t>—</w:t>
+      </w:r>
+      <w:r>
+        <w:rPr>
+          <w:sz w:val="22"/>
+        </w:rPr>
+        <w:t xml:space="preserve"> obrigat</w:t>
+      </w:r>
+      <w:r>
+        <w:rPr>
+          <w:rFonts w:hint="cs"/>
+          <w:sz w:val="22"/>
+        </w:rPr>
+        <w:t>ó</w:t>
+      </w:r>
+      <w:r>
+        <w:rPr>
+          <w:sz w:val="22"/>
+        </w:rPr>
+        <w:t>rias Material, Pedido, Season e Year; recomendadas Fornecedor (intercompany) e Data de lan</w:t>
+      </w:r>
+      <w:r>
+        <w:rPr>
+          <w:rFonts w:hint="cs"/>
+          <w:sz w:val="22"/>
+        </w:rPr>
+        <w:t>ç</w:t>
+      </w:r>
+      <w:r>
+        <w:rPr>
+          <w:sz w:val="22"/>
+        </w:rPr>
+        <w:t>amento (compet</w:t>
+      </w:r>
+      <w:r>
+        <w:rPr>
+          <w:rFonts w:hint="cs"/>
+          <w:sz w:val="22"/>
+        </w:rPr>
+        <w:t>ê</w:t>
+      </w:r>
+      <w:r>
+        <w:rPr>
+          <w:sz w:val="22"/>
+        </w:rPr>
+        <w:t xml:space="preserve">ncia). SQVI </w:t>
+      </w:r>
+      <w:r>
+        <w:rPr>
+          <w:rFonts w:hint="cs"/>
+          <w:sz w:val="22"/>
+        </w:rPr>
+        <w:t>—</w:t>
+      </w:r>
+      <w:r>
+        <w:rPr>
+          <w:sz w:val="22"/>
+        </w:rPr>
+        <w:t xml:space="preserve"> obrigat</w:t>
+      </w:r>
+      <w:r>
+        <w:rPr>
+          <w:rFonts w:hint="cs"/>
+          <w:sz w:val="22"/>
+        </w:rPr>
+        <w:t>ó</w:t>
+      </w:r>
+      <w:r>
+        <w:rPr>
+          <w:sz w:val="22"/>
+        </w:rPr>
+        <w:t>rias Doc.compra (ou N</w:t>
+      </w:r>
+      <w:r>
+        <w:rPr>
+          <w:rFonts w:hint="cs"/>
+          <w:sz w:val="22"/>
+        </w:rPr>
+        <w:t>º</w:t>
+      </w:r>
+      <w:r>
+        <w:rPr>
+          <w:sz w:val="22"/>
+        </w:rPr>
+        <w:t xml:space="preserve"> do documento de compras), C</w:t>
+      </w:r>
+      <w:r>
+        <w:rPr>
+          <w:rFonts w:hint="cs"/>
+          <w:sz w:val="22"/>
+        </w:rPr>
+        <w:t>ó</w:t>
+      </w:r>
+      <w:r>
+        <w:rPr>
+          <w:sz w:val="22"/>
+        </w:rPr>
+        <w:t>digo cole</w:t>
+      </w:r>
+      <w:r>
+        <w:rPr>
+          <w:rFonts w:hint="cs"/>
+          <w:sz w:val="22"/>
+        </w:rPr>
+        <w:t>çã</w:t>
+      </w:r>
+      <w:r>
+        <w:rPr>
+          <w:sz w:val="22"/>
+        </w:rPr>
+        <w:t>o e Ano cole</w:t>
+      </w:r>
+      <w:r>
+        <w:rPr>
+          <w:rFonts w:hint="cs"/>
+          <w:sz w:val="22"/>
+        </w:rPr>
+        <w:t>çã</w:t>
+      </w:r>
+      <w:r>
+        <w:rPr>
+          <w:sz w:val="22"/>
+        </w:rPr>
+        <w:t>o; Empr opcional. Formato m</w:t>
+      </w:r>
+      <w:r>
+        <w:rPr>
+          <w:rFonts w:hint="cs"/>
+          <w:sz w:val="22"/>
+        </w:rPr>
+        <w:t>í</w:t>
+      </w:r>
+      <w:r>
+        <w:rPr>
+          <w:sz w:val="22"/>
+        </w:rPr>
+        <w:t>nimo: uma aba s</w:t>
+      </w:r>
+      <w:r>
+        <w:rPr>
+          <w:rFonts w:hint="cs"/>
+          <w:sz w:val="22"/>
+        </w:rPr>
+        <w:t>ó</w:t>
+      </w:r>
+      <w:r>
+        <w:rPr>
+          <w:sz w:val="22"/>
+        </w:rPr>
+        <w:t xml:space="preserve"> com as 3 colunas da SQVI. N</w:t>
+      </w:r>
+      <w:r>
+        <w:rPr>
+          <w:rFonts w:hint="cs"/>
+          <w:sz w:val="22"/>
+        </w:rPr>
+        <w:t>ã</w:t>
+      </w:r>
+      <w:r>
+        <w:rPr>
+          <w:sz w:val="22"/>
+        </w:rPr>
+        <w:t>o reconhecido: s</w:t>
+      </w:r>
+      <w:r>
+        <w:rPr>
+          <w:rFonts w:hint="cs"/>
+          <w:sz w:val="22"/>
+        </w:rPr>
+        <w:t>ó</w:t>
+      </w:r>
+      <w:r>
+        <w:rPr>
+          <w:sz w:val="22"/>
+        </w:rPr>
+        <w:t xml:space="preserve"> Pedido, Season e Year (sem Material e sem os nomes da SQVI). Recusados: Season pelo SKU na aba PE, #N/D ou f</w:t>
+      </w:r>
+      <w:r>
+        <w:rPr>
+          <w:rFonts w:hint="cs"/>
+          <w:sz w:val="22"/>
+        </w:rPr>
+        <w:t>ó</w:t>
+      </w:r>
+      <w:r>
+        <w:rPr>
+          <w:sz w:val="22"/>
+        </w:rPr>
+        <w:t>rmula n</w:t>
+      </w:r>
+      <w:r>
+        <w:rPr>
+          <w:rFonts w:hint="cs"/>
+          <w:sz w:val="22"/>
+        </w:rPr>
+        <w:t>ã</w:t>
+      </w:r>
+      <w:r>
+        <w:rPr>
+          <w:sz w:val="22"/>
+        </w:rPr>
+        <w:t>o calculada, outra compet</w:t>
+      </w:r>
+      <w:r>
+        <w:rPr>
+          <w:rFonts w:hint="cs"/>
+          <w:sz w:val="22"/>
+        </w:rPr>
+        <w:t>ê</w:t>
+      </w:r>
+      <w:r>
+        <w:rPr>
+          <w:sz w:val="22"/>
+        </w:rPr>
+        <w:t>ncia, nenhum pedido v</w:t>
+      </w:r>
+      <w:r>
+        <w:rPr>
+          <w:rFonts w:hint="cs"/>
+          <w:sz w:val="22"/>
+        </w:rPr>
+        <w:t>á</w:t>
+      </w:r>
+      <w:r>
+        <w:rPr>
+          <w:sz w:val="22"/>
+        </w:rPr>
+        <w:t>lido.</w:t>
+      </w:r>
+    </w:p>
+    <w:p>
+      <w:pPr>
+        <w:pStyle w:val="Commarcadores"/>
+        <w:spacing w:after="50" w:line="264" w:lineRule="auto"/>
+        <w:rPr>
+          <w:rFonts w:hint="eastAsia"/>
+        </w:rPr>
+      </w:pPr>
+      <w:r>
+        <w:rPr>
+          <w:rFonts w:hint="eastAsia"/>
+          <w:sz w:val="22"/>
+        </w:rPr>
+        <w:t xml:space="preserve">Controles e auditoria (1.32): o quadro Estrutura reconhecida e joins entre as bases ganhou o card "Base GR / SQVI DOC_COMPRA </w:t>
+      </w:r>
+      <w:r>
+        <w:rPr>
+          <w:rFonts w:hint="eastAsia"/>
+          <w:sz w:val="22"/>
+        </w:rPr>
+        <w:t>→</w:t>
+      </w:r>
+      <w:r>
+        <w:rPr>
+          <w:rFonts w:hint="eastAsia"/>
+          <w:sz w:val="22"/>
+        </w:rPr>
+        <w:t xml:space="preserve"> Season e Year dos pedidos" (health_center.governance_status, selo Carregada/Pendente) com essa estrutura, os motivos de recusa e a chave Pedido = pedido da entrada mais recente do SKU na MB59; o card MB59 (PASSO A PASSO) descreve a regra por SKU.</w:t>
+      </w:r>
+    </w:p>
+    <w:p>
+      <w:pPr>
+        <w:pStyle w:val="Commarcadores"/>
+        <w:spacing w:after="50" w:line="264" w:lineRule="auto"/>
+        <w:rPr>
+          <w:rFonts w:hint="eastAsia"/>
+        </w:rPr>
+      </w:pPr>
+      <w:r>
+        <w:rPr>
+          <w:sz w:val="22"/>
+        </w:rPr>
+        <w:t>Selos das etapas de Extra</w:t>
+      </w:r>
+      <w:r>
+        <w:rPr>
+          <w:rFonts w:hint="cs"/>
+          <w:sz w:val="22"/>
+        </w:rPr>
+        <w:t>çõ</w:t>
+      </w:r>
+      <w:r>
+        <w:rPr>
+          <w:sz w:val="22"/>
+        </w:rPr>
+        <w:t xml:space="preserve">es SAP (1.32): verde com </w:t>
+      </w:r>
+      <w:r>
+        <w:rPr>
+          <w:rFonts w:ascii="Segoe UI Symbol" w:hAnsi="Segoe UI Symbol" w:cs="Segoe UI Symbol"/>
+          <w:sz w:val="22"/>
+        </w:rPr>
+        <w:t>✓</w:t>
+      </w:r>
+      <w:r>
+        <w:rPr>
+          <w:sz w:val="22"/>
+        </w:rPr>
+        <w:t xml:space="preserve"> "Carregada </w:t>
+      </w:r>
+      <w:r>
+        <w:rPr>
+          <w:rFonts w:hint="cs"/>
+          <w:sz w:val="22"/>
+        </w:rPr>
+        <w:t>·</w:t>
+      </w:r>
+      <w:r>
+        <w:rPr>
+          <w:sz w:val="22"/>
+        </w:rPr>
+        <w:t xml:space="preserve"> em dd/mm" (etapa 3: "100% dos pedidos"), laranja com rel</w:t>
+      </w:r>
+      <w:r>
+        <w:rPr>
+          <w:rFonts w:hint="cs"/>
+          <w:sz w:val="22"/>
+        </w:rPr>
+        <w:t>ó</w:t>
+      </w:r>
+      <w:r>
+        <w:rPr>
+          <w:sz w:val="22"/>
+        </w:rPr>
+        <w:t xml:space="preserve">gio "Pendente" e amarelo com alerta "N% dos pedidos </w:t>
+      </w:r>
+      <w:r>
+        <w:rPr>
+          <w:rFonts w:hint="cs"/>
+          <w:sz w:val="22"/>
+        </w:rPr>
+        <w:t>·</w:t>
+      </w:r>
+      <w:r>
+        <w:rPr>
+          <w:sz w:val="22"/>
+        </w:rPr>
+        <w:t xml:space="preserve"> faltam pedidos"; o card da etapa fica tingido na mesma cor e uma barra acima mostra "N de 3 etapas conclu</w:t>
+      </w:r>
+      <w:r>
+        <w:rPr>
+          <w:rFonts w:hint="cs"/>
+          <w:sz w:val="22"/>
+        </w:rPr>
+        <w:t>í</w:t>
+      </w:r>
+      <w:r>
+        <w:rPr>
+          <w:sz w:val="22"/>
+        </w:rPr>
+        <w:t>das no m</w:t>
+      </w:r>
+      <w:r>
+        <w:rPr>
+          <w:rFonts w:hint="cs"/>
+          <w:sz w:val="22"/>
+        </w:rPr>
+        <w:t>ê</w:t>
+      </w:r>
+      <w:r>
+        <w:rPr>
+          <w:sz w:val="22"/>
+        </w:rPr>
+        <w:t>s" (loadSapSteps, data-state ok/warn/partial).</w:t>
+      </w:r>
+    </w:p>
+    <w:p>
+      <w:pPr>
+        <w:pStyle w:val="Commarcadores"/>
+        <w:spacing w:after="50" w:line="264" w:lineRule="auto"/>
+        <w:rPr>
+          <w:rFonts w:hint="eastAsia"/>
+        </w:rPr>
+      </w:pPr>
+      <w:r>
+        <w:rPr>
+          <w:sz w:val="22"/>
+        </w:rPr>
+        <w:t>Controles e auditoria (1.33): cada card (controles, estado operacional e estruturas) leva o n</w:t>
+      </w:r>
+      <w:r>
+        <w:rPr>
+          <w:rFonts w:hint="cs"/>
+          <w:sz w:val="22"/>
+        </w:rPr>
+        <w:t>í</w:t>
+      </w:r>
+      <w:r>
+        <w:rPr>
+          <w:sz w:val="22"/>
+        </w:rPr>
+        <w:t>vel da situa</w:t>
+      </w:r>
+      <w:r>
+        <w:rPr>
+          <w:rFonts w:hint="cs"/>
+          <w:sz w:val="22"/>
+        </w:rPr>
+        <w:t>çã</w:t>
+      </w:r>
+      <w:r>
+        <w:rPr>
+          <w:sz w:val="22"/>
+        </w:rPr>
+        <w:t xml:space="preserve">o </w:t>
+      </w:r>
+      <w:r>
+        <w:rPr>
+          <w:rFonts w:hint="cs"/>
+          <w:sz w:val="22"/>
+        </w:rPr>
+        <w:t>—</w:t>
+      </w:r>
+      <w:r>
+        <w:rPr>
+          <w:sz w:val="22"/>
+        </w:rPr>
+        <w:t xml:space="preserve"> healthy, warning, critical ou informativo (sem n</w:t>
+      </w:r>
+      <w:r>
+        <w:rPr>
+          <w:rFonts w:hint="cs"/>
+          <w:sz w:val="22"/>
+        </w:rPr>
+        <w:t>í</w:t>
+      </w:r>
+      <w:r>
+        <w:rPr>
+          <w:sz w:val="22"/>
+        </w:rPr>
+        <w:t xml:space="preserve">vel) </w:t>
+      </w:r>
+      <w:r>
+        <w:rPr>
+          <w:rFonts w:hint="cs"/>
+          <w:sz w:val="22"/>
+        </w:rPr>
+        <w:t>—</w:t>
+      </w:r>
+      <w:r>
+        <w:rPr>
+          <w:sz w:val="22"/>
+        </w:rPr>
+        <w:t xml:space="preserve"> numa borda fina e num brilho suave no canto do selo, sem faixa lateral; o selo </w:t>
+      </w:r>
+      <w:r>
+        <w:rPr>
+          <w:rFonts w:hint="cs"/>
+          <w:sz w:val="22"/>
+        </w:rPr>
+        <w:t>é</w:t>
+      </w:r>
+      <w:r>
+        <w:rPr>
+          <w:sz w:val="22"/>
+        </w:rPr>
+        <w:t xml:space="preserve"> s</w:t>
+      </w:r>
+      <w:r>
+        <w:rPr>
+          <w:rFonts w:hint="cs"/>
+          <w:sz w:val="22"/>
+        </w:rPr>
+        <w:t>ó</w:t>
+      </w:r>
+      <w:r>
+        <w:rPr>
+          <w:sz w:val="22"/>
+        </w:rPr>
+        <w:t xml:space="preserve">lido com </w:t>
+      </w:r>
+      <w:r>
+        <w:rPr>
+          <w:rFonts w:hint="cs"/>
+          <w:sz w:val="22"/>
+        </w:rPr>
+        <w:t>í</w:t>
+      </w:r>
+      <w:r>
+        <w:rPr>
+          <w:sz w:val="22"/>
+        </w:rPr>
+        <w:t>cone (</w:t>
+      </w:r>
+      <w:r>
+        <w:rPr>
+          <w:rFonts w:ascii="Segoe UI Symbol" w:hAnsi="Segoe UI Symbol" w:cs="Segoe UI Symbol"/>
+          <w:sz w:val="22"/>
+        </w:rPr>
+        <w:t>✓</w:t>
+      </w:r>
+      <w:r>
+        <w:rPr>
+          <w:sz w:val="22"/>
+        </w:rPr>
+        <w:t xml:space="preserve"> verde, alerta laranja, </w:t>
+      </w:r>
+      <w:r>
+        <w:rPr>
+          <w:rFonts w:hint="eastAsia"/>
+          <w:sz w:val="22"/>
+        </w:rPr>
+        <w:t>×</w:t>
+      </w:r>
+      <w:r>
+        <w:rPr>
+          <w:sz w:val="22"/>
+        </w:rPr>
+        <w:t xml:space="preserve"> vermelho, i azul-marinho para </w:t>
+      </w:r>
+      <w:r>
+        <w:rPr>
+          <w:sz w:val="22"/>
+        </w:rPr>
+        <w:lastRenderedPageBreak/>
+        <w:t>contagens como colunas, regras e f</w:t>
+      </w:r>
+      <w:r>
+        <w:rPr>
+          <w:rFonts w:hint="cs"/>
+          <w:sz w:val="22"/>
+        </w:rPr>
+        <w:t>ó</w:t>
+      </w:r>
+      <w:r>
+        <w:rPr>
+          <w:sz w:val="22"/>
+        </w:rPr>
+        <w:t>rmulas). T</w:t>
+      </w:r>
+      <w:r>
+        <w:rPr>
+          <w:rFonts w:hint="cs"/>
+          <w:sz w:val="22"/>
+        </w:rPr>
+        <w:t>é</w:t>
+      </w:r>
+      <w:r>
+        <w:rPr>
+          <w:sz w:val="22"/>
+        </w:rPr>
+        <w:t xml:space="preserve">cnico: governanceRows </w:t>
+      </w:r>
+      <w:r>
+        <w:rPr>
+          <w:rFonts w:hint="eastAsia"/>
+          <w:sz w:val="22"/>
+        </w:rPr>
+        <w:t>→</w:t>
+      </w:r>
+      <w:r>
+        <w:rPr>
+          <w:sz w:val="22"/>
+        </w:rPr>
+        <w:t xml:space="preserve"> gvLevel/gvBadge (GV_ICONS); a fonte All Brazil usa o mesmo selo ("All Brazil de dd/mm/aaaa"); o "Verificado em" do topo fica verde com </w:t>
+      </w:r>
+      <w:r>
+        <w:rPr>
+          <w:rFonts w:ascii="Segoe UI Symbol" w:hAnsi="Segoe UI Symbol" w:cs="Segoe UI Symbol"/>
+          <w:sz w:val="22"/>
+        </w:rPr>
+        <w:t>✓</w:t>
+      </w:r>
+      <w:r>
+        <w:rPr>
+          <w:sz w:val="22"/>
+        </w:rPr>
+        <w:t>.</w:t>
+      </w:r>
+    </w:p>
+    <w:p>
+      <w:pPr>
+        <w:pStyle w:val="Commarcadores"/>
+        <w:spacing w:after="50" w:line="264" w:lineRule="auto"/>
+        <w:rPr>
+          <w:rFonts w:hint="eastAsia"/>
+        </w:rPr>
+      </w:pPr>
+      <w:r>
+        <w:rPr>
+          <w:sz w:val="22"/>
+        </w:rPr>
+        <w:t xml:space="preserve">VPN (1.33): a VPN </w:t>
+      </w:r>
+      <w:r>
+        <w:rPr>
+          <w:rFonts w:hint="cs"/>
+          <w:sz w:val="22"/>
+        </w:rPr>
+        <w:t>é</w:t>
+      </w:r>
+      <w:r>
+        <w:rPr>
+          <w:sz w:val="22"/>
+        </w:rPr>
+        <w:t xml:space="preserve"> necess</w:t>
+      </w:r>
+      <w:r>
+        <w:rPr>
+          <w:rFonts w:hint="cs"/>
+          <w:sz w:val="22"/>
+        </w:rPr>
+        <w:t>á</w:t>
+      </w:r>
+      <w:r>
+        <w:rPr>
+          <w:sz w:val="22"/>
+        </w:rPr>
+        <w:t>ria s</w:t>
+      </w:r>
+      <w:r>
+        <w:rPr>
+          <w:rFonts w:hint="cs"/>
+          <w:sz w:val="22"/>
+        </w:rPr>
+        <w:t>ó</w:t>
+      </w:r>
+      <w:r>
+        <w:rPr>
+          <w:sz w:val="22"/>
+        </w:rPr>
+        <w:t xml:space="preserve"> para o Optimus (chat, avisos, resumo e apresenta</w:t>
+      </w:r>
+      <w:r>
+        <w:rPr>
+          <w:rFonts w:hint="cs"/>
+          <w:sz w:val="22"/>
+        </w:rPr>
+        <w:t>çõ</w:t>
+      </w:r>
+      <w:r>
+        <w:rPr>
+          <w:sz w:val="22"/>
+        </w:rPr>
+        <w:t>es). Extra</w:t>
+      </w:r>
+      <w:r>
+        <w:rPr>
+          <w:rFonts w:hint="cs"/>
+          <w:sz w:val="22"/>
+        </w:rPr>
+        <w:t>çõ</w:t>
+      </w:r>
+      <w:r>
+        <w:rPr>
+          <w:sz w:val="22"/>
+        </w:rPr>
+        <w:t>es SAP (SAP GUI + SSO da m</w:t>
+      </w:r>
+      <w:r>
+        <w:rPr>
+          <w:rFonts w:hint="cs"/>
+          <w:sz w:val="22"/>
+        </w:rPr>
+        <w:t>á</w:t>
+      </w:r>
+      <w:r>
+        <w:rPr>
+          <w:sz w:val="22"/>
+        </w:rPr>
+        <w:t>quina), uploads, relat</w:t>
+      </w:r>
+      <w:r>
+        <w:rPr>
+          <w:rFonts w:hint="cs"/>
+          <w:sz w:val="22"/>
+        </w:rPr>
+        <w:t>ó</w:t>
+      </w:r>
+      <w:r>
+        <w:rPr>
+          <w:sz w:val="22"/>
+        </w:rPr>
+        <w:t>rios e as demais p</w:t>
+      </w:r>
+      <w:r>
+        <w:rPr>
+          <w:rFonts w:hint="cs"/>
+          <w:sz w:val="22"/>
+        </w:rPr>
+        <w:t>á</w:t>
+      </w:r>
+      <w:r>
+        <w:rPr>
+          <w:sz w:val="22"/>
+        </w:rPr>
+        <w:t>ginas funcionam sem ela. O tour (passo da ZMM119 e do Optimus), o manual do Optimus e o in</w:t>
+      </w:r>
+      <w:r>
+        <w:rPr>
+          <w:rFonts w:hint="eastAsia"/>
+          <w:sz w:val="22"/>
+        </w:rPr>
+        <w:t>dicador VPN / rede do Health Center dizem isso explicitamente.</w:t>
+      </w:r>
+    </w:p>
+    <w:p>
+      <w:pPr>
         <w:pStyle w:val="Ttulo1"/>
         <w:spacing w:line="252" w:lineRule="auto"/>
       </w:pPr>
@@ -16820,7 +18507,6 @@
         <w:rPr>
           <w:rFonts w:ascii="Aptos" w:hAnsi="Aptos" w:hint="eastAsia"/>
         </w:rPr>
-        <w:lastRenderedPageBreak/>
         <w:t>13.1 Catálogo dinâmico das pastas do Drive</w:t>
       </w:r>
     </w:p>
@@ -17650,6 +19336,7 @@
         <w:rPr>
           <w:rFonts w:ascii="Aptos" w:hAnsi="Aptos" w:hint="eastAsia"/>
         </w:rPr>
+        <w:lastRenderedPageBreak/>
         <w:t>14.1 Mapping compartilhado entre máquinas</w:t>
       </w:r>
     </w:p>
@@ -17975,7 +19662,6 @@
         <w:rPr>
           <w:sz w:val="22"/>
         </w:rPr>
-        <w:lastRenderedPageBreak/>
         <w:t>Quando chega regra nova, alterada ou exclu</w:t>
       </w:r>
       <w:r>
@@ -18754,7 +20440,14 @@
         <w:rPr>
           <w:sz w:val="22"/>
         </w:rPr>
-        <w:t xml:space="preserve"> Empresa 7170. Chaves criadas: CE &amp; MAT = Centro + Material; Estilo-Cor = 10 primeiros caracteres do Material; Estilo = 6 primeiros.</w:t>
+        <w:t xml:space="preserve"> Empresa </w:t>
+      </w:r>
+      <w:r>
+        <w:rPr>
+          <w:sz w:val="22"/>
+        </w:rPr>
+        <w:lastRenderedPageBreak/>
+        <w:t>7170. Chaves criadas: CE &amp; MAT = Centro + Material; Estilo-Cor = 10 primeiros caracteres do Material; Estilo = 6 primeiros.</w:t>
       </w:r>
     </w:p>
     <w:p>
@@ -18992,14 +20685,7 @@
         <w:rPr>
           <w:sz w:val="22"/>
         </w:rPr>
-        <w:t xml:space="preserve"> All </w:t>
-      </w:r>
-      <w:r>
-        <w:rPr>
-          <w:sz w:val="22"/>
-        </w:rPr>
-        <w:lastRenderedPageBreak/>
-        <w:t xml:space="preserve">Brazil pelo Material (ou Estilo-Cor), sem Centro: Collection Code </w:t>
+        <w:t xml:space="preserve"> All Brazil pelo Material (ou Estilo-Cor), sem Centro: Collection Code </w:t>
       </w:r>
       <w:r>
         <w:rPr>
@@ -19898,7 +21584,14 @@
         <w:rPr>
           <w:sz w:val="22"/>
         </w:rPr>
-        <w:t>o de Estoque e Revenda - FISIA - Ago.26, aba BASE - CKMR), usada no PASSO A PASSO de 2026-09, porque a posi</w:t>
+        <w:t xml:space="preserve">o de Estoque e Revenda - FISIA - Ago.26, aba </w:t>
+      </w:r>
+      <w:r>
+        <w:rPr>
+          <w:sz w:val="22"/>
+        </w:rPr>
+        <w:lastRenderedPageBreak/>
+        <w:t>BASE - CKMR), usada no PASSO A PASSO de 2026-09, porque a posi</w:t>
       </w:r>
       <w:r>
         <w:rPr>
@@ -19939,7 +21632,85 @@
         <w:rPr>
           <w:sz w:val="22"/>
         </w:rPr>
-        <w:t>Exporta</w:t>
+        <w:t>Season e Year dos pedidos (1.31): controle autom</w:t>
+      </w:r>
+      <w:r>
+        <w:rPr>
+          <w:rFonts w:hint="cs"/>
+          <w:sz w:val="22"/>
+        </w:rPr>
+        <w:t>á</w:t>
+      </w:r>
+      <w:r>
+        <w:rPr>
+          <w:sz w:val="22"/>
+        </w:rPr>
+        <w:t>tico ap</w:t>
+      </w:r>
+      <w:r>
+        <w:rPr>
+          <w:rFonts w:hint="cs"/>
+          <w:sz w:val="22"/>
+        </w:rPr>
+        <w:t>ó</w:t>
+      </w:r>
+      <w:r>
+        <w:rPr>
+          <w:sz w:val="22"/>
+        </w:rPr>
+        <w:t>s Consist</w:t>
+      </w:r>
+      <w:r>
+        <w:rPr>
+          <w:rFonts w:hint="cs"/>
+          <w:sz w:val="22"/>
+        </w:rPr>
+        <w:t>ê</w:t>
+      </w:r>
+      <w:r>
+        <w:rPr>
+          <w:sz w:val="22"/>
+        </w:rPr>
+        <w:t xml:space="preserve">ncia All Brazil (health_center._collection_control, a partir de collection_status) </w:t>
+      </w:r>
+      <w:r>
+        <w:rPr>
+          <w:rFonts w:hint="cs"/>
+          <w:sz w:val="22"/>
+        </w:rPr>
+        <w:t>—</w:t>
+      </w:r>
+      <w:r>
+        <w:rPr>
+          <w:sz w:val="22"/>
+        </w:rPr>
+        <w:t xml:space="preserve"> selos Sem MB59, Regra anterior (compet</w:t>
+      </w:r>
+      <w:r>
+        <w:rPr>
+          <w:rFonts w:hint="cs"/>
+          <w:sz w:val="22"/>
+        </w:rPr>
+        <w:t>ê</w:t>
+      </w:r>
+      <w:r>
+        <w:rPr>
+          <w:sz w:val="22"/>
+        </w:rPr>
+        <w:t>ncia sem mb59_sku_entries, ainda por CE &amp; MAT), N</w:t>
+      </w:r>
+      <w:r>
+        <w:rPr>
+          <w:rFonts w:hint="cs"/>
+          <w:sz w:val="22"/>
+        </w:rPr>
+        <w:t>ã</w:t>
+      </w:r>
+      <w:r>
+        <w:rPr>
+          <w:sz w:val="22"/>
+        </w:rPr>
+        <w:t>o carregada (pedidos da MB59 aguardando a cole</w:t>
       </w:r>
       <w:r>
         <w:rPr>
@@ -19952,98 +21723,33 @@
         <w:rPr>
           <w:sz w:val="22"/>
         </w:rPr>
-        <w:t>o XLSX da Base de estoque: sempre com todas as linhas da busca e dos filtros, para qualquer usu</w:t>
-      </w:r>
-      <w:r>
-        <w:rPr>
-          <w:rFonts w:hint="cs"/>
-          <w:sz w:val="22"/>
-        </w:rPr>
-        <w:t>á</w:t>
-      </w:r>
-      <w:r>
-        <w:rPr>
-          <w:sz w:val="22"/>
-        </w:rPr>
-        <w:t xml:space="preserve">rio com acesso </w:t>
-      </w:r>
-      <w:r>
-        <w:rPr>
-          <w:rFonts w:hint="cs"/>
-          <w:sz w:val="22"/>
-        </w:rPr>
-        <w:t>à</w:t>
-      </w:r>
-      <w:r>
-        <w:rPr>
-          <w:sz w:val="22"/>
-        </w:rPr>
-        <w:t xml:space="preserve"> p</w:t>
-      </w:r>
-      <w:r>
-        <w:rPr>
-          <w:rFonts w:hint="cs"/>
-          <w:sz w:val="22"/>
-        </w:rPr>
-        <w:t>á</w:t>
-      </w:r>
-      <w:r>
-        <w:rPr>
-          <w:sz w:val="22"/>
-        </w:rPr>
-        <w:t xml:space="preserve">gina. O arquivo </w:t>
-      </w:r>
-      <w:r>
-        <w:rPr>
-          <w:rFonts w:hint="cs"/>
-          <w:sz w:val="22"/>
-        </w:rPr>
-        <w:t>é</w:t>
-      </w:r>
-      <w:r>
-        <w:rPr>
-          <w:sz w:val="22"/>
-        </w:rPr>
-        <w:t xml:space="preserve"> escrito em streaming (xlsx_stream.write_xlsx: XML direto no zip, blocos de 5.000 linhas, datas como data do Excel, cabe</w:t>
-      </w:r>
-      <w:r>
-        <w:rPr>
-          <w:rFonts w:hint="cs"/>
-          <w:sz w:val="22"/>
-        </w:rPr>
-        <w:t>ç</w:t>
-      </w:r>
-      <w:r>
-        <w:rPr>
-          <w:sz w:val="22"/>
-        </w:rPr>
-        <w:t>alho em negrito e congelado); a base completa (~495 mil linhas) sai em cerca de 50 segundos. O tempor</w:t>
-      </w:r>
-      <w:r>
-        <w:rPr>
-          <w:rFonts w:hint="cs"/>
-          <w:sz w:val="22"/>
-        </w:rPr>
-        <w:t>á</w:t>
-      </w:r>
-      <w:r>
-        <w:rPr>
-          <w:sz w:val="22"/>
-        </w:rPr>
-        <w:t>rio fica em %LOCALAPPDATA%\OpsContabil\exports, n</w:t>
-      </w:r>
-      <w:r>
-        <w:rPr>
-          <w:rFonts w:hint="cs"/>
-          <w:sz w:val="22"/>
-        </w:rPr>
-        <w:t>ã</w:t>
-      </w:r>
-      <w:r>
-        <w:rPr>
-          <w:sz w:val="22"/>
-        </w:rPr>
-        <w:t>o no %TEMP%.</w:t>
+        <w:t>o) ou N% dos pedidos (arquivo, data, quem carregou, pedidos sem cole</w:t>
+      </w:r>
+      <w:r>
+        <w:rPr>
+          <w:rFonts w:hint="cs"/>
+          <w:sz w:val="22"/>
+        </w:rPr>
+        <w:t>çã</w:t>
+      </w:r>
+      <w:r>
+        <w:rPr>
+          <w:sz w:val="22"/>
+        </w:rPr>
+        <w:t>o; verde s</w:t>
+      </w:r>
+      <w:r>
+        <w:rPr>
+          <w:rFonts w:hint="cs"/>
+          <w:sz w:val="22"/>
+        </w:rPr>
+        <w:t>ó</w:t>
+      </w:r>
+      <w:r>
+        <w:rPr>
+          <w:sz w:val="22"/>
+        </w:rPr>
+        <w:t xml:space="preserve"> com 100%).</w:t>
       </w:r>
     </w:p>
     <w:p>
@@ -20056,14 +21762,133 @@
       </w:pPr>
       <w:r>
         <w:rPr>
-          <w:rFonts w:hint="eastAsia"/>
-          <w:sz w:val="22"/>
-        </w:rPr>
-        <w:t>Testes: tests/test_pass_step_audit.py, tests/test_master_base.py e tests/test_inventory_export.py.</w:t>
+          <w:sz w:val="22"/>
+        </w:rPr>
+        <w:t>Exporta</w:t>
+      </w:r>
+      <w:r>
+        <w:rPr>
+          <w:rFonts w:hint="cs"/>
+          <w:sz w:val="22"/>
+        </w:rPr>
+        <w:t>çã</w:t>
+      </w:r>
+      <w:r>
+        <w:rPr>
+          <w:sz w:val="22"/>
+        </w:rPr>
+        <w:t>o XLSX da Base de estoque: sempre com todas as linhas da busca e dos filtros, para qualquer usu</w:t>
+      </w:r>
+      <w:r>
+        <w:rPr>
+          <w:rFonts w:hint="cs"/>
+          <w:sz w:val="22"/>
+        </w:rPr>
+        <w:t>á</w:t>
+      </w:r>
+      <w:r>
+        <w:rPr>
+          <w:sz w:val="22"/>
+        </w:rPr>
+        <w:t xml:space="preserve">rio com acesso </w:t>
+      </w:r>
+      <w:r>
+        <w:rPr>
+          <w:rFonts w:hint="cs"/>
+          <w:sz w:val="22"/>
+        </w:rPr>
+        <w:t>à</w:t>
+      </w:r>
+      <w:r>
+        <w:rPr>
+          <w:sz w:val="22"/>
+        </w:rPr>
+        <w:t xml:space="preserve"> p</w:t>
+      </w:r>
+      <w:r>
+        <w:rPr>
+          <w:rFonts w:hint="cs"/>
+          <w:sz w:val="22"/>
+        </w:rPr>
+        <w:t>á</w:t>
+      </w:r>
+      <w:r>
+        <w:rPr>
+          <w:sz w:val="22"/>
+        </w:rPr>
+        <w:t xml:space="preserve">gina. O arquivo </w:t>
+      </w:r>
+      <w:r>
+        <w:rPr>
+          <w:rFonts w:hint="cs"/>
+          <w:sz w:val="22"/>
+        </w:rPr>
+        <w:t>é</w:t>
+      </w:r>
+      <w:r>
+        <w:rPr>
+          <w:sz w:val="22"/>
+        </w:rPr>
+        <w:t xml:space="preserve"> escrito em streaming (xlsx_stream.write_xlsx: XML direto no zip, blocos de 5.000 linhas, datas como data do Excel, cabe</w:t>
+      </w:r>
+      <w:r>
+        <w:rPr>
+          <w:rFonts w:hint="cs"/>
+          <w:sz w:val="22"/>
+        </w:rPr>
+        <w:t>ç</w:t>
+      </w:r>
+      <w:r>
+        <w:rPr>
+          <w:sz w:val="22"/>
+        </w:rPr>
+        <w:t>alho em negrito e congelado); a base completa (~495 mil linhas) sai em cerca de 50 segundos. O tempor</w:t>
+      </w:r>
+      <w:r>
+        <w:rPr>
+          <w:rFonts w:hint="cs"/>
+          <w:sz w:val="22"/>
+        </w:rPr>
+        <w:t>á</w:t>
+      </w:r>
+      <w:r>
+        <w:rPr>
+          <w:sz w:val="22"/>
+        </w:rPr>
+        <w:t>rio fica em %LOCALAPPDATA%\OpsContabil\exports, n</w:t>
+      </w:r>
+      <w:r>
+        <w:rPr>
+          <w:rFonts w:hint="cs"/>
+          <w:sz w:val="22"/>
+        </w:rPr>
+        <w:t>ã</w:t>
+      </w:r>
+      <w:r>
+        <w:rPr>
+          <w:sz w:val="22"/>
+        </w:rPr>
+        <w:t>o no %TEMP%.</w:t>
       </w:r>
     </w:p>
     <w:p>
       <w:pPr>
+        <w:pStyle w:val="Commarcadores"/>
+        <w:spacing w:after="50" w:line="264" w:lineRule="auto"/>
+        <w:rPr>
+          <w:rFonts w:hint="eastAsia"/>
+        </w:rPr>
+      </w:pPr>
+      <w:r>
+        <w:rPr>
+          <w:rFonts w:hint="eastAsia"/>
+          <w:sz w:val="22"/>
+        </w:rPr>
+        <w:t>Testes: tests/test_pass_step_audit.py, tests/test_master_base.py e tests/test_inventory_export.py.</w:t>
+      </w:r>
+    </w:p>
+    <w:p>
+      <w:pPr>
         <w:pStyle w:val="Ttulo2"/>
         <w:spacing w:line="252" w:lineRule="auto"/>
       </w:pPr>
@@ -20071,7 +21896,6 @@
         <w:rPr>
           <w:rFonts w:ascii="Aptos" w:hAnsi="Aptos" w:hint="eastAsia"/>
         </w:rPr>
-        <w:lastRenderedPageBreak/>
         <w:t>15.3 Não localizados, confirmação SAP e ajustes de interface</w:t>
       </w:r>
     </w:p>
@@ -21150,6 +22974,7 @@
                 <w:color w:val="0B2538"/>
                 <w:sz w:val="19"/>
               </w:rPr>
+              <w:lastRenderedPageBreak/>
               <w:t>Indicador</w:t>
             </w:r>
           </w:p>
@@ -21648,7 +23473,6 @@
               <w:rPr>
                 <w:sz w:val="19"/>
               </w:rPr>
-              <w:lastRenderedPageBreak/>
               <w:t>Sincronização</w:t>
             </w:r>
           </w:p>
@@ -22543,6 +24367,7 @@
               <w:rPr>
                 <w:sz w:val="18"/>
               </w:rPr>
+              <w:lastRenderedPageBreak/>
               <w:t>sap_status</w:t>
             </w:r>
           </w:p>
@@ -23047,7 +24872,6 @@
                 <w:rFonts w:hint="eastAsia"/>
                 <w:sz w:val="18"/>
               </w:rPr>
-              <w:lastRenderedPageBreak/>
               <w:t>settings_overview</w:t>
             </w:r>
           </w:p>
@@ -24051,6 +25875,7 @@
         <w:rPr>
           <w:rFonts w:hint="cs"/>
         </w:rPr>
+        <w:lastRenderedPageBreak/>
         <w:t>é</w:t>
       </w:r>
       <w:r>
@@ -24230,11 +26055,7 @@
         <w:t>çõ</w:t>
       </w:r>
       <w:r>
-        <w:t xml:space="preserve">es por mensagem) e devolve [RESULTADO_FERRAMENTA_LOCAL]. Toda ferramenta que </w:t>
-      </w:r>
-      <w:r>
-        <w:lastRenderedPageBreak/>
-        <w:t>altera algo apenas PREPARA a a</w:t>
+        <w:t>es por mensagem) e devolve [RESULTADO_FERRAMENTA_LOCAL]. Toda ferramenta que altera algo apenas PREPARA a a</w:t>
       </w:r>
       <w:r>
         <w:rPr>
@@ -25014,6 +26835,7 @@
         <w:rPr>
           <w:sz w:val="22"/>
         </w:rPr>
+        <w:lastRenderedPageBreak/>
         <w:t>Presen</w:t>
       </w:r>
       <w:r>
@@ -25449,7 +27271,6 @@
         <w:rPr>
           <w:sz w:val="22"/>
         </w:rPr>
-        <w:lastRenderedPageBreak/>
         <w:t xml:space="preserve">Fila e entrega: queue_optimus_event guarda o evento em OPTIMUS_OFFERS (12 h). A cada consulta do chat, um evento </w:t>
       </w:r>
       <w:r>
@@ -26137,6 +27958,7 @@
         <w:rPr>
           <w:rFonts w:ascii="Aptos" w:hAnsi="Aptos" w:hint="eastAsia"/>
         </w:rPr>
+        <w:lastRenderedPageBreak/>
         <w:t>17.9 Evento: linhas da Base de Estoque sem preenchimento</w:t>
       </w:r>
     </w:p>
@@ -26473,7 +28295,6 @@
         <w:rPr>
           <w:sz w:val="22"/>
         </w:rPr>
-        <w:lastRenderedPageBreak/>
         <w:t>A</w:t>
       </w:r>
       <w:r>
@@ -27068,6 +28889,7 @@
         <w:rPr>
           <w:rFonts w:ascii="Aptos" w:hAnsi="Aptos" w:hint="eastAsia"/>
         </w:rPr>
+        <w:lastRenderedPageBreak/>
         <w:t>17.17 Ação: incluir ou alterar regra de Mapping</w:t>
       </w:r>
     </w:p>
@@ -27280,7 +29102,6 @@
         <w:rPr>
           <w:rFonts w:ascii="Aptos" w:hAnsi="Aptos" w:hint="eastAsia"/>
         </w:rPr>
-        <w:lastRenderedPageBreak/>
         <w:t>17.19 Ação: backup programado</w:t>
       </w:r>
     </w:p>
@@ -27994,6 +29815,7 @@
         <w:rPr>
           <w:sz w:val="22"/>
         </w:rPr>
+        <w:lastRenderedPageBreak/>
         <w:t>Verifica</w:t>
       </w:r>
       <w:r>
@@ -28297,14 +30119,7 @@
         <w:rPr>
           <w:sz w:val="22"/>
         </w:rPr>
-        <w:t xml:space="preserve"> </w:t>
-      </w:r>
-      <w:r>
-        <w:rPr>
-          <w:sz w:val="22"/>
-        </w:rPr>
-        <w:lastRenderedPageBreak/>
-        <w:t>Health Center"} com t</w:t>
+        <w:t xml:space="preserve"> Health Center"} com t</w:t>
       </w:r>
       <w:r>
         <w:rPr>
@@ -29417,7 +31232,14 @@
         <w:rPr>
           <w:sz w:val="22"/>
         </w:rPr>
-        <w:t xml:space="preserve">o pendente no chat e pelo menos 180 s depois do </w:t>
+        <w:t xml:space="preserve">o </w:t>
+      </w:r>
+      <w:r>
+        <w:rPr>
+          <w:sz w:val="22"/>
+        </w:rPr>
+        <w:lastRenderedPageBreak/>
+        <w:t xml:space="preserve">pendente no chat e pelo menos 180 s depois do </w:t>
       </w:r>
       <w:r>
         <w:rPr>
@@ -29825,7 +31647,6 @@
         <w:rPr>
           <w:rFonts w:ascii="Aptos" w:hAnsi="Aptos" w:hint="eastAsia"/>
         </w:rPr>
-        <w:lastRenderedPageBreak/>
         <w:t>17.26 Apresentações do Optimus: oferta e pedido</w:t>
       </w:r>
     </w:p>
@@ -30790,20 +32611,86 @@
         <w:rPr>
           <w:sz w:val="22"/>
         </w:rPr>
-        <w:t>Armazenamento: %LOCALAPPDATA%\OpsContabil\presentations\&lt;AAAAMMDD-HHMMSS-xxxxxx&gt;\v&lt;n&gt;.json e v&lt;n&gt;.html, com meta.json (compet</w:t>
-      </w:r>
-      <w:r>
-        <w:rPr>
-          <w:rFonts w:hint="cs"/>
-          <w:sz w:val="22"/>
-        </w:rPr>
-        <w:t>ê</w:t>
-      </w:r>
-      <w:r>
-        <w:rPr>
-          <w:sz w:val="22"/>
-        </w:rPr>
-        <w:t>ncia, autor, vers</w:t>
+        <w:lastRenderedPageBreak/>
+        <w:t>Gr</w:t>
+      </w:r>
+      <w:r>
+        <w:rPr>
+          <w:rFonts w:hint="cs"/>
+          <w:sz w:val="22"/>
+        </w:rPr>
+        <w:t>á</w:t>
+      </w:r>
+      <w:r>
+        <w:rPr>
+          <w:sz w:val="22"/>
+        </w:rPr>
+        <w:t>ficos livres e proje</w:t>
+      </w:r>
+      <w:r>
+        <w:rPr>
+          <w:rFonts w:hint="cs"/>
+          <w:sz w:val="22"/>
+        </w:rPr>
+        <w:t>çã</w:t>
+      </w:r>
+      <w:r>
+        <w:rPr>
+          <w:sz w:val="22"/>
+        </w:rPr>
+        <w:t>o (1.31): al</w:t>
+      </w:r>
+      <w:r>
+        <w:rPr>
+          <w:rFonts w:hint="cs"/>
+          <w:sz w:val="22"/>
+        </w:rPr>
+        <w:t>é</w:t>
+      </w:r>
+      <w:r>
+        <w:rPr>
+          <w:sz w:val="22"/>
+        </w:rPr>
+        <w:t>m do cat</w:t>
+      </w:r>
+      <w:r>
+        <w:rPr>
+          <w:rFonts w:hint="cs"/>
+          <w:sz w:val="22"/>
+        </w:rPr>
+        <w:t>á</w:t>
+      </w:r>
+      <w:r>
+        <w:rPr>
+          <w:sz w:val="22"/>
+        </w:rPr>
+        <w:t>logo fixo, o agente pede o chart custom com data = {dimension, measure, filters, top, compare, periods, projection, title}. Dimens</w:t>
+      </w:r>
+      <w:r>
+        <w:rPr>
+          <w:rFonts w:hint="cs"/>
+          <w:sz w:val="22"/>
+        </w:rPr>
+        <w:t>õ</w:t>
+      </w:r>
+      <w:r>
+        <w:rPr>
+          <w:sz w:val="22"/>
+        </w:rPr>
+        <w:t>es: period, division, location, plant, status, lifecycle, aging, season, year</w:t>
+      </w:r>
+      <w:r>
+        <w:rPr>
+          <w:rFonts w:hint="eastAsia"/>
+          <w:sz w:val="22"/>
+        </w:rPr>
+        <w:t>, season_year, origin, type, style, style_color, material. Medidas: fiscal_value, company_value, commercial_value, free_quantity, blocked_quantity, materials, rows, pmm, over_12_value, over_12_pct, futures_value, fob, import_tax, other_costs. presentation</w:t>
+      </w:r>
+      <w:r>
+        <w:rPr>
+          <w:sz w:val="22"/>
+        </w:rPr>
+        <w:t>_data.clean_query valida e presentation_data.dataset consulta inventory_rows (mesmas linhas da Vis</w:t>
       </w:r>
       <w:r>
         <w:rPr>
@@ -30816,33 +32703,20 @@
         <w:rPr>
           <w:sz w:val="22"/>
         </w:rPr>
-        <w:t xml:space="preserve">o, origem agente ou sistema). Downloads: HTML </w:t>
-      </w:r>
-      <w:r>
-        <w:rPr>
-          <w:rFonts w:hint="cs"/>
-          <w:sz w:val="22"/>
-        </w:rPr>
-        <w:t>ú</w:t>
-      </w:r>
-      <w:r>
-        <w:rPr>
-          <w:sz w:val="22"/>
-        </w:rPr>
-        <w:t>nico ou ZIP (HTML, LEIA-ME e licen</w:t>
-      </w:r>
-      <w:r>
-        <w:rPr>
-          <w:rFonts w:hint="cs"/>
-          <w:sz w:val="22"/>
-        </w:rPr>
-        <w:t>ç</w:t>
-      </w:r>
-      <w:r>
-        <w:rPr>
-          <w:sz w:val="22"/>
-        </w:rPr>
-        <w:t>a MIT).</w:t>
+        <w:t>o e relat</w:t>
+      </w:r>
+      <w:r>
+        <w:rPr>
+          <w:rFonts w:hint="cs"/>
+          <w:sz w:val="22"/>
+        </w:rPr>
+        <w:t>ó</w:t>
+      </w:r>
+      <w:r>
+        <w:rPr>
+          <w:sz w:val="22"/>
+        </w:rPr>
+        <w:t>rios); o app liga facts['_loader'] e os resultados ficam em cache por consulta.</w:t>
       </w:r>
     </w:p>
     <w:p>
@@ -30857,7 +32731,163 @@
         <w:rPr>
           <w:sz w:val="22"/>
         </w:rPr>
-        <w:t>Rotas: POST /api/presentations, GET /api/presentations/{id}, POST /api/presentations/{id}/revise, POST /api/presentations/{id}/apply, GET /api/presentations/{id}/view e GET /api/presentations/{id}/download?format=html|zip (p</w:t>
+        <w:t>Proje</w:t>
+      </w:r>
+      <w:r>
+        <w:rPr>
+          <w:rFonts w:hint="cs"/>
+          <w:sz w:val="22"/>
+        </w:rPr>
+        <w:t>çã</w:t>
+      </w:r>
+      <w:r>
+        <w:rPr>
+          <w:sz w:val="22"/>
+        </w:rPr>
+        <w:t>o: na s</w:t>
+      </w:r>
+      <w:r>
+        <w:rPr>
+          <w:rFonts w:hint="cs"/>
+          <w:sz w:val="22"/>
+        </w:rPr>
+        <w:t>é</w:t>
+      </w:r>
+      <w:r>
+        <w:rPr>
+          <w:sz w:val="22"/>
+        </w:rPr>
+        <w:t>rie mensal (dimension period), projection = 1 a 6 meses por tend</w:t>
+      </w:r>
+      <w:r>
+        <w:rPr>
+          <w:rFonts w:hint="cs"/>
+          <w:sz w:val="22"/>
+        </w:rPr>
+        <w:t>ê</w:t>
+      </w:r>
+      <w:r>
+        <w:rPr>
+          <w:sz w:val="22"/>
+        </w:rPr>
+        <w:t>ncia linear (m</w:t>
+      </w:r>
+      <w:r>
+        <w:rPr>
+          <w:rFonts w:hint="cs"/>
+          <w:sz w:val="22"/>
+        </w:rPr>
+        <w:t>í</w:t>
+      </w:r>
+      <w:r>
+        <w:rPr>
+          <w:sz w:val="22"/>
+        </w:rPr>
+        <w:t>nimos quadrados) das compet</w:t>
+      </w:r>
+      <w:r>
+        <w:rPr>
+          <w:rFonts w:hint="cs"/>
+          <w:sz w:val="22"/>
+        </w:rPr>
+        <w:t>ê</w:t>
+      </w:r>
+      <w:r>
+        <w:rPr>
+          <w:sz w:val="22"/>
+        </w:rPr>
+        <w:t>ncias carregadas (at</w:t>
+      </w:r>
+      <w:r>
+        <w:rPr>
+          <w:rFonts w:hint="cs"/>
+          <w:sz w:val="22"/>
+        </w:rPr>
+        <w:t>é</w:t>
+      </w:r>
+      <w:r>
+        <w:rPr>
+          <w:sz w:val="22"/>
+        </w:rPr>
+        <w:t xml:space="preserve"> 18 de hist</w:t>
+      </w:r>
+      <w:r>
+        <w:rPr>
+          <w:rFonts w:hint="cs"/>
+          <w:sz w:val="22"/>
+        </w:rPr>
+        <w:t>ó</w:t>
+      </w:r>
+      <w:r>
+        <w:rPr>
+          <w:sz w:val="22"/>
+        </w:rPr>
+        <w:t xml:space="preserve">rico), nunca negativa; colunas projetadas em outra cor, com "proj.", legenda Realizado </w:t>
+      </w:r>
+      <w:r>
+        <w:rPr>
+          <w:rFonts w:hint="eastAsia"/>
+          <w:sz w:val="22"/>
+        </w:rPr>
+        <w:t>×</w:t>
+      </w:r>
+      <w:r>
+        <w:rPr>
+          <w:sz w:val="22"/>
+        </w:rPr>
+        <w:t xml:space="preserve"> Proje</w:t>
+      </w:r>
+      <w:r>
+        <w:rPr>
+          <w:rFonts w:hint="cs"/>
+          <w:sz w:val="22"/>
+        </w:rPr>
+        <w:t>çã</w:t>
+      </w:r>
+      <w:r>
+        <w:rPr>
+          <w:sz w:val="22"/>
+        </w:rPr>
+        <w:t>o e nota de m</w:t>
+      </w:r>
+      <w:r>
+        <w:rPr>
+          <w:rFonts w:hint="cs"/>
+          <w:sz w:val="22"/>
+        </w:rPr>
+        <w:t>é</w:t>
+      </w:r>
+      <w:r>
+        <w:rPr>
+          <w:sz w:val="22"/>
+        </w:rPr>
+        <w:t>todo no slide (estimativa, n</w:t>
+      </w:r>
+      <w:r>
+        <w:rPr>
+          <w:rFonts w:hint="cs"/>
+          <w:sz w:val="22"/>
+        </w:rPr>
+        <w:t>ã</w:t>
+      </w:r>
+      <w:r>
+        <w:rPr>
+          <w:sz w:val="22"/>
+        </w:rPr>
+        <w:t>o n</w:t>
+      </w:r>
+      <w:r>
+        <w:rPr>
+          <w:rFonts w:hint="cs"/>
+          <w:sz w:val="22"/>
+        </w:rPr>
+        <w:t>ú</w:t>
+      </w:r>
+      <w:r>
+        <w:rPr>
+          <w:sz w:val="22"/>
+        </w:rPr>
+        <w:t>mero cont</w:t>
       </w:r>
       <w:r>
         <w:rPr>
@@ -30870,11 +32900,303 @@
         <w:rPr>
           <w:sz w:val="22"/>
         </w:rPr>
-        <w:t>gina exigida: Optimus).</w:t>
+        <w:t>bil); com menos de duas compet</w:t>
+      </w:r>
+      <w:r>
+        <w:rPr>
+          <w:rFonts w:hint="cs"/>
+          <w:sz w:val="22"/>
+        </w:rPr>
+        <w:t>ê</w:t>
+      </w:r>
+      <w:r>
+        <w:rPr>
+          <w:sz w:val="22"/>
+        </w:rPr>
+        <w:t>ncias n</w:t>
+      </w:r>
+      <w:r>
+        <w:rPr>
+          <w:rFonts w:hint="cs"/>
+          <w:sz w:val="22"/>
+        </w:rPr>
+        <w:t>ã</w:t>
+      </w:r>
+      <w:r>
+        <w:rPr>
+          <w:sz w:val="22"/>
+        </w:rPr>
+        <w:t>o h</w:t>
+      </w:r>
+      <w:r>
+        <w:rPr>
+          <w:rFonts w:hint="cs"/>
+          <w:sz w:val="22"/>
+        </w:rPr>
+        <w:t>á</w:t>
+      </w:r>
+      <w:r>
+        <w:rPr>
+          <w:sz w:val="22"/>
+        </w:rPr>
+        <w:t xml:space="preserve"> proje</w:t>
+      </w:r>
+      <w:r>
+        <w:rPr>
+          <w:rFonts w:hint="cs"/>
+          <w:sz w:val="22"/>
+        </w:rPr>
+        <w:t>çã</w:t>
+      </w:r>
+      <w:r>
+        <w:rPr>
+          <w:sz w:val="22"/>
+        </w:rPr>
+        <w:t>o. Os prompts pro</w:t>
+      </w:r>
+      <w:r>
+        <w:rPr>
+          <w:rFonts w:hint="cs"/>
+          <w:sz w:val="22"/>
+        </w:rPr>
+        <w:t>í</w:t>
+      </w:r>
+      <w:r>
+        <w:rPr>
+          <w:sz w:val="22"/>
+        </w:rPr>
+        <w:t>bem o agente de responder que n</w:t>
+      </w:r>
+      <w:r>
+        <w:rPr>
+          <w:rFonts w:hint="cs"/>
+          <w:sz w:val="22"/>
+        </w:rPr>
+        <w:t>ã</w:t>
+      </w:r>
+      <w:r>
+        <w:rPr>
+          <w:sz w:val="22"/>
+        </w:rPr>
+        <w:t>o consegue incluir um dado da base, uma compara</w:t>
+      </w:r>
+      <w:r>
+        <w:rPr>
+          <w:rFonts w:hint="cs"/>
+          <w:sz w:val="22"/>
+        </w:rPr>
+        <w:t>çã</w:t>
+      </w:r>
+      <w:r>
+        <w:rPr>
+          <w:sz w:val="22"/>
+        </w:rPr>
+        <w:t>o ou uma proje</w:t>
+      </w:r>
+      <w:r>
+        <w:rPr>
+          <w:rFonts w:hint="cs"/>
+          <w:sz w:val="22"/>
+        </w:rPr>
+        <w:t>çã</w:t>
+      </w:r>
+      <w:r>
+        <w:rPr>
+          <w:sz w:val="22"/>
+        </w:rPr>
+        <w:t>o.</w:t>
       </w:r>
     </w:p>
     <w:p>
       <w:pPr>
+        <w:pStyle w:val="Commarcadores"/>
+        <w:spacing w:after="50" w:line="264" w:lineRule="auto"/>
+        <w:rPr>
+          <w:rFonts w:hint="eastAsia"/>
+        </w:rPr>
+      </w:pPr>
+      <w:r>
+        <w:rPr>
+          <w:sz w:val="22"/>
+        </w:rPr>
+        <w:t>KPIs e destaque: o KPI coverage (Cobertura All Brazil) saiu do cat</w:t>
+      </w:r>
+      <w:r>
+        <w:rPr>
+          <w:rFonts w:hint="cs"/>
+          <w:sz w:val="22"/>
+        </w:rPr>
+        <w:t>á</w:t>
+      </w:r>
+      <w:r>
+        <w:rPr>
+          <w:sz w:val="22"/>
+        </w:rPr>
+        <w:t>logo, como na p</w:t>
+      </w:r>
+      <w:r>
+        <w:rPr>
+          <w:rFonts w:hint="cs"/>
+          <w:sz w:val="22"/>
+        </w:rPr>
+        <w:t>á</w:t>
+      </w:r>
+      <w:r>
+        <w:rPr>
+          <w:sz w:val="22"/>
+        </w:rPr>
+        <w:t>gina Vis</w:t>
+      </w:r>
+      <w:r>
+        <w:rPr>
+          <w:rFonts w:hint="cs"/>
+          <w:sz w:val="22"/>
+        </w:rPr>
+        <w:t>ã</w:t>
+      </w:r>
+      <w:r>
+        <w:rPr>
+          <w:sz w:val="22"/>
+        </w:rPr>
+        <w:t>o e relat</w:t>
+      </w:r>
+      <w:r>
+        <w:rPr>
+          <w:rFonts w:hint="cs"/>
+          <w:sz w:val="22"/>
+        </w:rPr>
+        <w:t>ó</w:t>
+      </w:r>
+      <w:r>
+        <w:rPr>
+          <w:sz w:val="22"/>
+        </w:rPr>
+        <w:t>rios (10.4); KPI_ALIASES troca coverage por over_12_months (Estoque com mais de 12 meses) em kpis e highlight e remove t</w:t>
+      </w:r>
+      <w:r>
+        <w:rPr>
+          <w:rFonts w:hint="cs"/>
+          <w:sz w:val="22"/>
+        </w:rPr>
+        <w:t>í</w:t>
+      </w:r>
+      <w:r>
+        <w:rPr>
+          <w:sz w:val="22"/>
+        </w:rPr>
+        <w:t>tulos/legendas que citavam a cobertura; facts_brief n</w:t>
+      </w:r>
+      <w:r>
+        <w:rPr>
+          <w:rFonts w:hint="cs"/>
+          <w:sz w:val="22"/>
+        </w:rPr>
+        <w:t>ã</w:t>
+      </w:r>
+      <w:r>
+        <w:rPr>
+          <w:sz w:val="22"/>
+        </w:rPr>
+        <w:t>o envia mais a cobertura ao agente.</w:t>
+      </w:r>
+    </w:p>
+    <w:p>
+      <w:pPr>
+        <w:pStyle w:val="Commarcadores"/>
+        <w:spacing w:after="50" w:line="264" w:lineRule="auto"/>
+        <w:rPr>
+          <w:rFonts w:hint="eastAsia"/>
+        </w:rPr>
+      </w:pPr>
+      <w:r>
+        <w:rPr>
+          <w:sz w:val="22"/>
+        </w:rPr>
+        <w:t>Armazenamento: %LOCALAPPDATA%\OpsContabil\presentations\&lt;AAAAMMDD-HHMMSS-xxxxxx&gt;\v&lt;n&gt;.json e v&lt;n&gt;.html, com meta.json (compet</w:t>
+      </w:r>
+      <w:r>
+        <w:rPr>
+          <w:rFonts w:hint="cs"/>
+          <w:sz w:val="22"/>
+        </w:rPr>
+        <w:t>ê</w:t>
+      </w:r>
+      <w:r>
+        <w:rPr>
+          <w:sz w:val="22"/>
+        </w:rPr>
+        <w:t>ncia, autor, vers</w:t>
+      </w:r>
+      <w:r>
+        <w:rPr>
+          <w:rFonts w:hint="cs"/>
+          <w:sz w:val="22"/>
+        </w:rPr>
+        <w:t>ã</w:t>
+      </w:r>
+      <w:r>
+        <w:rPr>
+          <w:sz w:val="22"/>
+        </w:rPr>
+        <w:t xml:space="preserve">o, origem agente ou sistema). Downloads: HTML </w:t>
+      </w:r>
+      <w:r>
+        <w:rPr>
+          <w:rFonts w:hint="cs"/>
+          <w:sz w:val="22"/>
+        </w:rPr>
+        <w:t>ú</w:t>
+      </w:r>
+      <w:r>
+        <w:rPr>
+          <w:sz w:val="22"/>
+        </w:rPr>
+        <w:t>nico ou ZIP (HTML, LEIA-ME e licen</w:t>
+      </w:r>
+      <w:r>
+        <w:rPr>
+          <w:rFonts w:hint="cs"/>
+          <w:sz w:val="22"/>
+        </w:rPr>
+        <w:t>ç</w:t>
+      </w:r>
+      <w:r>
+        <w:rPr>
+          <w:sz w:val="22"/>
+        </w:rPr>
+        <w:t>a MIT).</w:t>
+      </w:r>
+    </w:p>
+    <w:p>
+      <w:pPr>
+        <w:pStyle w:val="Commarcadores"/>
+        <w:spacing w:after="50" w:line="264" w:lineRule="auto"/>
+        <w:rPr>
+          <w:rFonts w:hint="eastAsia"/>
+        </w:rPr>
+      </w:pPr>
+      <w:r>
+        <w:rPr>
+          <w:sz w:val="22"/>
+        </w:rPr>
+        <w:t>Rotas: POST /api/presentations, GET /api/presentations/{id}, POST /api/presentations/{id}/revise, POST /api/presentations/{id}/apply, GET /api/presentations/{id}/view e GET /api/presentations/{id}/download?format=html|zip (p</w:t>
+      </w:r>
+      <w:r>
+        <w:rPr>
+          <w:rFonts w:hint="cs"/>
+          <w:sz w:val="22"/>
+        </w:rPr>
+        <w:t>á</w:t>
+      </w:r>
+      <w:r>
+        <w:rPr>
+          <w:sz w:val="22"/>
+        </w:rPr>
+        <w:t>gina exigida: Optimus).</w:t>
+      </w:r>
+    </w:p>
+    <w:p>
+      <w:pPr>
         <w:pStyle w:val="Ttulo2"/>
         <w:spacing w:line="252" w:lineRule="auto"/>
       </w:pPr>
@@ -31055,7 +33377,6 @@
         <w:rPr>
           <w:sz w:val="22"/>
         </w:rPr>
-        <w:lastRenderedPageBreak/>
         <w:t>Ajuste: vale s</w:t>
       </w:r>
       <w:r>
@@ -31616,7 +33937,14 @@
         <w:rPr>
           <w:sz w:val="22"/>
         </w:rPr>
-        <w:t>o). Chave closing_agenda:&lt;compet</w:t>
+        <w:t xml:space="preserve">o). Chave </w:t>
+      </w:r>
+      <w:r>
+        <w:rPr>
+          <w:sz w:val="22"/>
+        </w:rPr>
+        <w:lastRenderedPageBreak/>
+        <w:t>closing_agenda:&lt;compet</w:t>
       </w:r>
       <w:r>
         <w:rPr>
@@ -32135,7 +34463,6 @@
         <w:rPr>
           <w:rFonts w:ascii="Aptos" w:hAnsi="Aptos"/>
         </w:rPr>
-        <w:lastRenderedPageBreak/>
         <w:t>18.3 Competências compiladas</w:t>
       </w:r>
     </w:p>
@@ -32821,7 +35148,6 @@
         <w:rPr>
           <w:sz w:val="22"/>
         </w:rPr>
-        <w:lastRenderedPageBreak/>
         <w:t>Armazenamento: Estoque_Cont\acesso\alteracoes, com um arquivo por m</w:t>
       </w:r>
       <w:r>
@@ -33550,6 +35876,7 @@
         <w:rPr>
           <w:sz w:val="22"/>
         </w:rPr>
+        <w:lastRenderedPageBreak/>
         <w:t>Uploads e cargas da base: planilha carregada por upload (conclu</w:t>
       </w:r>
       <w:r>
@@ -34257,7 +36584,6 @@
         <w:rPr>
           <w:rFonts w:ascii="Aptos" w:hAnsi="Aptos"/>
         </w:rPr>
-        <w:lastRenderedPageBreak/>
         <w:t>19. Segurança, autenticação e permissões</w:t>
       </w:r>
     </w:p>
@@ -34591,6 +36917,7 @@
         <w:rPr>
           <w:sz w:val="22"/>
         </w:rPr>
+        <w:lastRenderedPageBreak/>
         <w:t>Identidade: o e-mail informado precisa ser o da conta corporativa conectada ao Windows (whoami /upn) e estar liberado e ativo; n</w:t>
       </w:r>
       <w:r>
@@ -35202,7 +37529,6 @@
         <w:rPr>
           <w:rFonts w:ascii="Aptos" w:hAnsi="Aptos"/>
         </w:rPr>
-        <w:lastRenderedPageBreak/>
         <w:t>20. API e rotas observadas</w:t>
       </w:r>
     </w:p>
@@ -36085,6 +38411,7 @@
               <w:rPr>
                 <w:sz w:val="17"/>
               </w:rPr>
+              <w:lastRenderedPageBreak/>
               <w:t>/api/sap/upload</w:t>
             </w:r>
           </w:p>
@@ -37078,7 +39405,6 @@
                 <w:rFonts w:hint="eastAsia"/>
                 <w:sz w:val="17"/>
               </w:rPr>
-              <w:lastRenderedPageBreak/>
               <w:t>/api/docs/info | pdf | search</w:t>
             </w:r>
           </w:p>
@@ -38304,6 +40630,7 @@
                 <w:rFonts w:hint="eastAsia"/>
                 <w:sz w:val="17"/>
               </w:rPr>
+              <w:lastRenderedPageBreak/>
               <w:t>/api/presentations | {id} | revise | apply | view | download</w:t>
             </w:r>
           </w:p>
@@ -38700,6 +41027,297 @@
                 <w:sz w:val="17"/>
               </w:rPr>
               <w:t>o.</w:t>
+            </w:r>
+          </w:p>
+        </w:tc>
+      </w:tr>
+      <w:tr>
+        <w:trPr>
+          <w:jc w:val="center"/>
+        </w:trPr>
+        <w:tc>
+          <w:tcPr>
+            <w:tcW w:w="3969" w:type="dxa"/>
+            <w:tcMar>
+              <w:top w:w="80" w:type="dxa"/>
+              <w:left w:w="90" w:type="dxa"/>
+              <w:bottom w:w="80" w:type="dxa"/>
+              <w:right w:w="90" w:type="dxa"/>
+            </w:tcMar>
+          </w:tcPr>
+          <w:p>
+            <w:pPr>
+              <w:spacing w:after="0" w:line="252" w:lineRule="auto"/>
+              <w:rPr>
+                <w:rFonts w:hint="eastAsia"/>
+                <w:sz w:val="17"/>
+              </w:rPr>
+            </w:pPr>
+            <w:r>
+              <w:rPr>
+                <w:rFonts w:hint="eastAsia"/>
+                <w:sz w:val="17"/>
+              </w:rPr>
+              <w:t>/api/sap/upload?transaction=BASEGR</w:t>
+            </w:r>
+          </w:p>
+        </w:tc>
+        <w:tc>
+          <w:tcPr>
+            <w:tcW w:w="5216" w:type="dxa"/>
+            <w:tcMar>
+              <w:top w:w="80" w:type="dxa"/>
+              <w:left w:w="90" w:type="dxa"/>
+              <w:bottom w:w="80" w:type="dxa"/>
+              <w:right w:w="90" w:type="dxa"/>
+            </w:tcMar>
+          </w:tcPr>
+          <w:p>
+            <w:pPr>
+              <w:spacing w:after="0" w:line="252" w:lineRule="auto"/>
+              <w:rPr>
+                <w:rFonts w:hint="eastAsia"/>
+                <w:sz w:val="17"/>
+              </w:rPr>
+            </w:pPr>
+            <w:r>
+              <w:rPr>
+                <w:sz w:val="17"/>
+              </w:rPr>
+              <w:t>Carga da cole</w:t>
+            </w:r>
+            <w:r>
+              <w:rPr>
+                <w:rFonts w:hint="cs"/>
+                <w:sz w:val="17"/>
+              </w:rPr>
+              <w:t>çã</w:t>
+            </w:r>
+            <w:r>
+              <w:rPr>
+                <w:sz w:val="17"/>
+              </w:rPr>
+              <w:t>o dos pedidos: Base GR (aba BASE) ou export da SQVI DOC_COMPRA; recalcula o PASSO A PASSO.</w:t>
+            </w:r>
+          </w:p>
+        </w:tc>
+      </w:tr>
+      <w:tr>
+        <w:trPr>
+          <w:jc w:val="center"/>
+        </w:trPr>
+        <w:tc>
+          <w:tcPr>
+            <w:tcW w:w="3969" w:type="dxa"/>
+            <w:tcMar>
+              <w:top w:w="80" w:type="dxa"/>
+              <w:left w:w="90" w:type="dxa"/>
+              <w:bottom w:w="80" w:type="dxa"/>
+              <w:right w:w="90" w:type="dxa"/>
+            </w:tcMar>
+          </w:tcPr>
+          <w:p>
+            <w:pPr>
+              <w:spacing w:after="0" w:line="252" w:lineRule="auto"/>
+              <w:rPr>
+                <w:rFonts w:hint="eastAsia"/>
+                <w:sz w:val="17"/>
+              </w:rPr>
+            </w:pPr>
+            <w:r>
+              <w:rPr>
+                <w:rFonts w:hint="eastAsia"/>
+                <w:sz w:val="17"/>
+              </w:rPr>
+              <w:t>/api/sap/gr-collection/status | orders</w:t>
+            </w:r>
+          </w:p>
+        </w:tc>
+        <w:tc>
+          <w:tcPr>
+            <w:tcW w:w="5216" w:type="dxa"/>
+            <w:tcMar>
+              <w:top w:w="80" w:type="dxa"/>
+              <w:left w:w="90" w:type="dxa"/>
+              <w:bottom w:w="80" w:type="dxa"/>
+              <w:right w:w="90" w:type="dxa"/>
+            </w:tcMar>
+          </w:tcPr>
+          <w:p>
+            <w:pPr>
+              <w:spacing w:after="0" w:line="252" w:lineRule="auto"/>
+              <w:rPr>
+                <w:rFonts w:hint="eastAsia"/>
+                <w:sz w:val="17"/>
+              </w:rPr>
+            </w:pPr>
+            <w:r>
+              <w:rPr>
+                <w:sz w:val="17"/>
+              </w:rPr>
+              <w:t>Situa</w:t>
+            </w:r>
+            <w:r>
+              <w:rPr>
+                <w:rFonts w:hint="cs"/>
+                <w:sz w:val="17"/>
+              </w:rPr>
+              <w:t>çã</w:t>
+            </w:r>
+            <w:r>
+              <w:rPr>
+                <w:sz w:val="17"/>
+              </w:rPr>
+              <w:t>o/cobertura da cole</w:t>
+            </w:r>
+            <w:r>
+              <w:rPr>
+                <w:rFonts w:hint="cs"/>
+                <w:sz w:val="17"/>
+              </w:rPr>
+              <w:t>çã</w:t>
+            </w:r>
+            <w:r>
+              <w:rPr>
+                <w:sz w:val="17"/>
+              </w:rPr>
+              <w:t>o dos pedidos e lista de pedidos da MB59 para a SQVI.</w:t>
+            </w:r>
+          </w:p>
+        </w:tc>
+      </w:tr>
+      <w:tr>
+        <w:trPr>
+          <w:jc w:val="center"/>
+        </w:trPr>
+        <w:tc>
+          <w:tcPr>
+            <w:tcW w:w="3969" w:type="dxa"/>
+            <w:tcMar>
+              <w:top w:w="80" w:type="dxa"/>
+              <w:left w:w="90" w:type="dxa"/>
+              <w:bottom w:w="80" w:type="dxa"/>
+              <w:right w:w="90" w:type="dxa"/>
+            </w:tcMar>
+          </w:tcPr>
+          <w:p>
+            <w:pPr>
+              <w:spacing w:after="0" w:line="252" w:lineRule="auto"/>
+              <w:rPr>
+                <w:rFonts w:hint="eastAsia"/>
+                <w:sz w:val="17"/>
+              </w:rPr>
+            </w:pPr>
+            <w:r>
+              <w:rPr>
+                <w:rFonts w:hint="eastAsia"/>
+                <w:sz w:val="17"/>
+              </w:rPr>
+              <w:t>/api/sap/month-status?period</w:t>
+            </w:r>
+          </w:p>
+        </w:tc>
+        <w:tc>
+          <w:tcPr>
+            <w:tcW w:w="5216" w:type="dxa"/>
+            <w:tcMar>
+              <w:top w:w="80" w:type="dxa"/>
+              <w:left w:w="90" w:type="dxa"/>
+              <w:bottom w:w="80" w:type="dxa"/>
+              <w:right w:w="90" w:type="dxa"/>
+            </w:tcMar>
+          </w:tcPr>
+          <w:p>
+            <w:pPr>
+              <w:spacing w:after="0" w:line="252" w:lineRule="auto"/>
+              <w:rPr>
+                <w:rFonts w:hint="eastAsia"/>
+                <w:sz w:val="17"/>
+              </w:rPr>
+            </w:pPr>
+            <w:r>
+              <w:rPr>
+                <w:sz w:val="17"/>
+              </w:rPr>
+              <w:t>Situa</w:t>
+            </w:r>
+            <w:r>
+              <w:rPr>
+                <w:rFonts w:hint="cs"/>
+                <w:sz w:val="17"/>
+              </w:rPr>
+              <w:t>çã</w:t>
+            </w:r>
+            <w:r>
+              <w:rPr>
+                <w:sz w:val="17"/>
+              </w:rPr>
+              <w:t>o do m</w:t>
+            </w:r>
+            <w:r>
+              <w:rPr>
+                <w:rFonts w:hint="cs"/>
+                <w:sz w:val="17"/>
+              </w:rPr>
+              <w:t>ê</w:t>
+            </w:r>
+            <w:r>
+              <w:rPr>
+                <w:sz w:val="17"/>
+              </w:rPr>
+              <w:t>s nas tr</w:t>
+            </w:r>
+            <w:r>
+              <w:rPr>
+                <w:rFonts w:hint="cs"/>
+                <w:sz w:val="17"/>
+              </w:rPr>
+              <w:t>ê</w:t>
+            </w:r>
+            <w:r>
+              <w:rPr>
+                <w:sz w:val="17"/>
+              </w:rPr>
+              <w:t>s etapas de Extra</w:t>
+            </w:r>
+            <w:r>
+              <w:rPr>
+                <w:rFonts w:hint="cs"/>
+                <w:sz w:val="17"/>
+              </w:rPr>
+              <w:t>çõ</w:t>
+            </w:r>
+            <w:r>
+              <w:rPr>
+                <w:sz w:val="17"/>
+              </w:rPr>
+              <w:t xml:space="preserve">es SAP: </w:t>
+            </w:r>
+            <w:r>
+              <w:rPr>
+                <w:rFonts w:hint="cs"/>
+                <w:sz w:val="17"/>
+              </w:rPr>
+              <w:t>ú</w:t>
+            </w:r>
+            <w:r>
+              <w:rPr>
+                <w:sz w:val="17"/>
+              </w:rPr>
+              <w:t>ltima carga da ZMM119 e da MB59 e cole</w:t>
+            </w:r>
+            <w:r>
+              <w:rPr>
+                <w:rFonts w:hint="cs"/>
+                <w:sz w:val="17"/>
+              </w:rPr>
+              <w:t>çã</w:t>
+            </w:r>
+            <w:r>
+              <w:rPr>
+                <w:sz w:val="17"/>
+              </w:rPr>
+              <w:t>o dos pedidos (carregada e % de cobertura).</w:t>
             </w:r>
           </w:p>
         </w:tc>
@@ -39135,7 +41753,6 @@
               <w:rPr>
                 <w:sz w:val="19"/>
               </w:rPr>
-              <w:lastRenderedPageBreak/>
               <w:t>Binary Mode</w:t>
             </w:r>
           </w:p>
@@ -39380,6 +41997,13 @@
                 <w:sz w:val="18"/>
               </w:rPr>
               <w:br/>
+            </w:r>
+            <w:r>
+              <w:rPr>
+                <w:rFonts w:ascii="Consolas" w:hAnsi="Consolas"/>
+                <w:sz w:val="18"/>
+              </w:rPr>
+              <w:lastRenderedPageBreak/>
               <w:t xml:space="preserve">    ↓</w:t>
             </w:r>
             <w:r>
@@ -39926,7 +42550,6 @@
               <w:rPr>
                 <w:sz w:val="17"/>
               </w:rPr>
-              <w:lastRenderedPageBreak/>
               <w:t>Detectar retorno local</w:t>
             </w:r>
           </w:p>
@@ -40455,6 +43078,7 @@
               <w:rPr>
                 <w:sz w:val="17"/>
               </w:rPr>
+              <w:lastRenderedPageBreak/>
               <w:t>Preparar apresentação</w:t>
             </w:r>
           </w:p>
@@ -41810,7 +44434,6 @@
         <w:rPr>
           <w:sz w:val="21"/>
         </w:rPr>
-        <w:lastRenderedPageBreak/>
         <w:t>No JSON correto, a Memória da conversa está conectada ao Optimus; não há conexão ai_memory da memória diretamente com o Chat Trigger.</w:t>
       </w:r>
     </w:p>
@@ -42231,6 +44854,7 @@
           <w:szCs w:val="18"/>
           <w:lang w:eastAsia="pt-BR"/>
         </w:rPr>
+        <w:lastRenderedPageBreak/>
         <w:t xml:space="preserve">        ↓</w:t>
       </w:r>
     </w:p>
@@ -42914,7 +45538,6 @@
           <w:szCs w:val="23"/>
           <w:lang w:eastAsia="pt-BR"/>
         </w:rPr>
-        <w:lastRenderedPageBreak/>
         <w:t>O</w:t>
       </w:r>
       <w:r>
@@ -43205,6 +45828,13 @@
                 <w:sz w:val="18"/>
               </w:rPr>
               <w:br/>
+            </w:r>
+            <w:r>
+              <w:rPr>
+                <w:rFonts w:ascii="Consolas" w:hAnsi="Consolas"/>
+                <w:sz w:val="18"/>
+              </w:rPr>
+              <w:lastRenderedPageBreak/>
               <w:t>{ ... JSON ... }</w:t>
             </w:r>
             <w:r>
@@ -43508,13 +46138,6 @@
                 <w:sz w:val="18"/>
               </w:rPr>
               <w:br/>
-            </w:r>
-            <w:r>
-              <w:rPr>
-                <w:rFonts w:ascii="Consolas" w:hAnsi="Consolas"/>
-                <w:sz w:val="18"/>
-              </w:rPr>
-              <w:lastRenderedPageBreak/>
               <w:t>Baixe o relatório:</w:t>
             </w:r>
             <w:r>
@@ -44790,7 +47413,6 @@
               <w:rPr>
                 <w:sz w:val="18"/>
               </w:rPr>
-              <w:lastRenderedPageBreak/>
               <w:t>{{COMPARACAO_PMM}}</w:t>
             </w:r>
           </w:p>
@@ -44903,6 +47525,7 @@
               <w:rPr>
                 <w:sz w:val="18"/>
               </w:rPr>
+              <w:lastRenderedPageBreak/>
               <w:t>{{PMM_PERIODO}}</w:t>
             </w:r>
           </w:p>
@@ -46074,65 +48697,65 @@
         <w:t>ã</w:t>
       </w:r>
       <w:r>
-        <w:t xml:space="preserve">o produzidos por </w:t>
+        <w:t xml:space="preserve">o produzidos por reporting.render_dashboard_report(): o Edge headless </w:t>
+      </w:r>
+      <w:r>
+        <w:rPr>
+          <w:rFonts w:hint="cs"/>
+        </w:rPr>
+        <w:t>é</w:t>
+      </w:r>
+      <w:r>
+        <w:t xml:space="preserve"> controlado pelo protocolo DevTools (pacote websockets), recebe o cookie de sess</w:t>
+      </w:r>
+      <w:r>
+        <w:rPr>
+          <w:rFonts w:hint="cs"/>
+        </w:rPr>
+        <w:t>ã</w:t>
+      </w:r>
+      <w:r>
+        <w:t>o do usu</w:t>
+      </w:r>
+      <w:r>
+        <w:rPr>
+          <w:rFonts w:hint="cs"/>
+        </w:rPr>
+        <w:t>á</w:t>
+      </w:r>
+      <w:r>
+        <w:t>rio solicitante, abre a Vis</w:t>
+      </w:r>
+      <w:r>
+        <w:rPr>
+          <w:rFonts w:hint="cs"/>
+        </w:rPr>
+        <w:t>ã</w:t>
+      </w:r>
+      <w:r>
+        <w:t>o e relat</w:t>
+      </w:r>
+      <w:r>
+        <w:rPr>
+          <w:rFonts w:hint="cs"/>
+        </w:rPr>
+        <w:t>ó</w:t>
+      </w:r>
+      <w:r>
+        <w:t>rios em modo relat</w:t>
+      </w:r>
+      <w:r>
+        <w:rPr>
+          <w:rFonts w:hint="cs"/>
+        </w:rPr>
+        <w:t>ó</w:t>
+      </w:r>
+      <w:r>
+        <w:t xml:space="preserve">rio </w:t>
       </w:r>
       <w:r>
         <w:lastRenderedPageBreak/>
-        <w:t xml:space="preserve">reporting.render_dashboard_report(): o Edge headless </w:t>
-      </w:r>
-      <w:r>
-        <w:rPr>
-          <w:rFonts w:hint="cs"/>
-        </w:rPr>
-        <w:t>é</w:t>
-      </w:r>
-      <w:r>
-        <w:t xml:space="preserve"> controlado pelo protocolo DevTools (pacote websockets), recebe o cookie de sess</w:t>
-      </w:r>
-      <w:r>
-        <w:rPr>
-          <w:rFonts w:hint="cs"/>
-        </w:rPr>
-        <w:t>ã</w:t>
-      </w:r>
-      <w:r>
-        <w:t>o do usu</w:t>
-      </w:r>
-      <w:r>
-        <w:rPr>
-          <w:rFonts w:hint="cs"/>
-        </w:rPr>
-        <w:t>á</w:t>
-      </w:r>
-      <w:r>
-        <w:t>rio solicitante, abre a Vis</w:t>
-      </w:r>
-      <w:r>
-        <w:rPr>
-          <w:rFonts w:hint="cs"/>
-        </w:rPr>
-        <w:t>ã</w:t>
-      </w:r>
-      <w:r>
-        <w:t>o e relat</w:t>
-      </w:r>
-      <w:r>
-        <w:rPr>
-          <w:rFonts w:hint="cs"/>
-        </w:rPr>
-        <w:t>ó</w:t>
-      </w:r>
-      <w:r>
-        <w:t>rios em modo relat</w:t>
-      </w:r>
-      <w:r>
-        <w:rPr>
-          <w:rFonts w:hint="cs"/>
-        </w:rPr>
-        <w:t>ó</w:t>
-      </w:r>
-      <w:r>
-        <w:t>rio e, quando a p</w:t>
+        <w:t>e, quando a p</w:t>
       </w:r>
       <w:r>
         <w:rPr>
@@ -47418,7 +50041,6 @@
               <w:rPr>
                 <w:sz w:val="19"/>
               </w:rPr>
-              <w:lastRenderedPageBreak/>
               <w:t>data/</w:t>
             </w:r>
           </w:p>
@@ -47474,6 +50096,7 @@
               <w:rPr>
                 <w:sz w:val="19"/>
               </w:rPr>
+              <w:lastRenderedPageBreak/>
               <w:t>shared_data/</w:t>
             </w:r>
           </w:p>
@@ -49023,14 +51646,14 @@
         <w:rPr>
           <w:rFonts w:hint="eastAsia"/>
         </w:rPr>
-        <w:t xml:space="preserve">nter.py, mapping_sync.py, mappings.py, master_base.py, mb59.py, notifications.py, optimus_watch.py, periods.py, presentations.py e </w:t>
+        <w:t xml:space="preserve">nter.py, mapping_sync.py, mappings.py, master_base.py, mb59.py, notifications.py, optimus_watch.py, periods.py, presentations.py e presentation_assets/, sap_upload.py, seed_data.py, shared_data.py, system_manual.py, xlsx_stream.py, </w:t>
       </w:r>
       <w:r>
         <w:rPr>
           <w:rFonts w:hint="eastAsia"/>
         </w:rPr>
         <w:lastRenderedPageBreak/>
-        <w:t>presentation_assets/, sap_upload.py, seed_data.py, shared_data.py, system_manual.py, xlsx_stream.py, extractors/sap_export_h</w:t>
+        <w:t>extractors/sap_export_h</w:t>
       </w:r>
       <w:r>
         <w:t>elper.py e sap_security_helper.py, assets/ (</w:t>
@@ -50851,7 +53474,6 @@
               <w:rPr>
                 <w:sz w:val="19"/>
               </w:rPr>
-              <w:lastRenderedPageBreak/>
               <w:t>Drive de ponte indisponível</w:t>
             </w:r>
           </w:p>
@@ -50908,6 +53530,7 @@
               <w:rPr>
                 <w:sz w:val="19"/>
               </w:rPr>
+              <w:lastRenderedPageBreak/>
               <w:t>Usu</w:t>
             </w:r>
             <w:r>
@@ -51866,14 +54489,15 @@
                 <w:sz w:val="18"/>
               </w:rPr>
               <w:br/>
+              <w:t xml:space="preserve">    templates/</w:t>
             </w:r>
             <w:r>
               <w:rPr>
                 <w:rFonts w:ascii="Consolas" w:hAnsi="Consolas"/>
                 <w:sz w:val="18"/>
               </w:rPr>
-              <w:lastRenderedPageBreak/>
-              <w:t xml:space="preserve">    templates/</w:t>
+              <w:br/>
+              <w:t xml:space="preserve">      dashboard.html</w:t>
             </w:r>
             <w:r>
               <w:rPr>
@@ -51881,7 +54505,7 @@
                 <w:sz w:val="18"/>
               </w:rPr>
               <w:br/>
-              <w:t xml:space="preserve">      dashboard.html</w:t>
+              <w:t xml:space="preserve">      index.html</w:t>
             </w:r>
             <w:r>
               <w:rPr>
@@ -51889,14 +54513,13 @@
                 <w:sz w:val="18"/>
               </w:rPr>
               <w:br/>
-              <w:t xml:space="preserve">      index.html</w:t>
             </w:r>
             <w:r>
               <w:rPr>
                 <w:rFonts w:ascii="Consolas" w:hAnsi="Consolas"/>
                 <w:sz w:val="18"/>
               </w:rPr>
-              <w:br/>
+              <w:lastRenderedPageBreak/>
               <w:t>tests/</w:t>
             </w:r>
             <w:r>
@@ -53587,7 +56210,6 @@
         <w:rPr>
           <w:sz w:val="22"/>
         </w:rPr>
-        <w:lastRenderedPageBreak/>
         <w:t>Gr</w:t>
       </w:r>
       <w:r>
@@ -53633,6 +56255,7 @@
           <w:rFonts w:hint="eastAsia"/>
           <w:sz w:val="22"/>
         </w:rPr>
+        <w:lastRenderedPageBreak/>
         <w:t>Tabelas: division, location, aging. Fluxo: aging_flow.</w:t>
       </w:r>
     </w:p>
@@ -54867,7 +57490,6 @@
         <w:rPr>
           <w:sz w:val="22"/>
         </w:rPr>
-        <w:lastRenderedPageBreak/>
         <w:t xml:space="preserve">ARQUITETURA_FINAL.md — </w:t>
       </w:r>
       <w:r>
@@ -54925,6 +57547,7 @@
         <w:rPr>
           <w:sz w:val="22"/>
         </w:rPr>
+        <w:lastRenderedPageBreak/>
         <w:t xml:space="preserve">dashboard.html — interface atual, páginas, </w:t>
       </w:r>
       <w:r>
@@ -55150,7 +57773,7 @@
         <w:color w:val="5A646E"/>
         <w:sz w:val="18"/>
       </w:rPr>
-      <w:t>47</w:t>
+      <w:t>49</w:t>
     </w:r>
     <w:r>
       <w:rPr>
@@ -67824,7 +70447,7 @@
 </file>
 
 <file path=customXml/itemProps1.xml><?xml version="1.0" encoding="utf-8"?>
-<ds:datastoreItem xmlns:ds="http://schemas.openxmlformats.org/officeDocument/2006/customXml" ds:itemID="{C75D557A-56CE-4B7D-9CD3-362FCED25CCE}">
+<ds:datastoreItem xmlns:ds="http://schemas.openxmlformats.org/officeDocument/2006/customXml" ds:itemID="{50800354-B9EF-4E86-8D42-841C40CB5B77}">
   <ds:schemaRefs>
     <ds:schemaRef ds:uri="http://schemas.openxmlformats.org/officeDocument/2006/bibliography"/>
   </ds:schemaRefs>

</xml_diff>